<commit_message>
v88: expand board change history
</commit_message>
<xml_diff>
--- a/OnlineRepetitor_roadmap.docx
+++ b/OnlineRepetitor_roadmap.docx
@@ -30,7 +30,10 @@
     </w:p>
     <w:p>
       <w:r>
-        <w:t>Общий прогресс дорожной карты: ≈90% · актуально после v87</w:t>
+        <w:rPr>
+          <w:sz w:val="18"/>
+        </w:rPr>
+        <w:t>Общий прогресс дорожной карты: ≈91% · актуально после v88</w:t>
       </w:r>
     </w:p>
     <w:p>
@@ -732,7 +735,7 @@
           </w:tcPr>
           <w:p>
             <w:r>
-              <w:t>Присутствие, живые выделения, кто редактирует объект, защита от параллельного текстового редактирования и безопасное разрешение серверных конфликтов. Комментарии получили отдельный realtime-канал. Следующий шаг — расширенная история действий.</w:t>
+              <w:t>Присутствие, живые выделения, кто редактирует объект, защита от параллельного текстового редактирования и безопасное разрешение серверных конфликтов. v88 добавляет понятную серверную сводку изменений между сохранениями: автор, добавленные, изменённые и удалённые объекты.</w:t>
             </w:r>
           </w:p>
         </w:tc>
@@ -755,7 +758,7 @@
           </w:tcPr>
           <w:p>
             <w:r>
-              <w:t>78%</w:t>
+              <w:t>84%</w:t>
             </w:r>
           </w:p>
         </w:tc>
@@ -766,7 +769,7 @@
           </w:tcPr>
           <w:p>
             <w:r>
-              <w:t>v32–v34 + v87</w:t>
+              <w:t>v32–v34 + v87–v88</w:t>
             </w:r>
           </w:p>
         </w:tc>
@@ -910,7 +913,7 @@
           </w:tcPr>
           <w:p>
             <w:r>
-              <w:t>Серверная история до 100 сохранённых версий на доску, просмотр списка версий и восстановление старого состояния как новой версии.</w:t>
+              <w:t>Серверная история до 100 сохранённых версий на доску, просмотр и восстановление старого состояния. v88 показывает автора сохранения и автоматически сравнивает соседние версии по объектам: добавлено, изменено, удалено.</w:t>
             </w:r>
           </w:p>
         </w:tc>
@@ -922,7 +925,7 @@
           </w:tcPr>
           <w:p>
             <w:r>
-              <w:t>ЧАСТИЧНО ГОТОВО</w:t>
+              <w:t>ПОЧТИ ГОТОВО</w:t>
             </w:r>
           </w:p>
         </w:tc>
@@ -933,7 +936,7 @@
           </w:tcPr>
           <w:p>
             <w:r>
-              <w:t>65%</w:t>
+              <w:t>85%</w:t>
             </w:r>
           </w:p>
         </w:tc>
@@ -944,7 +947,7 @@
           </w:tcPr>
           <w:p>
             <w:r>
-              <w:t>v68</w:t>
+              <w:t>v68 + v88</w:t>
             </w:r>
           </w:p>
         </w:tc>
@@ -4426,11 +4429,17 @@
     <w:p/>
     <w:p>
       <w:r>
-        <w:t>Текущий ближайший маршрут: расширенная история действий и совместного редактирования → завершение комментариев → финальная безопасность и полировка релиза.</w:t>
+        <w:rPr>
+          <w:sz w:val="18"/>
+        </w:rPr>
+        <w:t>Текущий ближайший маршрут: завершение истории действий и совместного редактирования → финальная полировка комментариев → безопасность и подготовка релиза.</w:t>
       </w:r>
     </w:p>
     <w:p>
       <w:r>
+        <w:rPr>
+          <w:sz w:val="18"/>
+        </w:rPr>
         <w:t>Правило ведения документа: дорожная карта обновляется после каждого патча вместе с общим прогрессом, статусами и ближайшим маршрутом.</w:t>
       </w:r>
     </w:p>

</xml_diff>

<commit_message>
v94: finish tests and flashcards
</commit_message>
<xml_diff>
--- a/OnlineRepetitor_roadmap.docx
+++ b/OnlineRepetitor_roadmap.docx
@@ -30,10 +30,7 @@
     </w:p>
     <w:p>
       <w:r>
-        <w:rPr>
-          <w:sz w:val="18"/>
-        </w:rPr>
-        <w:t>Общий прогресс дорожной карты: ≈91% · актуально после v88</w:t>
+        <w:t>Общий прогресс дорожной карты: ≈95% · актуально после v94</w:t>
       </w:r>
     </w:p>
     <w:p>
@@ -292,19 +289,10 @@
           <w:tcPr>
             <w:tcW w:type="dxa" w:w="1656"/>
             <w:vAlign w:val="center"/>
-            <w:shd w:fill="E7F5EA"/>
+            <w:shd w:fill="D9EAD3"/>
           </w:tcPr>
           <w:p>
-            <w:pPr>
-              <w:spacing w:after="0" w:before="0"/>
-              <w:jc w:val="center"/>
-            </w:pPr>
             <w:r>
-              <w:rPr>
-                <w:rFonts w:ascii="Arial" w:hAnsi="Arial"/>
-                <w:b/>
-                <w:sz w:val="16"/>
-              </w:rPr>
               <w:t>ГОТОВО</w:t>
             </w:r>
           </w:p>
@@ -313,6 +301,7 @@
           <w:tcPr>
             <w:tcW w:type="dxa" w:w="936"/>
             <w:vAlign w:val="center"/>
+            <w:shd w:fill="D9EAD3"/>
           </w:tcPr>
           <w:p>
             <w:pPr>
@@ -414,19 +403,10 @@
           <w:tcPr>
             <w:tcW w:type="dxa" w:w="1656"/>
             <w:vAlign w:val="center"/>
-            <w:shd w:fill="E7F5EA"/>
+            <w:shd w:fill="D9EAD3"/>
           </w:tcPr>
           <w:p>
-            <w:pPr>
-              <w:spacing w:after="0" w:before="0"/>
-              <w:jc w:val="center"/>
-            </w:pPr>
             <w:r>
-              <w:rPr>
-                <w:rFonts w:ascii="Arial" w:hAnsi="Arial"/>
-                <w:b/>
-                <w:sz w:val="16"/>
-              </w:rPr>
               <w:t>ГОТОВО</w:t>
             </w:r>
           </w:p>
@@ -435,6 +415,7 @@
           <w:tcPr>
             <w:tcW w:type="dxa" w:w="936"/>
             <w:vAlign w:val="center"/>
+            <w:shd w:fill="D9EAD3"/>
           </w:tcPr>
           <w:p>
             <w:pPr>
@@ -536,15 +517,10 @@
           <w:tcPr>
             <w:tcW w:type="dxa" w:w="1656"/>
             <w:vAlign w:val="center"/>
-            <w:shd w:fill="E7F5EA"/>
+            <w:shd w:fill="D9EAD3"/>
           </w:tcPr>
           <w:p>
             <w:r>
-              <w:rPr>
-                <w:rFonts w:ascii="Arial" w:hAnsi="Arial"/>
-                <w:b/>
-                <w:sz w:val="16"/>
-              </w:rPr>
               <w:t>ГОТОВО</w:t>
             </w:r>
           </w:p>
@@ -553,6 +529,7 @@
           <w:tcPr>
             <w:tcW w:type="dxa" w:w="936"/>
             <w:vAlign w:val="center"/>
+            <w:shd w:fill="D9EAD3"/>
           </w:tcPr>
           <w:p>
             <w:r>
@@ -642,14 +619,10 @@
           <w:tcPr>
             <w:tcW w:type="dxa" w:w="1656"/>
             <w:vAlign w:val="center"/>
-            <w:shd w:fill="DFF3E4"/>
+            <w:shd w:fill="D9EAD3"/>
           </w:tcPr>
           <w:p>
             <w:r>
-              <w:rPr>
-                <w:rFonts w:ascii="Arial" w:hAnsi="Arial"/>
-                <w:sz w:val="16"/>
-              </w:rPr>
               <w:t>ГОТОВО</w:t>
             </w:r>
           </w:p>
@@ -658,6 +631,7 @@
           <w:tcPr>
             <w:tcW w:type="dxa" w:w="936"/>
             <w:vAlign w:val="center"/>
+            <w:shd w:fill="D9EAD3"/>
           </w:tcPr>
           <w:p>
             <w:r>
@@ -695,15 +669,7 @@
             <w:vAlign w:val="center"/>
           </w:tcPr>
           <w:p>
-            <w:pPr>
-              <w:spacing w:after="0" w:before="0"/>
-              <w:jc w:val="center"/>
-            </w:pPr>
             <w:r>
-              <w:rPr>
-                <w:rFonts w:ascii="Arial" w:hAnsi="Arial"/>
-                <w:sz w:val="16"/>
-              </w:rPr>
               <w:t>5</w:t>
             </w:r>
           </w:p>
@@ -714,16 +680,7 @@
             <w:vAlign w:val="center"/>
           </w:tcPr>
           <w:p>
-            <w:pPr>
-              <w:spacing w:after="0" w:before="0"/>
-              <w:jc w:val="left"/>
-            </w:pPr>
             <w:r>
-              <w:rPr>
-                <w:rFonts w:ascii="Arial" w:hAnsi="Arial"/>
-                <w:b/>
-                <w:sz w:val="16"/>
-              </w:rPr>
               <w:t>Совместное редактирование</w:t>
             </w:r>
           </w:p>
@@ -735,7 +692,7 @@
           </w:tcPr>
           <w:p>
             <w:r>
-              <w:t>Присутствие, живые выделения, кто редактирует объект, защита от параллельного текстового редактирования и безопасное разрешение серверных конфликтов. v88 добавляет понятную серверную сводку изменений между сохранениями: автор, добавленные, изменённые и удалённые объекты.</w:t>
+              <w:t>Совместное редактирование, живые выделения, защита параллельной работы и серверная история действий доведены до завершённого рабочего цикла.</w:t>
             </w:r>
           </w:p>
         </w:tc>
@@ -743,11 +700,11 @@
           <w:tcPr>
             <w:tcW w:type="dxa" w:w="1656"/>
             <w:vAlign w:val="center"/>
-            <w:shd w:fill="FFF3D6"/>
+            <w:shd w:fill="D9EAD3"/>
           </w:tcPr>
           <w:p>
             <w:r>
-              <w:t>ЧАСТИЧНО ГОТОВО</w:t>
+              <w:t>ГОТОВО</w:t>
             </w:r>
           </w:p>
         </w:tc>
@@ -755,10 +712,11 @@
           <w:tcPr>
             <w:tcW w:type="dxa" w:w="936"/>
             <w:vAlign w:val="center"/>
+            <w:shd w:fill="D9EAD3"/>
           </w:tcPr>
           <w:p>
             <w:r>
-              <w:t>84%</w:t>
+              <w:t>100%</w:t>
             </w:r>
           </w:p>
         </w:tc>
@@ -769,7 +727,7 @@
           </w:tcPr>
           <w:p>
             <w:r>
-              <w:t>v32–v34 + v87–v88</w:t>
+              <w:t>v32–v34 + v87–v89</w:t>
             </w:r>
           </w:p>
         </w:tc>
@@ -784,15 +742,7 @@
             <w:vAlign w:val="center"/>
           </w:tcPr>
           <w:p>
-            <w:pPr>
-              <w:spacing w:after="0" w:before="0"/>
-              <w:jc w:val="center"/>
-            </w:pPr>
             <w:r>
-              <w:rPr>
-                <w:rFonts w:ascii="Arial" w:hAnsi="Arial"/>
-                <w:sz w:val="16"/>
-              </w:rPr>
               <w:t>6</w:t>
             </w:r>
           </w:p>
@@ -803,16 +753,7 @@
             <w:vAlign w:val="center"/>
           </w:tcPr>
           <w:p>
-            <w:pPr>
-              <w:spacing w:after="0" w:before="0"/>
-              <w:jc w:val="left"/>
-            </w:pPr>
             <w:r>
-              <w:rPr>
-                <w:rFonts w:ascii="Arial" w:hAnsi="Arial"/>
-                <w:b/>
-                <w:sz w:val="16"/>
-              </w:rPr>
               <w:t>Комментарии и упоминания</w:t>
             </w:r>
           </w:p>
@@ -824,7 +765,7 @@
           </w:tcPr>
           <w:p>
             <w:r>
-              <w:t>Серверные ветки обсуждений на доске, ответы, @упоминания, отметка решённых веток, уведомления с переходом на доску, индивидуальная настройка уведомлений и обновление открытого обсуждения через Supabase Realtime.</w:t>
+              <w:t>Серверные ветки обсуждений, ответы, @упоминания, решённые ветки, уведомления, прямой переход к обсуждению и Realtime-синхронизация.</w:t>
             </w:r>
           </w:p>
         </w:tc>
@@ -832,11 +773,11 @@
           <w:tcPr>
             <w:tcW w:type="dxa" w:w="1656"/>
             <w:vAlign w:val="center"/>
-            <w:shd w:fill="EEF0FF"/>
+            <w:shd w:fill="D9EAD3"/>
           </w:tcPr>
           <w:p>
             <w:r>
-              <w:t>ПОЧТИ ГОТОВО</w:t>
+              <w:t>ГОТОВО</w:t>
             </w:r>
           </w:p>
         </w:tc>
@@ -844,10 +785,11 @@
           <w:tcPr>
             <w:tcW w:type="dxa" w:w="936"/>
             <w:vAlign w:val="center"/>
+            <w:shd w:fill="D9EAD3"/>
           </w:tcPr>
           <w:p>
             <w:r>
-              <w:t>90%</w:t>
+              <w:t>100%</w:t>
             </w:r>
           </w:p>
         </w:tc>
@@ -858,7 +800,7 @@
           </w:tcPr>
           <w:p>
             <w:r>
-              <w:t>v85–v87</w:t>
+              <w:t>v85–v87 + v90</w:t>
             </w:r>
           </w:p>
         </w:tc>
@@ -873,15 +815,7 @@
             <w:vAlign w:val="center"/>
           </w:tcPr>
           <w:p>
-            <w:pPr>
-              <w:spacing w:after="0" w:before="0"/>
-              <w:jc w:val="center"/>
-            </w:pPr>
             <w:r>
-              <w:rPr>
-                <w:rFonts w:ascii="Arial" w:hAnsi="Arial"/>
-                <w:sz w:val="16"/>
-              </w:rPr>
               <w:t>7</w:t>
             </w:r>
           </w:p>
@@ -892,16 +826,7 @@
             <w:vAlign w:val="center"/>
           </w:tcPr>
           <w:p>
-            <w:pPr>
-              <w:spacing w:after="0" w:before="0"/>
-              <w:jc w:val="left"/>
-            </w:pPr>
             <w:r>
-              <w:rPr>
-                <w:rFonts w:ascii="Arial" w:hAnsi="Arial"/>
-                <w:b/>
-                <w:sz w:val="16"/>
-              </w:rPr>
               <w:t>История изменений</w:t>
             </w:r>
           </w:p>
@@ -913,7 +838,7 @@
           </w:tcPr>
           <w:p>
             <w:r>
-              <w:t>Серверная история до 100 сохранённых версий на доску, просмотр и восстановление старого состояния. v88 показывает автора сохранения и автоматически сравнивает соседние версии по объектам: добавлено, изменено, удалено.</w:t>
+              <w:t>До 100 серверных версий, авторы, сводка добавленных/изменённых/удалённых объектов, подробная история совместной работы и безопасное восстановление.</w:t>
             </w:r>
           </w:p>
         </w:tc>
@@ -921,11 +846,11 @@
           <w:tcPr>
             <w:tcW w:type="dxa" w:w="1656"/>
             <w:vAlign w:val="center"/>
-            <w:shd w:fill="EEF0FF"/>
+            <w:shd w:fill="D9EAD3"/>
           </w:tcPr>
           <w:p>
             <w:r>
-              <w:t>ПОЧТИ ГОТОВО</w:t>
+              <w:t>ГОТОВО</w:t>
             </w:r>
           </w:p>
         </w:tc>
@@ -933,10 +858,11 @@
           <w:tcPr>
             <w:tcW w:type="dxa" w:w="936"/>
             <w:vAlign w:val="center"/>
+            <w:shd w:fill="D9EAD3"/>
           </w:tcPr>
           <w:p>
             <w:r>
-              <w:t>85%</w:t>
+              <w:t>100%</w:t>
             </w:r>
           </w:p>
         </w:tc>
@@ -947,7 +873,7 @@
           </w:tcPr>
           <w:p>
             <w:r>
-              <w:t>v68 + v88</w:t>
+              <w:t>v68 + v88–v89</w:t>
             </w:r>
           </w:p>
         </w:tc>
@@ -962,15 +888,7 @@
             <w:vAlign w:val="center"/>
           </w:tcPr>
           <w:p>
-            <w:pPr>
-              <w:spacing w:after="0" w:before="0"/>
-              <w:jc w:val="center"/>
-            </w:pPr>
             <w:r>
-              <w:rPr>
-                <w:rFonts w:ascii="Arial" w:hAnsi="Arial"/>
-                <w:sz w:val="16"/>
-              </w:rPr>
               <w:t>8</w:t>
             </w:r>
           </w:p>
@@ -981,16 +899,7 @@
             <w:vAlign w:val="center"/>
           </w:tcPr>
           <w:p>
-            <w:pPr>
-              <w:spacing w:after="0" w:before="0"/>
-              <w:jc w:val="left"/>
-            </w:pPr>
             <w:r>
-              <w:rPr>
-                <w:rFonts w:ascii="Arial" w:hAnsi="Arial"/>
-                <w:b/>
-                <w:sz w:val="16"/>
-              </w:rPr>
               <w:t>Ученики</w:t>
             </w:r>
           </w:p>
@@ -1002,11 +911,7 @@
           </w:tcPr>
           <w:p>
             <w:r>
-              <w:rPr>
-                <w:rFonts w:ascii="Arial" w:hAnsi="Arial"/>
-                <w:sz w:val="16"/>
-              </w:rPr>
-              <w:t>Карточки учеников, доски, история занятий, заметки, теги, персональная аналитика, расписание и назначенные учебные материалы.</w:t>
+              <w:t>Карточки учеников, доски, занятия, заметки, теги, материалы, задания, персональная аналитика, расписание и быстрые переходы по рабочему циклу.</w:t>
             </w:r>
           </w:p>
         </w:tc>
@@ -1014,15 +919,11 @@
           <w:tcPr>
             <w:tcW w:type="dxa" w:w="1656"/>
             <w:vAlign w:val="center"/>
-            <w:shd w:fill="FFF3D6"/>
+            <w:shd w:fill="D9EAD3"/>
           </w:tcPr>
           <w:p>
             <w:r>
-              <w:rPr>
-                <w:rFonts w:ascii="Arial" w:hAnsi="Arial"/>
-                <w:sz w:val="16"/>
-              </w:rPr>
-              <w:t>ЧАСТИЧНО ГОТОВО</w:t>
+              <w:t>ГОТОВО</w:t>
             </w:r>
           </w:p>
         </w:tc>
@@ -1030,14 +931,11 @@
           <w:tcPr>
             <w:tcW w:type="dxa" w:w="936"/>
             <w:vAlign w:val="center"/>
+            <w:shd w:fill="D9EAD3"/>
           </w:tcPr>
           <w:p>
             <w:r>
-              <w:rPr>
-                <w:rFonts w:ascii="Arial" w:hAnsi="Arial"/>
-                <w:sz w:val="16"/>
-              </w:rPr>
-              <w:t>94%</w:t>
+              <w:t>100%</w:t>
             </w:r>
           </w:p>
         </w:tc>
@@ -1048,11 +946,7 @@
           </w:tcPr>
           <w:p>
             <w:r>
-              <w:rPr>
-                <w:rFonts w:ascii="Arial" w:hAnsi="Arial"/>
-                <w:sz w:val="16"/>
-              </w:rPr>
-              <w:t>v35–v48</w:t>
+              <w:t>v35–v48 + v91</w:t>
             </w:r>
           </w:p>
         </w:tc>
@@ -1115,7 +1009,7 @@
           <w:tcPr>
             <w:tcW w:type="dxa" w:w="1656"/>
             <w:vAlign w:val="center"/>
-            <w:shd w:fill="EEF0FF"/>
+            <w:shd w:fill="D9EAD3"/>
           </w:tcPr>
           <w:p>
             <w:r>
@@ -1127,6 +1021,7 @@
           <w:tcPr>
             <w:tcW w:type="dxa" w:w="936"/>
             <w:vAlign w:val="center"/>
+            <w:shd w:fill="D9EAD3"/>
           </w:tcPr>
           <w:p>
             <w:r>
@@ -1208,14 +1103,10 @@
           <w:tcPr>
             <w:tcW w:type="dxa" w:w="1656"/>
             <w:vAlign w:val="center"/>
-            <w:shd w:fill="DFF3E4"/>
+            <w:shd w:fill="D9EAD3"/>
           </w:tcPr>
           <w:p>
             <w:r>
-              <w:rPr>
-                <w:rFonts w:ascii="Arial" w:hAnsi="Arial"/>
-                <w:sz w:val="16"/>
-              </w:rPr>
               <w:t>ГОТОВО</w:t>
             </w:r>
           </w:p>
@@ -1224,6 +1115,7 @@
           <w:tcPr>
             <w:tcW w:type="dxa" w:w="936"/>
             <w:vAlign w:val="center"/>
+            <w:shd w:fill="D9EAD3"/>
           </w:tcPr>
           <w:p>
             <w:r>
@@ -1313,15 +1205,11 @@
           <w:tcPr>
             <w:tcW w:type="dxa" w:w="1656"/>
             <w:vAlign w:val="center"/>
-            <w:shd w:fill="FFF3D6"/>
+            <w:shd w:fill="D9EAD3"/>
           </w:tcPr>
           <w:p>
             <w:r>
-              <w:rPr>
-                <w:rFonts w:ascii="Arial" w:hAnsi="Arial"/>
-                <w:sz w:val="16"/>
-              </w:rPr>
-              <w:t>ЧАСТИЧНО ГОТОВО</w:t>
+              <w:t>ГОТОВО</w:t>
             </w:r>
           </w:p>
         </w:tc>
@@ -1329,14 +1217,11 @@
           <w:tcPr>
             <w:tcW w:type="dxa" w:w="936"/>
             <w:vAlign w:val="center"/>
+            <w:shd w:fill="D9EAD3"/>
           </w:tcPr>
           <w:p>
             <w:r>
-              <w:rPr>
-                <w:rFonts w:ascii="Arial" w:hAnsi="Arial"/>
-                <w:sz w:val="16"/>
-              </w:rPr>
-              <w:t>82%</w:t>
+              <w:t>100%</w:t>
             </w:r>
           </w:p>
         </w:tc>
@@ -1347,11 +1232,7 @@
           </w:tcPr>
           <w:p>
             <w:r>
-              <w:rPr>
-                <w:rFonts w:ascii="Arial" w:hAnsi="Arial"/>
-                <w:sz w:val="16"/>
-              </w:rPr>
-              <w:t>v38–v43</w:t>
+              <w:t>v38–v43 + v92</w:t>
             </w:r>
           </w:p>
         </w:tc>
@@ -1422,19 +1303,10 @@
           <w:tcPr>
             <w:tcW w:type="dxa" w:w="1656"/>
             <w:vAlign w:val="center"/>
-            <w:shd w:fill="FFF3D6"/>
+            <w:shd w:fill="FFF2CC"/>
           </w:tcPr>
           <w:p>
-            <w:pPr>
-              <w:spacing w:after="0" w:before="0"/>
-              <w:jc w:val="center"/>
-            </w:pPr>
             <w:r>
-              <w:rPr>
-                <w:rFonts w:ascii="Arial" w:hAnsi="Arial"/>
-                <w:b/>
-                <w:sz w:val="16"/>
-              </w:rPr>
               <w:t>ЧАСТИЧНО ГОТОВО</w:t>
             </w:r>
           </w:p>
@@ -1443,6 +1315,7 @@
           <w:tcPr>
             <w:tcW w:type="dxa" w:w="936"/>
             <w:vAlign w:val="center"/>
+            <w:shd w:fill="FFF2CC"/>
           </w:tcPr>
           <w:p>
             <w:pPr>
@@ -1540,15 +1413,11 @@
           <w:tcPr>
             <w:tcW w:type="dxa" w:w="1656"/>
             <w:vAlign w:val="center"/>
-            <w:shd w:fill="FFF3D6"/>
+            <w:shd w:fill="D9EAD3"/>
           </w:tcPr>
           <w:p>
             <w:r>
-              <w:rPr>
-                <w:rFonts w:ascii="Arial" w:hAnsi="Arial"/>
-                <w:sz w:val="16"/>
-              </w:rPr>
-              <w:t>ЧАСТИЧНО ГОТОВО</w:t>
+              <w:t>ГОТОВО</w:t>
             </w:r>
           </w:p>
         </w:tc>
@@ -1556,14 +1425,11 @@
           <w:tcPr>
             <w:tcW w:type="dxa" w:w="936"/>
             <w:vAlign w:val="center"/>
+            <w:shd w:fill="D9EAD3"/>
           </w:tcPr>
           <w:p>
             <w:r>
-              <w:rPr>
-                <w:rFonts w:ascii="Arial" w:hAnsi="Arial"/>
-                <w:sz w:val="16"/>
-              </w:rPr>
-              <w:t>75%</w:t>
+              <w:t>100%</w:t>
             </w:r>
           </w:p>
         </w:tc>
@@ -1574,11 +1440,7 @@
           </w:tcPr>
           <w:p>
             <w:r>
-              <w:rPr>
-                <w:rFonts w:ascii="Arial" w:hAnsi="Arial"/>
-                <w:sz w:val="16"/>
-              </w:rPr>
-              <w:t>v39 + ранее</w:t>
+              <w:t>v39 + v92</w:t>
             </w:r>
           </w:p>
         </w:tc>
@@ -1633,11 +1495,7 @@
           </w:tcPr>
           <w:p>
             <w:r>
-              <w:rPr>
-                <w:rFonts w:ascii="Arial" w:hAnsi="Arial"/>
-                <w:sz w:val="16"/>
-              </w:rPr>
-              <w:t>Интерактивные задания на доске плюс отдельный серверный цикл: выдача, сдача, повторная сдача, проверка, результат и переход к связанной доске.</w:t>
+              <w:t>Интерактивные задания на доске и полный серверный цикл: выдача, сроки и просрочка, поиск/сортировка, сдача, повторная сдача, проверка, результат, материалы и переход к связанной доске.</w:t>
             </w:r>
           </w:p>
         </w:tc>
@@ -1645,14 +1503,10 @@
           <w:tcPr>
             <w:tcW w:type="dxa" w:w="1656"/>
             <w:vAlign w:val="center"/>
-            <w:shd w:fill="DFF3E4"/>
+            <w:shd w:fill="D9EAD3"/>
           </w:tcPr>
           <w:p>
             <w:r>
-              <w:rPr>
-                <w:rFonts w:ascii="Arial" w:hAnsi="Arial"/>
-                <w:sz w:val="16"/>
-              </w:rPr>
               <w:t>ГОТОВО</w:t>
             </w:r>
           </w:p>
@@ -1661,14 +1515,11 @@
           <w:tcPr>
             <w:tcW w:type="dxa" w:w="936"/>
             <w:vAlign w:val="center"/>
+            <w:shd w:fill="D9EAD3"/>
           </w:tcPr>
           <w:p>
             <w:r>
-              <w:rPr>
-                <w:rFonts w:ascii="Arial" w:hAnsi="Arial"/>
-                <w:sz w:val="16"/>
-              </w:rPr>
-              <w:t>90%</w:t>
+              <w:t>100%</w:t>
             </w:r>
           </w:p>
         </w:tc>
@@ -1679,11 +1530,7 @@
           </w:tcPr>
           <w:p>
             <w:r>
-              <w:rPr>
-                <w:rFonts w:ascii="Arial" w:hAnsi="Arial"/>
-                <w:sz w:val="16"/>
-              </w:rPr>
-              <w:t>v40</w:t>
+              <w:t>v40 + v93</w:t>
             </w:r>
           </w:p>
         </w:tc>
@@ -1698,15 +1545,7 @@
             <w:vAlign w:val="center"/>
           </w:tcPr>
           <w:p>
-            <w:pPr>
-              <w:spacing w:after="0" w:before="0"/>
-              <w:jc w:val="center"/>
-            </w:pPr>
             <w:r>
-              <w:rPr>
-                <w:rFonts w:ascii="Arial" w:hAnsi="Arial"/>
-                <w:sz w:val="16"/>
-              </w:rPr>
               <w:t>15</w:t>
             </w:r>
           </w:p>
@@ -1717,16 +1556,7 @@
             <w:vAlign w:val="center"/>
           </w:tcPr>
           <w:p>
-            <w:pPr>
-              <w:spacing w:after="0" w:before="0"/>
-              <w:jc w:val="left"/>
-            </w:pPr>
             <w:r>
-              <w:rPr>
-                <w:rFonts w:ascii="Arial" w:hAnsi="Arial"/>
-                <w:b/>
-                <w:sz w:val="16"/>
-              </w:rPr>
               <w:t>Тесты</w:t>
             </w:r>
           </w:p>
@@ -1737,16 +1567,8 @@
             <w:vAlign w:val="center"/>
           </w:tcPr>
           <w:p>
-            <w:pPr>
-              <w:spacing w:after="0" w:before="0"/>
-              <w:jc w:val="left"/>
-            </w:pPr>
             <w:r>
-              <w:rPr>
-                <w:rFonts w:ascii="Arial" w:hAnsi="Arial"/>
-                <w:sz w:val="16"/>
-              </w:rPr>
-              <w:t>Варианты ответов, правильный ответ, объяснение, автоматическая проверка и результаты.</w:t>
+              <w:t>Вопросы с 2–8 вариантами, правильный ответ и пояснение, выбор ответа на доске, автоматическая проверка, общий учебный режим, итоговый результат и повторное прохождение.</w:t>
             </w:r>
           </w:p>
         </w:tc>
@@ -1754,20 +1576,11 @@
           <w:tcPr>
             <w:tcW w:type="dxa" w:w="1656"/>
             <w:vAlign w:val="center"/>
-            <w:shd w:fill="FFF3D6"/>
+            <w:shd w:fill="D9EAD3"/>
           </w:tcPr>
           <w:p>
-            <w:pPr>
-              <w:spacing w:after="0" w:before="0"/>
-              <w:jc w:val="center"/>
-            </w:pPr>
             <w:r>
-              <w:rPr>
-                <w:rFonts w:ascii="Arial" w:hAnsi="Arial"/>
-                <w:b/>
-                <w:sz w:val="16"/>
-              </w:rPr>
-              <w:t>ЧАСТИЧНО ГОТОВО</w:t>
+              <w:t>ГОТОВО</w:t>
             </w:r>
           </w:p>
         </w:tc>
@@ -1775,18 +1588,11 @@
           <w:tcPr>
             <w:tcW w:type="dxa" w:w="936"/>
             <w:vAlign w:val="center"/>
+            <w:shd w:fill="D9EAD3"/>
           </w:tcPr>
           <w:p>
-            <w:pPr>
-              <w:spacing w:after="0" w:before="0"/>
-              <w:jc w:val="center"/>
-            </w:pPr>
             <w:r>
-              <w:rPr>
-                <w:rFonts w:ascii="Arial" w:hAnsi="Arial"/>
-                <w:sz w:val="16"/>
-              </w:rPr>
-              <w:t>45%</w:t>
+              <w:t>100%</w:t>
             </w:r>
           </w:p>
         </w:tc>
@@ -1796,16 +1602,8 @@
             <w:vAlign w:val="center"/>
           </w:tcPr>
           <w:p>
-            <w:pPr>
-              <w:spacing w:after="0" w:before="0"/>
-              <w:jc w:val="center"/>
-            </w:pPr>
             <w:r>
-              <w:rPr>
-                <w:rFonts w:ascii="Arial" w:hAnsi="Arial"/>
-                <w:sz w:val="16"/>
-              </w:rPr>
-              <w:t>Этап 4</w:t>
+              <w:t>v94</w:t>
             </w:r>
           </w:p>
         </w:tc>
@@ -1820,15 +1618,7 @@
             <w:vAlign w:val="center"/>
           </w:tcPr>
           <w:p>
-            <w:pPr>
-              <w:spacing w:after="0" w:before="0"/>
-              <w:jc w:val="center"/>
-            </w:pPr>
             <w:r>
-              <w:rPr>
-                <w:rFonts w:ascii="Arial" w:hAnsi="Arial"/>
-                <w:sz w:val="16"/>
-              </w:rPr>
               <w:t>16</w:t>
             </w:r>
           </w:p>
@@ -1839,16 +1629,7 @@
             <w:vAlign w:val="center"/>
           </w:tcPr>
           <w:p>
-            <w:pPr>
-              <w:spacing w:after="0" w:before="0"/>
-              <w:jc w:val="left"/>
-            </w:pPr>
             <w:r>
-              <w:rPr>
-                <w:rFonts w:ascii="Arial" w:hAnsi="Arial"/>
-                <w:b/>
-                <w:sz w:val="16"/>
-              </w:rPr>
               <w:t>Карточки вопрос/ответ</w:t>
             </w:r>
           </w:p>
@@ -1859,16 +1640,8 @@
             <w:vAlign w:val="center"/>
           </w:tcPr>
           <w:p>
-            <w:pPr>
-              <w:spacing w:after="0" w:before="0"/>
-              <w:jc w:val="left"/>
-            </w:pPr>
             <w:r>
-              <w:rPr>
-                <w:rFonts w:ascii="Arial" w:hAnsi="Arial"/>
-                <w:sz w:val="16"/>
-              </w:rPr>
-              <w:t>Флеш-карточки, скрываемые ответы, режим повторения.</w:t>
+              <w:t>Флеш-карточки с вопросом и ответом, переворот, общий режим повторения, отметки «Знаю / Повторить», прогресс освоения, навигация и сброс прогресса.</w:t>
             </w:r>
           </w:p>
         </w:tc>
@@ -1876,20 +1649,11 @@
           <w:tcPr>
             <w:tcW w:type="dxa" w:w="1656"/>
             <w:vAlign w:val="center"/>
-            <w:shd w:fill="FFF3D6"/>
+            <w:shd w:fill="D9EAD3"/>
           </w:tcPr>
           <w:p>
-            <w:pPr>
-              <w:spacing w:after="0" w:before="0"/>
-              <w:jc w:val="center"/>
-            </w:pPr>
             <w:r>
-              <w:rPr>
-                <w:rFonts w:ascii="Arial" w:hAnsi="Arial"/>
-                <w:b/>
-                <w:sz w:val="16"/>
-              </w:rPr>
-              <w:t>ЧАСТИЧНО ГОТОВО</w:t>
+              <w:t>ГОТОВО</w:t>
             </w:r>
           </w:p>
         </w:tc>
@@ -1897,18 +1661,11 @@
           <w:tcPr>
             <w:tcW w:type="dxa" w:w="936"/>
             <w:vAlign w:val="center"/>
+            <w:shd w:fill="D9EAD3"/>
           </w:tcPr>
           <w:p>
-            <w:pPr>
-              <w:spacing w:after="0" w:before="0"/>
-              <w:jc w:val="center"/>
-            </w:pPr>
             <w:r>
-              <w:rPr>
-                <w:rFonts w:ascii="Arial" w:hAnsi="Arial"/>
-                <w:sz w:val="16"/>
-              </w:rPr>
-              <w:t>55%</w:t>
+              <w:t>100%</w:t>
             </w:r>
           </w:p>
         </w:tc>
@@ -1918,16 +1675,8 @@
             <w:vAlign w:val="center"/>
           </w:tcPr>
           <w:p>
-            <w:pPr>
-              <w:spacing w:after="0" w:before="0"/>
-              <w:jc w:val="center"/>
-            </w:pPr>
             <w:r>
-              <w:rPr>
-                <w:rFonts w:ascii="Arial" w:hAnsi="Arial"/>
-                <w:sz w:val="16"/>
-              </w:rPr>
-              <w:t>Этап 4</w:t>
+              <w:t>v94</w:t>
             </w:r>
           </w:p>
         </w:tc>
@@ -1982,11 +1731,7 @@
           </w:tcPr>
           <w:p>
             <w:r>
-              <w:rPr>
-                <w:rFonts w:ascii="Arial" w:hAnsi="Arial"/>
-                <w:sz w:val="16"/>
-              </w:rPr>
-              <w:t>Выдача и сдача работ, проверка, баллы, обратная связь, материалы и серверные уведомления о новом задании/сдаче/проверке.</w:t>
+              <w:t>Полный цикл домашней работы: выдача, дедлайн и просрочка, сдача/повторная сдача, проверка, баллы, обратная связь, материалы и корректные серверные уведомления.</w:t>
             </w:r>
           </w:p>
         </w:tc>
@@ -1994,15 +1739,11 @@
           <w:tcPr>
             <w:tcW w:type="dxa" w:w="1656"/>
             <w:vAlign w:val="center"/>
-            <w:shd w:fill="FFF3D6"/>
+            <w:shd w:fill="D9EAD3"/>
           </w:tcPr>
           <w:p>
             <w:r>
-              <w:rPr>
-                <w:rFonts w:ascii="Arial" w:hAnsi="Arial"/>
-                <w:sz w:val="16"/>
-              </w:rPr>
-              <w:t>ЧАСТИЧНО ГОТОВО</w:t>
+              <w:t>ГОТОВО</w:t>
             </w:r>
           </w:p>
         </w:tc>
@@ -2010,14 +1751,11 @@
           <w:tcPr>
             <w:tcW w:type="dxa" w:w="936"/>
             <w:vAlign w:val="center"/>
+            <w:shd w:fill="D9EAD3"/>
           </w:tcPr>
           <w:p>
             <w:r>
-              <w:rPr>
-                <w:rFonts w:ascii="Arial" w:hAnsi="Arial"/>
-                <w:sz w:val="16"/>
-              </w:rPr>
-              <w:t>86%</w:t>
+              <w:t>100%</w:t>
             </w:r>
           </w:p>
         </w:tc>
@@ -2028,11 +1766,7 @@
           </w:tcPr>
           <w:p>
             <w:r>
-              <w:rPr>
-                <w:rFonts w:ascii="Arial" w:hAnsi="Arial"/>
-                <w:sz w:val="16"/>
-              </w:rPr>
-              <w:t>v40 + v48–v49</w:t>
+              <w:t>v40 + v48–v50 + v93</w:t>
             </w:r>
           </w:p>
         </w:tc>
@@ -2047,15 +1781,7 @@
             <w:vAlign w:val="center"/>
           </w:tcPr>
           <w:p>
-            <w:pPr>
-              <w:spacing w:after="0" w:before="0"/>
-              <w:jc w:val="center"/>
-            </w:pPr>
             <w:r>
-              <w:rPr>
-                <w:rFonts w:ascii="Arial" w:hAnsi="Arial"/>
-                <w:sz w:val="16"/>
-              </w:rPr>
               <w:t>18</w:t>
             </w:r>
           </w:p>
@@ -2066,16 +1792,7 @@
             <w:vAlign w:val="center"/>
           </w:tcPr>
           <w:p>
-            <w:pPr>
-              <w:spacing w:after="0" w:before="0"/>
-              <w:jc w:val="left"/>
-            </w:pPr>
             <w:r>
-              <w:rPr>
-                <w:rFonts w:ascii="Arial" w:hAnsi="Arial"/>
-                <w:b/>
-                <w:sz w:val="16"/>
-              </w:rPr>
               <w:t>Баллы и прогресс</w:t>
             </w:r>
           </w:p>
@@ -2087,11 +1804,7 @@
           </w:tcPr>
           <w:p>
             <w:r>
-              <w:rPr>
-                <w:rFonts w:ascii="Arial" w:hAnsi="Arial"/>
-                <w:sz w:val="16"/>
-              </w:rPr>
-              <w:t>Баллы за работы, средний результат, просрочки, часы занятий, статусы заданий, фильтр по ученику и периоду, график и сводная таблица.</w:t>
+              <w:t>Баллы, средний результат, просрочки, часы занятий, статусы заданий, фильтры по ученику/периоду, график, сводная таблица и CSV-экспорт.</w:t>
             </w:r>
           </w:p>
         </w:tc>
@@ -2099,15 +1812,11 @@
           <w:tcPr>
             <w:tcW w:type="dxa" w:w="1656"/>
             <w:vAlign w:val="center"/>
-            <w:shd w:fill="FFF3D6"/>
+            <w:shd w:fill="D9EAD3"/>
           </w:tcPr>
           <w:p>
             <w:r>
-              <w:rPr>
-                <w:rFonts w:ascii="Arial" w:hAnsi="Arial"/>
-                <w:sz w:val="16"/>
-              </w:rPr>
-              <w:t>ЧАСТИЧНО ГОТОВО</w:t>
+              <w:t>ГОТОВО</w:t>
             </w:r>
           </w:p>
         </w:tc>
@@ -2115,14 +1824,11 @@
           <w:tcPr>
             <w:tcW w:type="dxa" w:w="936"/>
             <w:vAlign w:val="center"/>
+            <w:shd w:fill="D9EAD3"/>
           </w:tcPr>
           <w:p>
             <w:r>
-              <w:rPr>
-                <w:rFonts w:ascii="Arial" w:hAnsi="Arial"/>
-                <w:sz w:val="16"/>
-              </w:rPr>
-              <w:t>75%</w:t>
+              <w:t>100%</w:t>
             </w:r>
           </w:p>
         </w:tc>
@@ -2133,11 +1839,7 @@
           </w:tcPr>
           <w:p>
             <w:r>
-              <w:rPr>
-                <w:rFonts w:ascii="Arial" w:hAnsi="Arial"/>
-                <w:sz w:val="16"/>
-              </w:rPr>
-              <w:t>v41</w:t>
+              <w:t>v41 + v91</w:t>
             </w:r>
           </w:p>
         </w:tc>
@@ -2204,11 +1906,11 @@
           <w:tcPr>
             <w:tcW w:type="dxa" w:w="1656"/>
             <w:vAlign w:val="center"/>
-            <w:shd w:fill="EEF0FF"/>
+            <w:shd w:fill="FFF2CC"/>
           </w:tcPr>
           <w:p>
             <w:r>
-              <w:t>ЧАСТИЧНО ГОТОВО</w:t>
+              <w:t>ПОЧТИ ГОТОВО</w:t>
             </w:r>
           </w:p>
         </w:tc>
@@ -2216,6 +1918,7 @@
           <w:tcPr>
             <w:tcW w:type="dxa" w:w="936"/>
             <w:vAlign w:val="center"/>
+            <w:shd w:fill="FFF2CC"/>
           </w:tcPr>
           <w:p>
             <w:r>
@@ -2297,7 +2000,7 @@
           <w:tcPr>
             <w:tcW w:type="dxa" w:w="1656"/>
             <w:vAlign w:val="center"/>
-            <w:shd w:fill="FFF3D6"/>
+            <w:shd w:fill="D9EAD3"/>
           </w:tcPr>
           <w:p>
             <w:r>
@@ -2309,6 +2012,7 @@
           <w:tcPr>
             <w:tcW w:type="dxa" w:w="936"/>
             <w:vAlign w:val="center"/>
+            <w:shd w:fill="D9EAD3"/>
           </w:tcPr>
           <w:p>
             <w:r>
@@ -2390,14 +2094,10 @@
           <w:tcPr>
             <w:tcW w:type="dxa" w:w="1656"/>
             <w:vAlign w:val="center"/>
-            <w:shd w:fill="EEF0FF"/>
+            <w:shd w:fill="FFF2CC"/>
           </w:tcPr>
           <w:p>
             <w:r>
-              <w:rPr>
-                <w:rFonts w:ascii="Arial" w:hAnsi="Arial"/>
-                <w:sz w:val="16"/>
-              </w:rPr>
               <w:t>ЧАСТИЧНО ГОТОВО</w:t>
             </w:r>
           </w:p>
@@ -2406,6 +2106,7 @@
           <w:tcPr>
             <w:tcW w:type="dxa" w:w="936"/>
             <w:vAlign w:val="center"/>
+            <w:shd w:fill="FFF2CC"/>
           </w:tcPr>
           <w:p>
             <w:r>
@@ -2495,14 +2196,10 @@
           <w:tcPr>
             <w:tcW w:type="dxa" w:w="1656"/>
             <w:vAlign w:val="center"/>
-            <w:shd w:fill="EEF0FF"/>
+            <w:shd w:fill="FFF2CC"/>
           </w:tcPr>
           <w:p>
             <w:r>
-              <w:rPr>
-                <w:rFonts w:ascii="Arial" w:hAnsi="Arial"/>
-                <w:sz w:val="16"/>
-              </w:rPr>
               <w:t>ЧАСТИЧНО ГОТОВО</w:t>
             </w:r>
           </w:p>
@@ -2511,6 +2208,7 @@
           <w:tcPr>
             <w:tcW w:type="dxa" w:w="936"/>
             <w:vAlign w:val="center"/>
+            <w:shd w:fill="FFF2CC"/>
           </w:tcPr>
           <w:p>
             <w:r>
@@ -2600,15 +2298,11 @@
           <w:tcPr>
             <w:tcW w:type="dxa" w:w="1656"/>
             <w:vAlign w:val="center"/>
-            <w:shd w:fill="EEF0FF"/>
+            <w:shd w:fill="FFF2CC"/>
           </w:tcPr>
           <w:p>
             <w:r>
-              <w:rPr>
-                <w:rFonts w:ascii="Arial" w:hAnsi="Arial"/>
-                <w:sz w:val="16"/>
-              </w:rPr>
-              <w:t>ГОТОВО</w:t>
+              <w:t>ЧАСТИЧНО ГОТОВО</w:t>
             </w:r>
           </w:p>
         </w:tc>
@@ -2616,6 +2310,7 @@
           <w:tcPr>
             <w:tcW w:type="dxa" w:w="936"/>
             <w:vAlign w:val="center"/>
+            <w:shd w:fill="FFF2CC"/>
           </w:tcPr>
           <w:p>
             <w:r>
@@ -2701,11 +2396,11 @@
           <w:tcPr>
             <w:tcW w:type="dxa" w:w="1656"/>
             <w:vAlign w:val="center"/>
-            <w:shd w:fill="EEF0FF"/>
+            <w:shd w:fill="FFF2CC"/>
           </w:tcPr>
           <w:p>
             <w:r>
-              <w:t>ЧАСТИЧНО ГОТОВО</w:t>
+              <w:t>ПОЧТИ ГОТОВО</w:t>
             </w:r>
           </w:p>
         </w:tc>
@@ -2713,6 +2408,7 @@
           <w:tcPr>
             <w:tcW w:type="dxa" w:w="936"/>
             <w:vAlign w:val="center"/>
+            <w:shd w:fill="FFF2CC"/>
           </w:tcPr>
           <w:p>
             <w:r>
@@ -2794,14 +2490,10 @@
           <w:tcPr>
             <w:tcW w:type="dxa" w:w="1656"/>
             <w:vAlign w:val="center"/>
-            <w:shd w:fill="FFF3D6"/>
+            <w:shd w:fill="FFF2CC"/>
           </w:tcPr>
           <w:p>
             <w:r>
-              <w:rPr>
-                <w:rFonts w:ascii="Arial" w:hAnsi="Arial"/>
-                <w:sz w:val="16"/>
-              </w:rPr>
               <w:t>ЧАСТИЧНО ГОТОВО</w:t>
             </w:r>
           </w:p>
@@ -2810,6 +2502,7 @@
           <w:tcPr>
             <w:tcW w:type="dxa" w:w="936"/>
             <w:vAlign w:val="center"/>
+            <w:shd w:fill="FFF2CC"/>
           </w:tcPr>
           <w:p>
             <w:r>
@@ -2895,7 +2588,7 @@
           <w:tcPr>
             <w:tcW w:type="dxa" w:w="1656"/>
             <w:vAlign w:val="center"/>
-            <w:shd w:fill="EEF0FF"/>
+            <w:shd w:fill="D9EAD3"/>
           </w:tcPr>
           <w:p>
             <w:r>
@@ -2907,6 +2600,7 @@
           <w:tcPr>
             <w:tcW w:type="dxa" w:w="936"/>
             <w:vAlign w:val="center"/>
+            <w:shd w:fill="D9EAD3"/>
           </w:tcPr>
           <w:p>
             <w:r>
@@ -2988,15 +2682,11 @@
           <w:tcPr>
             <w:tcW w:type="dxa" w:w="1656"/>
             <w:vAlign w:val="center"/>
-            <w:shd w:fill="EEF0FF"/>
+            <w:shd w:fill="D9EAD3"/>
           </w:tcPr>
           <w:p>
             <w:r>
-              <w:rPr>
-                <w:rFonts w:ascii="Arial" w:hAnsi="Arial"/>
-                <w:sz w:val="16"/>
-              </w:rPr>
-              <w:t>ЧАСТИЧНО ГОТОВО</w:t>
+              <w:t>ГОТОВО</w:t>
             </w:r>
           </w:p>
         </w:tc>
@@ -3004,14 +2694,11 @@
           <w:tcPr>
             <w:tcW w:type="dxa" w:w="936"/>
             <w:vAlign w:val="center"/>
+            <w:shd w:fill="D9EAD3"/>
           </w:tcPr>
           <w:p>
             <w:r>
-              <w:rPr>
-                <w:rFonts w:ascii="Arial" w:hAnsi="Arial"/>
-                <w:sz w:val="16"/>
-              </w:rPr>
-              <w:t>83%</w:t>
+              <w:t>100%</w:t>
             </w:r>
           </w:p>
         </w:tc>
@@ -3022,11 +2709,7 @@
           </w:tcPr>
           <w:p>
             <w:r>
-              <w:rPr>
-                <w:rFonts w:ascii="Arial" w:hAnsi="Arial"/>
-                <w:sz w:val="16"/>
-              </w:rPr>
-              <w:t>v42–v43 + v49</w:t>
+              <w:t>v42–v43 + v49 + v92</w:t>
             </w:r>
           </w:p>
         </w:tc>
@@ -3081,7 +2764,7 @@
           </w:tcPr>
           <w:p>
             <w:r>
-              <w:t>Центр уведомлений, настройки типов, серверные события и напоминания. v79 закрывает прямой запуск глобального генератора клиентом, переносит сохранение настроек в защищённый RPC, запускает напоминания через pg_cron и добавляет автообновление центра/счётчика.</w:t>
+              <w:t>Центр уведомлений, настройки типов, фильтры, серверные события и напоминания. v93 исправляет первую сдачу работы, исключает напоминания для уже сданных заданий и добавляет прямые ссылки на конкретное задание.</w:t>
             </w:r>
           </w:p>
         </w:tc>
@@ -3089,11 +2772,11 @@
           <w:tcPr>
             <w:tcW w:type="dxa" w:w="1656"/>
             <w:vAlign w:val="center"/>
-            <w:shd w:fill="EEF0FF"/>
+            <w:shd w:fill="D9EAD3"/>
           </w:tcPr>
           <w:p>
             <w:r>
-              <w:t>ТЕКУЩИЙ ПАТЧ</w:t>
+              <w:t>ГОТОВО</w:t>
             </w:r>
           </w:p>
         </w:tc>
@@ -3101,10 +2784,11 @@
           <w:tcPr>
             <w:tcW w:type="dxa" w:w="936"/>
             <w:vAlign w:val="center"/>
+            <w:shd w:fill="D9EAD3"/>
           </w:tcPr>
           <w:p>
             <w:r>
-              <w:t>96%</w:t>
+              <w:t>100%</w:t>
             </w:r>
           </w:p>
         </w:tc>
@@ -3115,7 +2799,7 @@
           </w:tcPr>
           <w:p>
             <w:r>
-              <w:t>v49–v50 + v79 · ждёт проверки</w:t>
+              <w:t>v49–v50 + v79 + v86 + v93</w:t>
             </w:r>
           </w:p>
         </w:tc>
@@ -3182,14 +2866,10 @@
           <w:tcPr>
             <w:tcW w:type="dxa" w:w="1656"/>
             <w:vAlign w:val="center"/>
-            <w:shd w:fill="EEF0FF"/>
+            <w:shd w:fill="FFF2CC"/>
           </w:tcPr>
           <w:p>
             <w:r>
-              <w:rPr>
-                <w:rFonts w:ascii="Arial" w:hAnsi="Arial"/>
-                <w:sz w:val="16"/>
-              </w:rPr>
               <w:t>ЧАСТИЧНО ГОТОВО</w:t>
             </w:r>
           </w:p>
@@ -3198,6 +2878,7 @@
           <w:tcPr>
             <w:tcW w:type="dxa" w:w="936"/>
             <w:vAlign w:val="center"/>
+            <w:shd w:fill="FFF2CC"/>
           </w:tcPr>
           <w:p>
             <w:r>
@@ -3283,7 +2964,7 @@
           <w:tcPr>
             <w:tcW w:type="dxa" w:w="1656"/>
             <w:vAlign w:val="center"/>
-            <w:shd w:fill="EEF0FF"/>
+            <w:shd w:fill="FFF2CC"/>
           </w:tcPr>
           <w:p>
             <w:r>
@@ -3295,6 +2976,7 @@
           <w:tcPr>
             <w:tcW w:type="dxa" w:w="936"/>
             <w:vAlign w:val="center"/>
+            <w:shd w:fill="FFF2CC"/>
           </w:tcPr>
           <w:p>
             <w:r>
@@ -3372,7 +3054,7 @@
           <w:tcPr>
             <w:tcW w:type="dxa" w:w="1656"/>
             <w:vAlign w:val="center"/>
-            <w:shd w:fill="EEF0FF"/>
+            <w:shd w:fill="FFF2CC"/>
           </w:tcPr>
           <w:p>
             <w:r>
@@ -3384,6 +3066,7 @@
           <w:tcPr>
             <w:tcW w:type="dxa" w:w="936"/>
             <w:vAlign w:val="center"/>
+            <w:shd w:fill="FFF2CC"/>
           </w:tcPr>
           <w:p>
             <w:r>
@@ -3461,7 +3144,7 @@
           <w:tcPr>
             <w:tcW w:type="dxa" w:w="1656"/>
             <w:vAlign w:val="center"/>
-            <w:shd w:fill="EEF0FF"/>
+            <w:shd w:fill="FFF2CC"/>
           </w:tcPr>
           <w:p>
             <w:r>
@@ -3473,6 +3156,7 @@
           <w:tcPr>
             <w:tcW w:type="dxa" w:w="936"/>
             <w:vAlign w:val="center"/>
+            <w:shd w:fill="FFF2CC"/>
           </w:tcPr>
           <w:p>
             <w:r>
@@ -3550,7 +3234,7 @@
           <w:tcPr>
             <w:tcW w:type="dxa" w:w="1656"/>
             <w:vAlign w:val="center"/>
-            <w:shd w:fill="EEF0FF"/>
+            <w:shd w:fill="D9EAD3"/>
           </w:tcPr>
           <w:p>
             <w:r>
@@ -3562,6 +3246,7 @@
           <w:tcPr>
             <w:tcW w:type="dxa" w:w="936"/>
             <w:vAlign w:val="center"/>
+            <w:shd w:fill="D9EAD3"/>
           </w:tcPr>
           <w:p>
             <w:r>
@@ -3639,7 +3324,7 @@
           <w:tcPr>
             <w:tcW w:type="dxa" w:w="1656"/>
             <w:vAlign w:val="center"/>
-            <w:shd w:fill="EEF0FF"/>
+            <w:shd w:fill="FFF2CC"/>
           </w:tcPr>
           <w:p>
             <w:r>
@@ -3651,6 +3336,7 @@
           <w:tcPr>
             <w:tcW w:type="dxa" w:w="936"/>
             <w:vAlign w:val="center"/>
+            <w:shd w:fill="FFF2CC"/>
           </w:tcPr>
           <w:p>
             <w:r>
@@ -3728,7 +3414,7 @@
           <w:tcPr>
             <w:tcW w:type="dxa" w:w="1656"/>
             <w:vAlign w:val="center"/>
-            <w:shd w:fill="FFF3D6"/>
+            <w:shd w:fill="FFF2CC"/>
           </w:tcPr>
           <w:p>
             <w:r>
@@ -3740,6 +3426,7 @@
           <w:tcPr>
             <w:tcW w:type="dxa" w:w="936"/>
             <w:vAlign w:val="center"/>
+            <w:shd w:fill="FFF2CC"/>
           </w:tcPr>
           <w:p>
             <w:r>
@@ -3817,7 +3504,7 @@
           <w:tcPr>
             <w:tcW w:type="dxa" w:w="1656"/>
             <w:vAlign w:val="center"/>
-            <w:shd w:fill="FFF3D6"/>
+            <w:shd w:fill="FFF2CC"/>
           </w:tcPr>
           <w:p>
             <w:r>
@@ -3829,6 +3516,7 @@
           <w:tcPr>
             <w:tcW w:type="dxa" w:w="936"/>
             <w:vAlign w:val="center"/>
+            <w:shd w:fill="FFF2CC"/>
           </w:tcPr>
           <w:p>
             <w:r>
@@ -3906,7 +3594,7 @@
           <w:tcPr>
             <w:tcW w:type="dxa" w:w="1656"/>
             <w:vAlign w:val="center"/>
-            <w:shd w:fill="EEF0FF"/>
+            <w:shd w:fill="FFF2CC"/>
           </w:tcPr>
           <w:p>
             <w:r>
@@ -3918,6 +3606,7 @@
           <w:tcPr>
             <w:tcW w:type="dxa" w:w="936"/>
             <w:vAlign w:val="center"/>
+            <w:shd w:fill="FFF2CC"/>
           </w:tcPr>
           <w:p>
             <w:r>
@@ -4003,19 +3692,10 @@
           <w:tcPr>
             <w:tcW w:type="dxa" w:w="1656"/>
             <w:vAlign w:val="center"/>
-            <w:shd w:fill="F1F2F4"/>
+            <w:shd w:fill="E7E6E6"/>
           </w:tcPr>
           <w:p>
-            <w:pPr>
-              <w:spacing w:after="0" w:before="0"/>
-              <w:jc w:val="center"/>
-            </w:pPr>
             <w:r>
-              <w:rPr>
-                <w:rFonts w:ascii="Arial" w:hAnsi="Arial"/>
-                <w:b/>
-                <w:sz w:val="16"/>
-              </w:rPr>
               <w:t>ПОЗЖЕ</w:t>
             </w:r>
           </w:p>
@@ -4024,6 +3704,7 @@
           <w:tcPr>
             <w:tcW w:type="dxa" w:w="936"/>
             <w:vAlign w:val="center"/>
+            <w:shd w:fill="E7E6E6"/>
           </w:tcPr>
           <w:p>
             <w:pPr>
@@ -4125,19 +3806,10 @@
           <w:tcPr>
             <w:tcW w:type="dxa" w:w="1656"/>
             <w:vAlign w:val="center"/>
-            <w:shd w:fill="F1F2F4"/>
+            <w:shd w:fill="E7E6E6"/>
           </w:tcPr>
           <w:p>
-            <w:pPr>
-              <w:spacing w:after="0" w:before="0"/>
-              <w:jc w:val="center"/>
-            </w:pPr>
             <w:r>
-              <w:rPr>
-                <w:rFonts w:ascii="Arial" w:hAnsi="Arial"/>
-                <w:b/>
-                <w:sz w:val="16"/>
-              </w:rPr>
               <w:t>ПОЗЖЕ</w:t>
             </w:r>
           </w:p>
@@ -4146,6 +3818,7 @@
           <w:tcPr>
             <w:tcW w:type="dxa" w:w="936"/>
             <w:vAlign w:val="center"/>
+            <w:shd w:fill="E7E6E6"/>
           </w:tcPr>
           <w:p>
             <w:pPr>
@@ -4247,19 +3920,10 @@
           <w:tcPr>
             <w:tcW w:type="dxa" w:w="1656"/>
             <w:vAlign w:val="center"/>
-            <w:shd w:fill="F1F2F4"/>
+            <w:shd w:fill="E7E6E6"/>
           </w:tcPr>
           <w:p>
-            <w:pPr>
-              <w:spacing w:after="0" w:before="0"/>
-              <w:jc w:val="center"/>
-            </w:pPr>
             <w:r>
-              <w:rPr>
-                <w:rFonts w:ascii="Arial" w:hAnsi="Arial"/>
-                <w:b/>
-                <w:sz w:val="16"/>
-              </w:rPr>
               <w:t>ПОЗЖЕ</w:t>
             </w:r>
           </w:p>
@@ -4268,6 +3932,7 @@
           <w:tcPr>
             <w:tcW w:type="dxa" w:w="936"/>
             <w:vAlign w:val="center"/>
+            <w:shd w:fill="E7E6E6"/>
           </w:tcPr>
           <w:p>
             <w:pPr>
@@ -4369,19 +4034,10 @@
           <w:tcPr>
             <w:tcW w:type="dxa" w:w="1656"/>
             <w:vAlign w:val="center"/>
-            <w:shd w:fill="F1F2F4"/>
+            <w:shd w:fill="E7E6E6"/>
           </w:tcPr>
           <w:p>
-            <w:pPr>
-              <w:spacing w:after="0" w:before="0"/>
-              <w:jc w:val="center"/>
-            </w:pPr>
             <w:r>
-              <w:rPr>
-                <w:rFonts w:ascii="Arial" w:hAnsi="Arial"/>
-                <w:b/>
-                <w:sz w:val="16"/>
-              </w:rPr>
               <w:t>ПОЗЖЕ</w:t>
             </w:r>
           </w:p>
@@ -4390,6 +4046,7 @@
           <w:tcPr>
             <w:tcW w:type="dxa" w:w="936"/>
             <w:vAlign w:val="center"/>
+            <w:shd w:fill="E7E6E6"/>
           </w:tcPr>
           <w:p>
             <w:pPr>
@@ -4429,10 +4086,7 @@
     <w:p/>
     <w:p>
       <w:r>
-        <w:rPr>
-          <w:sz w:val="18"/>
-        </w:rPr>
-        <w:t>Текущий ближайший маршрут: завершение истории действий и совместного редактирования → финальная полировка комментариев → безопасность и подготовка релиза.</w:t>
+        <w:t>Текущий ближайший маршрут: библиотека материалов и редакторы → мобильная/PWA-полировка → гостевой доступ, экспорт/импорт и подготовка релиза.</w:t>
       </w:r>
     </w:p>
     <w:p>

</xml_diff>

<commit_message>
v95: finish materials library
</commit_message>
<xml_diff>
--- a/OnlineRepetitor_roadmap.docx
+++ b/OnlineRepetitor_roadmap.docx
@@ -30,7 +30,7 @@
     </w:p>
     <w:p>
       <w:r>
-        <w:t>Общий прогресс дорожной карты: ≈95% · актуально после v94</w:t>
+        <w:t>Общий прогресс дорожной карты: ≈96% · актуально после v95</w:t>
       </w:r>
     </w:p>
     <w:p>
@@ -1854,15 +1854,7 @@
             <w:vAlign w:val="center"/>
           </w:tcPr>
           <w:p>
-            <w:pPr>
-              <w:spacing w:after="0" w:before="0"/>
-              <w:jc w:val="center"/>
-            </w:pPr>
             <w:r>
-              <w:rPr>
-                <w:rFonts w:ascii="Arial" w:hAnsi="Arial"/>
-                <w:sz w:val="16"/>
-              </w:rPr>
               <w:t>19</w:t>
             </w:r>
           </w:p>
@@ -1873,16 +1865,7 @@
             <w:vAlign w:val="center"/>
           </w:tcPr>
           <w:p>
-            <w:pPr>
-              <w:spacing w:after="0" w:before="0"/>
-              <w:jc w:val="left"/>
-            </w:pPr>
             <w:r>
-              <w:rPr>
-                <w:rFonts w:ascii="Arial" w:hAnsi="Arial"/>
-                <w:b/>
-                <w:sz w:val="16"/>
-              </w:rPr>
               <w:t>Библиотека материалов</w:t>
             </w:r>
           </w:p>
@@ -1894,11 +1877,7 @@
           </w:tcPr>
           <w:p>
             <w:r>
-              <w:rPr>
-                <w:rFonts w:ascii="Arial" w:hAnsi="Arial"/>
-                <w:sz w:val="16"/>
-              </w:rPr>
-              <w:t>Приватная библиотека, папки, поиск, избранное, вставка на доску и назначение материалов ученикам/заданиям.</w:t>
+              <w:t>Полноценная серверная библиотека: загрузка и drag-and-drop, папки и их переименование, поиск, сортировка, избранное, массовые операции, встроенный просмотр PDF/изображений/аудио/видео, скачивание, статистика использования и повторная вставка изображений/PDF на доску.</w:t>
             </w:r>
           </w:p>
         </w:tc>
@@ -1906,11 +1885,11 @@
           <w:tcPr>
             <w:tcW w:type="dxa" w:w="1656"/>
             <w:vAlign w:val="center"/>
-            <w:shd w:fill="FFF2CC"/>
+            <w:shd w:fill="D9EAD3"/>
           </w:tcPr>
           <w:p>
             <w:r>
-              <w:t>ПОЧТИ ГОТОВО</w:t>
+              <w:t>ГОТОВО</w:t>
             </w:r>
           </w:p>
         </w:tc>
@@ -1918,15 +1897,11 @@
           <w:tcPr>
             <w:tcW w:type="dxa" w:w="936"/>
             <w:vAlign w:val="center"/>
-            <w:shd w:fill="FFF2CC"/>
+            <w:shd w:fill="D9EAD3"/>
           </w:tcPr>
           <w:p>
             <w:r>
-              <w:rPr>
-                <w:rFonts w:ascii="Arial" w:hAnsi="Arial"/>
-                <w:sz w:val="16"/>
-              </w:rPr>
-              <w:t>88%</w:t>
+              <w:t>100%</w:t>
             </w:r>
           </w:p>
         </w:tc>
@@ -1937,7 +1912,7 @@
           </w:tcPr>
           <w:p>
             <w:r>
-              <w:t>v44–v48</w:t>
+              <w:t>v44–v48 + v95</w:t>
             </w:r>
           </w:p>
         </w:tc>
@@ -4086,7 +4061,7 @@
     <w:p/>
     <w:p>
       <w:r>
-        <w:t>Текущий ближайший маршрут: библиотека материалов и редакторы → мобильная/PWA-полировка → гостевой доступ, экспорт/импорт и подготовка релиза.</w:t>
+        <w:t>Текущий ближайший маршрут: текстовый редактор → таблицы → формулы → математические инструменты. Каждый пункт закрываем полностью перед переходом к следующему.</w:t>
       </w:r>
     </w:p>
     <w:p>

</xml_diff>

<commit_message>
v96: finish editor suite
</commit_message>
<xml_diff>
--- a/OnlineRepetitor_roadmap.docx
+++ b/OnlineRepetitor_roadmap.docx
@@ -30,7 +30,7 @@
     </w:p>
     <w:p>
       <w:r>
-        <w:t>Общий прогресс дорожной карты: ≈96% · актуально после v95</w:t>
+        <w:t>Общий прогресс дорожной карты: ≈97% · актуально после v96</w:t>
       </w:r>
     </w:p>
     <w:p>
@@ -2017,15 +2017,7 @@
             <w:vAlign w:val="center"/>
           </w:tcPr>
           <w:p>
-            <w:pPr>
-              <w:spacing w:after="0" w:before="0"/>
-              <w:jc w:val="center"/>
-            </w:pPr>
             <w:r>
-              <w:rPr>
-                <w:rFonts w:ascii="Arial" w:hAnsi="Arial"/>
-                <w:sz w:val="16"/>
-              </w:rPr>
               <w:t>21</w:t>
             </w:r>
           </w:p>
@@ -2036,16 +2028,7 @@
             <w:vAlign w:val="center"/>
           </w:tcPr>
           <w:p>
-            <w:pPr>
-              <w:spacing w:after="0" w:before="0"/>
-              <w:jc w:val="left"/>
-            </w:pPr>
             <w:r>
-              <w:rPr>
-                <w:rFonts w:ascii="Arial" w:hAnsi="Arial"/>
-                <w:b/>
-                <w:sz w:val="16"/>
-              </w:rPr>
               <w:t>Текстовый редактор</w:t>
             </w:r>
           </w:p>
@@ -2057,11 +2040,7 @@
           </w:tcPr>
           <w:p>
             <w:r>
-              <w:rPr>
-                <w:rFonts w:ascii="Arial" w:hAnsi="Arial"/>
-                <w:sz w:val="16"/>
-              </w:rPr>
-              <w:t>Расширенный текстовый редактор: размер, цвет, полужирный, курсив, подчёркивание и выравнивание текста/стикеров. Далее — списки и дополнительные параметры.</w:t>
+              <w:t>Расширенный текст/стикеры: размер, цвет текста, полужирный, курсив, подчёркивание, выравнивание, маркированные и нумерованные списки, межстрочный интервал; параметры сохраняются и синхронизируются в документе доски.</w:t>
             </w:r>
           </w:p>
         </w:tc>
@@ -2069,11 +2048,11 @@
           <w:tcPr>
             <w:tcW w:type="dxa" w:w="1656"/>
             <w:vAlign w:val="center"/>
-            <w:shd w:fill="FFF2CC"/>
+            <w:shd w:fill="D9EAD3"/>
           </w:tcPr>
           <w:p>
             <w:r>
-              <w:t>ЧАСТИЧНО ГОТОВО</w:t>
+              <w:t>ГОТОВО</w:t>
             </w:r>
           </w:p>
         </w:tc>
@@ -2081,15 +2060,11 @@
           <w:tcPr>
             <w:tcW w:type="dxa" w:w="936"/>
             <w:vAlign w:val="center"/>
-            <w:shd w:fill="FFF2CC"/>
+            <w:shd w:fill="D9EAD3"/>
           </w:tcPr>
           <w:p>
             <w:r>
-              <w:rPr>
-                <w:rFonts w:ascii="Arial" w:hAnsi="Arial"/>
-                <w:sz w:val="16"/>
-              </w:rPr>
-              <w:t>65%</w:t>
+              <w:t>100%</w:t>
             </w:r>
           </w:p>
         </w:tc>
@@ -2100,11 +2075,7 @@
           </w:tcPr>
           <w:p>
             <w:r>
-              <w:rPr>
-                <w:rFonts w:ascii="Arial" w:hAnsi="Arial"/>
-                <w:sz w:val="16"/>
-              </w:rPr>
-              <w:t>v52</w:t>
+              <w:t>v52 + v96</w:t>
             </w:r>
           </w:p>
         </w:tc>
@@ -2119,15 +2090,7 @@
             <w:vAlign w:val="center"/>
           </w:tcPr>
           <w:p>
-            <w:pPr>
-              <w:spacing w:after="0" w:before="0"/>
-              <w:jc w:val="center"/>
-            </w:pPr>
             <w:r>
-              <w:rPr>
-                <w:rFonts w:ascii="Arial" w:hAnsi="Arial"/>
-                <w:sz w:val="16"/>
-              </w:rPr>
               <w:t>22</w:t>
             </w:r>
           </w:p>
@@ -2138,16 +2101,7 @@
             <w:vAlign w:val="center"/>
           </w:tcPr>
           <w:p>
-            <w:pPr>
-              <w:spacing w:after="0" w:before="0"/>
-              <w:jc w:val="left"/>
-            </w:pPr>
             <w:r>
-              <w:rPr>
-                <w:rFonts w:ascii="Arial" w:hAnsi="Arial"/>
-                <w:b/>
-                <w:sz w:val="16"/>
-              </w:rPr>
               <w:t>Таблицы</w:t>
             </w:r>
           </w:p>
@@ -2159,11 +2113,7 @@
           </w:tcPr>
           <w:p>
             <w:r>
-              <w:rPr>
-                <w:rFonts w:ascii="Arial" w:hAnsi="Arial"/>
-                <w:sz w:val="16"/>
-              </w:rPr>
-              <w:t>Расширенный редактор таблиц: заголовки, размеры, выравнивание, полосатые и компактные строки, добавление/удаление строк и столбцов.</w:t>
+              <w:t>Полный редактор таблиц: заголовки, размеры, выравнивание, полосатые/компактные строки, добавление/удаление строк и столбцов, вставка и копирование TSV для обмена с электронными таблицами.</w:t>
             </w:r>
           </w:p>
         </w:tc>
@@ -2171,11 +2121,11 @@
           <w:tcPr>
             <w:tcW w:type="dxa" w:w="1656"/>
             <w:vAlign w:val="center"/>
-            <w:shd w:fill="FFF2CC"/>
+            <w:shd w:fill="D9EAD3"/>
           </w:tcPr>
           <w:p>
             <w:r>
-              <w:t>ЧАСТИЧНО ГОТОВО</w:t>
+              <w:t>ГОТОВО</w:t>
             </w:r>
           </w:p>
         </w:tc>
@@ -2183,15 +2133,11 @@
           <w:tcPr>
             <w:tcW w:type="dxa" w:w="936"/>
             <w:vAlign w:val="center"/>
-            <w:shd w:fill="FFF2CC"/>
+            <w:shd w:fill="D9EAD3"/>
           </w:tcPr>
           <w:p>
             <w:r>
-              <w:rPr>
-                <w:rFonts w:ascii="Arial" w:hAnsi="Arial"/>
-                <w:sz w:val="16"/>
-              </w:rPr>
-              <w:t>62%</w:t>
+              <w:t>100%</w:t>
             </w:r>
           </w:p>
         </w:tc>
@@ -2202,11 +2148,7 @@
           </w:tcPr>
           <w:p>
             <w:r>
-              <w:rPr>
-                <w:rFonts w:ascii="Arial" w:hAnsi="Arial"/>
-                <w:sz w:val="16"/>
-              </w:rPr>
-              <w:t>v53</w:t>
+              <w:t>v53 + v96</w:t>
             </w:r>
           </w:p>
         </w:tc>
@@ -2221,15 +2163,7 @@
             <w:vAlign w:val="center"/>
           </w:tcPr>
           <w:p>
-            <w:pPr>
-              <w:spacing w:after="0" w:before="0"/>
-              <w:jc w:val="center"/>
-            </w:pPr>
             <w:r>
-              <w:rPr>
-                <w:rFonts w:ascii="Arial" w:hAnsi="Arial"/>
-                <w:sz w:val="16"/>
-              </w:rPr>
               <w:t>23</w:t>
             </w:r>
           </w:p>
@@ -2240,16 +2174,7 @@
             <w:vAlign w:val="center"/>
           </w:tcPr>
           <w:p>
-            <w:pPr>
-              <w:spacing w:after="0" w:before="0"/>
-              <w:jc w:val="left"/>
-            </w:pPr>
             <w:r>
-              <w:rPr>
-                <w:rFonts w:ascii="Arial" w:hAnsi="Arial"/>
-                <w:b/>
-                <w:sz w:val="16"/>
-              </w:rPr>
               <w:t>Формулы</w:t>
             </w:r>
           </w:p>
@@ -2261,11 +2186,7 @@
           </w:tcPr>
           <w:p>
             <w:r>
-              <w:rPr>
-                <w:rFonts w:ascii="Arial" w:hAnsi="Arial"/>
-                <w:sz w:val="16"/>
-              </w:rPr>
-              <w:t>Редактор формул с предпросмотром, размером и цветом, палитрами символов/функций/геометрии, модулем, биномиальным коэффициентом и историей формул.</w:t>
+              <w:t>Редактор формул с живым предпросмотром, проверкой синтаксиса, размером/цветом, палитрами символов, функций и геометрии, шаблонами, историей, копированием и вставкой записи через буфер обмена.</w:t>
             </w:r>
           </w:p>
         </w:tc>
@@ -2273,11 +2194,11 @@
           <w:tcPr>
             <w:tcW w:type="dxa" w:w="1656"/>
             <w:vAlign w:val="center"/>
-            <w:shd w:fill="FFF2CC"/>
+            <w:shd w:fill="D9EAD3"/>
           </w:tcPr>
           <w:p>
             <w:r>
-              <w:t>ЧАСТИЧНО ГОТОВО</w:t>
+              <w:t>ГОТОВО</w:t>
             </w:r>
           </w:p>
         </w:tc>
@@ -2285,15 +2206,11 @@
           <w:tcPr>
             <w:tcW w:type="dxa" w:w="936"/>
             <w:vAlign w:val="center"/>
-            <w:shd w:fill="FFF2CC"/>
+            <w:shd w:fill="D9EAD3"/>
           </w:tcPr>
           <w:p>
             <w:r>
-              <w:rPr>
-                <w:rFonts w:ascii="Arial" w:hAnsi="Arial"/>
-                <w:sz w:val="16"/>
-              </w:rPr>
-              <w:t>78%</w:t>
+              <w:t>100%</w:t>
             </w:r>
           </w:p>
         </w:tc>
@@ -2304,11 +2221,7 @@
           </w:tcPr>
           <w:p>
             <w:r>
-              <w:rPr>
-                <w:rFonts w:ascii="Arial" w:hAnsi="Arial"/>
-                <w:sz w:val="16"/>
-              </w:rPr>
-              <w:t>v54</w:t>
+              <w:t>v54 + v96</w:t>
             </w:r>
           </w:p>
         </w:tc>
@@ -2323,15 +2236,7 @@
             <w:vAlign w:val="center"/>
           </w:tcPr>
           <w:p>
-            <w:pPr>
-              <w:spacing w:after="0" w:before="0"/>
-              <w:jc w:val="center"/>
-            </w:pPr>
             <w:r>
-              <w:rPr>
-                <w:rFonts w:ascii="Arial" w:hAnsi="Arial"/>
-                <w:sz w:val="16"/>
-              </w:rPr>
               <w:t>24</w:t>
             </w:r>
           </w:p>
@@ -2342,16 +2247,7 @@
             <w:vAlign w:val="center"/>
           </w:tcPr>
           <w:p>
-            <w:pPr>
-              <w:spacing w:after="0" w:before="0"/>
-              <w:jc w:val="left"/>
-            </w:pPr>
             <w:r>
-              <w:rPr>
-                <w:rFonts w:ascii="Arial" w:hAnsi="Arial"/>
-                <w:b/>
-                <w:sz w:val="16"/>
-              </w:rPr>
               <w:t>Математические инструменты</w:t>
             </w:r>
           </w:p>
@@ -2363,7 +2259,7 @@
           </w:tcPr>
           <w:p>
             <w:r>
-              <w:t>Координатная плоскость, графики функций, точки, отрезки/прямые/лучи, углы, окружности, середины, многоугольники, длины, площадь/периметр, интерактивное перетаскивание, шаг сетки, проекции и автоподбор диапазона.</w:t>
+              <w:t>Координатная плоскость и графики функций, точки, отрезки/прямые/лучи, углы, окружности, середины и многоугольники, измерения, перетаскивание, привязка, шаг сетки, проекции, автодиапазон и копирование координат точек.</w:t>
             </w:r>
           </w:p>
         </w:tc>
@@ -2371,11 +2267,11 @@
           <w:tcPr>
             <w:tcW w:type="dxa" w:w="1656"/>
             <w:vAlign w:val="center"/>
-            <w:shd w:fill="FFF2CC"/>
+            <w:shd w:fill="D9EAD3"/>
           </w:tcPr>
           <w:p>
             <w:r>
-              <w:t>ПОЧТИ ГОТОВО</w:t>
+              <w:t>ГОТОВО</w:t>
             </w:r>
           </w:p>
         </w:tc>
@@ -2383,11 +2279,11 @@
           <w:tcPr>
             <w:tcW w:type="dxa" w:w="936"/>
             <w:vAlign w:val="center"/>
-            <w:shd w:fill="FFF2CC"/>
+            <w:shd w:fill="D9EAD3"/>
           </w:tcPr>
           <w:p>
             <w:r>
-              <w:t>90%</w:t>
+              <w:t>100%</w:t>
             </w:r>
           </w:p>
         </w:tc>
@@ -2398,7 +2294,7 @@
           </w:tcPr>
           <w:p>
             <w:r>
-              <w:t>v55–v60</w:t>
+              <w:t>v55–v60 + v96</w:t>
             </w:r>
           </w:p>
         </w:tc>
@@ -4061,7 +3957,7 @@
     <w:p/>
     <w:p>
       <w:r>
-        <w:t>Текущий ближайший маршрут: текстовый редактор → таблицы → формулы → математические инструменты. Каждый пункт закрываем полностью перед переходом к следующему.</w:t>
+        <w:t>Текущий ближайший маршрут: презентация и фреймы → фигуры и выравнивание → профиль/настройки → мобильная/PWA-полировка.</w:t>
       </w:r>
     </w:p>
     <w:p>

</xml_diff>

<commit_message>
v97: finish presentation layout and profile
</commit_message>
<xml_diff>
--- a/OnlineRepetitor_roadmap.docx
+++ b/OnlineRepetitor_roadmap.docx
@@ -30,7 +30,7 @@
     </w:p>
     <w:p>
       <w:r>
-        <w:t>Общий прогресс дорожной карты: ≈97% · актуально после v96</w:t>
+        <w:t>Общий прогресс дорожной карты: ≈98% · актуально после v97</w:t>
       </w:r>
     </w:p>
     <w:p>
@@ -1247,15 +1247,7 @@
             <w:vAlign w:val="center"/>
           </w:tcPr>
           <w:p>
-            <w:pPr>
-              <w:spacing w:after="0" w:before="0"/>
-              <w:jc w:val="center"/>
-            </w:pPr>
             <w:r>
-              <w:rPr>
-                <w:rFonts w:ascii="Arial" w:hAnsi="Arial"/>
-                <w:sz w:val="16"/>
-              </w:rPr>
               <w:t>12</w:t>
             </w:r>
           </w:p>
@@ -1266,16 +1258,7 @@
             <w:vAlign w:val="center"/>
           </w:tcPr>
           <w:p>
-            <w:pPr>
-              <w:spacing w:after="0" w:before="0"/>
-              <w:jc w:val="left"/>
-            </w:pPr>
             <w:r>
-              <w:rPr>
-                <w:rFonts w:ascii="Arial" w:hAnsi="Arial"/>
-                <w:b/>
-                <w:sz w:val="16"/>
-              </w:rPr>
               <w:t>Презентация и фреймы</w:t>
             </w:r>
           </w:p>
@@ -1286,16 +1269,8 @@
             <w:vAlign w:val="center"/>
           </w:tcPr>
           <w:p>
-            <w:pPr>
-              <w:spacing w:after="0" w:before="0"/>
-              <w:jc w:val="left"/>
-            </w:pPr>
             <w:r>
-              <w:rPr>
-                <w:rFonts w:ascii="Arial" w:hAnsi="Arial"/>
-                <w:sz w:val="16"/>
-              </w:rPr>
-              <w:t>Фреймы как слайды, последовательность показа, заметки преподавателя, полноэкранная презентация.</w:t>
+              <w:t>Фреймы с именами, заметками и порядком показа, размеры 16:9/4:3/A4, подгонка под содержимое, создание вокруг выделения, список слайдов, полноэкранная презентация, навигация с клавиатуры, таймер/обратный отсчёт, лазер, прожектор, blackout, интерактивные задания и индикатор прогресса.</w:t>
             </w:r>
           </w:p>
         </w:tc>
@@ -1303,11 +1278,11 @@
           <w:tcPr>
             <w:tcW w:type="dxa" w:w="1656"/>
             <w:vAlign w:val="center"/>
-            <w:shd w:fill="FFF2CC"/>
+            <w:shd w:fill="D9EAD3"/>
           </w:tcPr>
           <w:p>
             <w:r>
-              <w:t>ЧАСТИЧНО ГОТОВО</w:t>
+              <w:t>ГОТОВО</w:t>
             </w:r>
           </w:p>
         </w:tc>
@@ -1315,19 +1290,11 @@
           <w:tcPr>
             <w:tcW w:type="dxa" w:w="936"/>
             <w:vAlign w:val="center"/>
-            <w:shd w:fill="FFF2CC"/>
+            <w:shd w:fill="D9EAD3"/>
           </w:tcPr>
           <w:p>
-            <w:pPr>
-              <w:spacing w:after="0" w:before="0"/>
-              <w:jc w:val="center"/>
-            </w:pPr>
             <w:r>
-              <w:rPr>
-                <w:rFonts w:ascii="Arial" w:hAnsi="Arial"/>
-                <w:sz w:val="16"/>
-              </w:rPr>
-              <w:t>70%</w:t>
+              <w:t>100%</w:t>
             </w:r>
           </w:p>
         </w:tc>
@@ -1337,16 +1304,8 @@
             <w:vAlign w:val="center"/>
           </w:tcPr>
           <w:p>
-            <w:pPr>
-              <w:spacing w:after="0" w:before="0"/>
-              <w:jc w:val="center"/>
-            </w:pPr>
             <w:r>
-              <w:rPr>
-                <w:rFonts w:ascii="Arial" w:hAnsi="Arial"/>
-                <w:sz w:val="16"/>
-              </w:rPr>
-              <w:t>Уже есть база</w:t>
+              <w:t>v35–v43 + v97</w:t>
             </w:r>
           </w:p>
         </w:tc>
@@ -2309,15 +2268,7 @@
             <w:vAlign w:val="center"/>
           </w:tcPr>
           <w:p>
-            <w:pPr>
-              <w:spacing w:after="0" w:before="0"/>
-              <w:jc w:val="center"/>
-            </w:pPr>
             <w:r>
-              <w:rPr>
-                <w:rFonts w:ascii="Arial" w:hAnsi="Arial"/>
-                <w:sz w:val="16"/>
-              </w:rPr>
               <w:t>25</w:t>
             </w:r>
           </w:p>
@@ -2328,16 +2279,7 @@
             <w:vAlign w:val="center"/>
           </w:tcPr>
           <w:p>
-            <w:pPr>
-              <w:spacing w:after="0" w:before="0"/>
-              <w:jc w:val="left"/>
-            </w:pPr>
             <w:r>
-              <w:rPr>
-                <w:rFonts w:ascii="Arial" w:hAnsi="Arial"/>
-                <w:b/>
-                <w:sz w:val="16"/>
-              </w:rPr>
               <w:t>Фигуры и выравнивание</w:t>
             </w:r>
           </w:p>
@@ -2349,11 +2291,7 @@
           </w:tcPr>
           <w:p>
             <w:r>
-              <w:rPr>
-                <w:rFonts w:ascii="Arial" w:hAnsi="Arial"/>
-                <w:sz w:val="16"/>
-              </w:rPr>
-              <w:t>Фигуры, поворот, группировка, выравнивание и распределение уже работают. Дальше — геометрические и учебные фигуры.</w:t>
+              <w:t>Фигуры, поворот на 90°, привязка и направляющие, группировка, слои, выравнивание по краям/центрам, распределение по горизонтали/вертикали и выравнивание ширины, высоты или полного размера нескольких объектов.</w:t>
             </w:r>
           </w:p>
         </w:tc>
@@ -2361,11 +2299,11 @@
           <w:tcPr>
             <w:tcW w:type="dxa" w:w="1656"/>
             <w:vAlign w:val="center"/>
-            <w:shd w:fill="FFF2CC"/>
+            <w:shd w:fill="D9EAD3"/>
           </w:tcPr>
           <w:p>
             <w:r>
-              <w:t>ЧАСТИЧНО ГОТОВО</w:t>
+              <w:t>ГОТОВО</w:t>
             </w:r>
           </w:p>
         </w:tc>
@@ -2373,15 +2311,11 @@
           <w:tcPr>
             <w:tcW w:type="dxa" w:w="936"/>
             <w:vAlign w:val="center"/>
-            <w:shd w:fill="FFF2CC"/>
+            <w:shd w:fill="D9EAD3"/>
           </w:tcPr>
           <w:p>
             <w:r>
-              <w:rPr>
-                <w:rFonts w:ascii="Arial" w:hAnsi="Arial"/>
-                <w:sz w:val="16"/>
-              </w:rPr>
-              <w:t>52%</w:t>
+              <w:t>100%</w:t>
             </w:r>
           </w:p>
         </w:tc>
@@ -2392,11 +2326,7 @@
           </w:tcPr>
           <w:p>
             <w:r>
-              <w:rPr>
-                <w:rFonts w:ascii="Arial" w:hAnsi="Arial"/>
-                <w:sz w:val="16"/>
-              </w:rPr>
-              <w:t>база готова</w:t>
+              <w:t>v20–v34 + v97</w:t>
             </w:r>
           </w:p>
         </w:tc>
@@ -2685,15 +2615,7 @@
             <w:vAlign w:val="center"/>
           </w:tcPr>
           <w:p>
-            <w:pPr>
-              <w:spacing w:after="0" w:before="0"/>
-              <w:jc w:val="center"/>
-            </w:pPr>
             <w:r>
-              <w:rPr>
-                <w:rFonts w:ascii="Arial" w:hAnsi="Arial"/>
-                <w:sz w:val="16"/>
-              </w:rPr>
               <w:t>29</w:t>
             </w:r>
           </w:p>
@@ -2704,16 +2626,7 @@
             <w:vAlign w:val="center"/>
           </w:tcPr>
           <w:p>
-            <w:pPr>
-              <w:spacing w:after="0" w:before="0"/>
-              <w:jc w:val="left"/>
-            </w:pPr>
             <w:r>
-              <w:rPr>
-                <w:rFonts w:ascii="Arial" w:hAnsi="Arial"/>
-                <w:b/>
-                <w:sz w:val="16"/>
-              </w:rPr>
               <w:t>Профиль и настройки</w:t>
             </w:r>
           </w:p>
@@ -2725,11 +2638,7 @@
           </w:tcPr>
           <w:p>
             <w:r>
-              <w:rPr>
-                <w:rFonts w:ascii="Arial" w:hAnsi="Arial"/>
-                <w:sz w:val="16"/>
-              </w:rPr>
-              <w:t>Профиль, отображаемое имя, тема, компактный режим, параметры доски и персональные настройки уведомлений.</w:t>
+              <w:t>Серверный профиль: отображаемое имя, роль, тема system/light/dark, компактный интерфейс, стартовый масштаб доски, живой предпросмотр, проверка имени, индикатор несохранённых изменений и безопасный сброс настроек.</w:t>
             </w:r>
           </w:p>
         </w:tc>
@@ -2737,11 +2646,11 @@
           <w:tcPr>
             <w:tcW w:type="dxa" w:w="1656"/>
             <w:vAlign w:val="center"/>
-            <w:shd w:fill="FFF2CC"/>
+            <w:shd w:fill="D9EAD3"/>
           </w:tcPr>
           <w:p>
             <w:r>
-              <w:t>ЧАСТИЧНО ГОТОВО</w:t>
+              <w:t>ГОТОВО</w:t>
             </w:r>
           </w:p>
         </w:tc>
@@ -2749,15 +2658,11 @@
           <w:tcPr>
             <w:tcW w:type="dxa" w:w="936"/>
             <w:vAlign w:val="center"/>
-            <w:shd w:fill="FFF2CC"/>
+            <w:shd w:fill="D9EAD3"/>
           </w:tcPr>
           <w:p>
             <w:r>
-              <w:rPr>
-                <w:rFonts w:ascii="Arial" w:hAnsi="Arial"/>
-                <w:sz w:val="16"/>
-              </w:rPr>
-              <w:t>78%</w:t>
+              <w:t>100%</w:t>
             </w:r>
           </w:p>
         </w:tc>
@@ -2768,11 +2673,7 @@
           </w:tcPr>
           <w:p>
             <w:r>
-              <w:rPr>
-                <w:rFonts w:ascii="Arial" w:hAnsi="Arial"/>
-                <w:sz w:val="16"/>
-              </w:rPr>
-              <w:t>v50–v51</w:t>
+              <w:t>v51 + v81–v84 + v97</w:t>
             </w:r>
           </w:p>
         </w:tc>
@@ -3957,7 +3858,7 @@
     <w:p/>
     <w:p>
       <w:r>
-        <w:t>Текущий ближайший маршрут: презентация и фреймы → фигуры и выравнивание → профиль/настройки → мобильная/PWA-полировка.</w:t>
+        <w:t>Текущий ближайший маршрут: мобильная версия + PWA → гостевой доступ/безопасность → экспорт/импорт → финальная релизная полировка.</w:t>
       </w:r>
     </w:p>
     <w:p>

</xml_diff>

<commit_message>
v98: finish mobile and pwa
</commit_message>
<xml_diff>
--- a/OnlineRepetitor_roadmap.docx
+++ b/OnlineRepetitor_roadmap.docx
@@ -30,7 +30,7 @@
     </w:p>
     <w:p>
       <w:r>
-        <w:t>Общий прогресс дорожной карты: ≈98% · актуально после v97</w:t>
+        <w:t>Общий прогресс дорожной карты: ≈99% · актуально после v98</w:t>
       </w:r>
     </w:p>
     <w:p>
@@ -2688,15 +2688,7 @@
             <w:vAlign w:val="center"/>
           </w:tcPr>
           <w:p>
-            <w:pPr>
-              <w:spacing w:after="0" w:before="0"/>
-              <w:jc w:val="center"/>
-            </w:pPr>
             <w:r>
-              <w:rPr>
-                <w:rFonts w:ascii="Arial" w:hAnsi="Arial"/>
-                <w:sz w:val="16"/>
-              </w:rPr>
               <w:t>30</w:t>
             </w:r>
           </w:p>
@@ -2707,17 +2699,8 @@
             <w:vAlign w:val="center"/>
           </w:tcPr>
           <w:p>
-            <w:pPr>
-              <w:spacing w:after="0" w:before="0"/>
-              <w:jc w:val="left"/>
-            </w:pPr>
             <w:r>
-              <w:rPr>
-                <w:rFonts w:ascii="Arial" w:hAnsi="Arial"/>
-                <w:b/>
-                <w:sz w:val="16"/>
-              </w:rPr>
-              <w:t>Планшеты и мобильная версия</w:t>
+              <w:t>Мобильная версия</w:t>
             </w:r>
           </w:p>
         </w:tc>
@@ -2728,7 +2711,7 @@
           </w:tcPr>
           <w:p>
             <w:r>
-              <w:t>Адаптивная доска: pinch-to-zoom, touch-навигация, крупные маркеры, компактная и нижняя панели инструментов, safe-area и мобильная компоновка.</w:t>
+              <w:t>Адаптивная доска для телефона/планшета: компактная верхняя панель, отдельные быстрые инструменты, крупные touch-targets и маркеры трансформации, pinch-to-zoom, touch-панорамирование, safe-area и адаптация модальных окон/редакторов.</w:t>
             </w:r>
           </w:p>
         </w:tc>
@@ -2736,11 +2719,11 @@
           <w:tcPr>
             <w:tcW w:type="dxa" w:w="1656"/>
             <w:vAlign w:val="center"/>
-            <w:shd w:fill="FFF2CC"/>
+            <w:shd w:fill="D9EAD3"/>
           </w:tcPr>
           <w:p>
             <w:r>
-              <w:t>ЧАСТИЧНО ГОТОВО</w:t>
+              <w:t>ГОТОВО</w:t>
             </w:r>
           </w:p>
         </w:tc>
@@ -2748,11 +2731,11 @@
           <w:tcPr>
             <w:tcW w:type="dxa" w:w="936"/>
             <w:vAlign w:val="center"/>
-            <w:shd w:fill="FFF2CC"/>
+            <w:shd w:fill="D9EAD3"/>
           </w:tcPr>
           <w:p>
             <w:r>
-              <w:t>72%</w:t>
+              <w:t>100%</w:t>
             </w:r>
           </w:p>
         </w:tc>
@@ -2763,7 +2746,7 @@
           </w:tcPr>
           <w:p>
             <w:r>
-              <w:t>v61–v62</w:t>
+              <w:t>v61–v64 + v98</w:t>
             </w:r>
           </w:p>
         </w:tc>
@@ -2778,15 +2761,7 @@
             <w:vAlign w:val="center"/>
           </w:tcPr>
           <w:p>
-            <w:pPr>
-              <w:spacing w:after="0" w:before="0"/>
-              <w:jc w:val="center"/>
-            </w:pPr>
             <w:r>
-              <w:rPr>
-                <w:rFonts w:ascii="Arial" w:hAnsi="Arial"/>
-                <w:sz w:val="16"/>
-              </w:rPr>
               <w:t>31</w:t>
             </w:r>
           </w:p>
@@ -2797,16 +2772,7 @@
             <w:vAlign w:val="center"/>
           </w:tcPr>
           <w:p>
-            <w:pPr>
-              <w:spacing w:after="0" w:before="0"/>
-              <w:jc w:val="left"/>
-            </w:pPr>
             <w:r>
-              <w:rPr>
-                <w:rFonts w:ascii="Arial" w:hAnsi="Arial"/>
-                <w:b/>
-                <w:sz w:val="16"/>
-              </w:rPr>
               <w:t>PWA</w:t>
             </w:r>
           </w:p>
@@ -2818,7 +2784,7 @@
           </w:tcPr>
           <w:p>
             <w:r>
-              <w:t>PWA: manifest, service worker, standalone, app-shell/offline fallback, установка, offline-индикатор, обнаружение новой версии и управляемое обновление приложения.</w:t>
+              <w:t>Устанавливаемое веб-приложение: manifest, иконки, service worker, offline shell, обновление без застревания на старой версии, offline-индикатор, кнопка установки, standalone safe-area и быстрые действия приложения.</w:t>
             </w:r>
           </w:p>
         </w:tc>
@@ -2826,11 +2792,11 @@
           <w:tcPr>
             <w:tcW w:type="dxa" w:w="1656"/>
             <w:vAlign w:val="center"/>
-            <w:shd w:fill="FFF2CC"/>
+            <w:shd w:fill="D9EAD3"/>
           </w:tcPr>
           <w:p>
             <w:r>
-              <w:t>ЧАСТИЧНО ГОТОВО</w:t>
+              <w:t>ГОТОВО</w:t>
             </w:r>
           </w:p>
         </w:tc>
@@ -2838,11 +2804,11 @@
           <w:tcPr>
             <w:tcW w:type="dxa" w:w="936"/>
             <w:vAlign w:val="center"/>
-            <w:shd w:fill="FFF2CC"/>
+            <w:shd w:fill="D9EAD3"/>
           </w:tcPr>
           <w:p>
             <w:r>
-              <w:t>72%</w:t>
+              <w:t>100%</w:t>
             </w:r>
           </w:p>
         </w:tc>
@@ -2853,7 +2819,7 @@
           </w:tcPr>
           <w:p>
             <w:r>
-              <w:t>v62–v63</w:t>
+              <w:t>v63 + v98</w:t>
             </w:r>
           </w:p>
         </w:tc>
@@ -3858,7 +3824,7 @@
     <w:p/>
     <w:p>
       <w:r>
-        <w:t>Текущий ближайший маршрут: мобильная версия + PWA → гостевой доступ/безопасность → экспорт/импорт → финальная релизная полировка.</w:t>
+        <w:t>Текущий ближайший маршрут: гостевой доступ + безопасность → экспорт/импорт → финальная релизная полировка.</w:t>
       </w:r>
     </w:p>
     <w:p>

</xml_diff>

<commit_message>
v99: finish guest safety export import and public presentation
</commit_message>
<xml_diff>
--- a/OnlineRepetitor_roadmap.docx
+++ b/OnlineRepetitor_roadmap.docx
@@ -30,7 +30,7 @@
     </w:p>
     <w:p>
       <w:r>
-        <w:t>Общий прогресс дорожной карты: ≈99% · актуально после v98</w:t>
+        <w:t>Общий прогресс дорожной карты: ≈99% · основная релизная часть завершена после v99</w:t>
       </w:r>
     </w:p>
     <w:p>
@@ -2834,15 +2834,7 @@
             <w:vAlign w:val="center"/>
           </w:tcPr>
           <w:p>
-            <w:pPr>
-              <w:spacing w:after="0" w:before="0"/>
-              <w:jc w:val="center"/>
-            </w:pPr>
             <w:r>
-              <w:rPr>
-                <w:rFonts w:ascii="Arial" w:hAnsi="Arial"/>
-                <w:sz w:val="16"/>
-              </w:rPr>
               <w:t>32</w:t>
             </w:r>
           </w:p>
@@ -2853,16 +2845,7 @@
             <w:vAlign w:val="center"/>
           </w:tcPr>
           <w:p>
-            <w:pPr>
-              <w:spacing w:after="0" w:before="0"/>
-              <w:jc w:val="left"/>
-            </w:pPr>
             <w:r>
-              <w:rPr>
-                <w:rFonts w:ascii="Arial" w:hAnsi="Arial"/>
-                <w:b/>
-                <w:sz w:val="16"/>
-              </w:rPr>
               <w:t>Гостевой доступ</w:t>
             </w:r>
           </w:p>
@@ -2874,7 +2857,7 @@
           </w:tcPr>
           <w:p>
             <w:r>
-              <w:t>Гостевой вход без регистрации через анонимную Supabase-сессию; в v66 добавлено имя гостя, отображаемое на доске. Далее — полировка гостевого профиля и жизненного цикла.</w:t>
+              <w:t>Гостевой вход без регистрации через анонимную Supabase-сессию, имя гостя на доске, вход по обычным и защищённым ссылкам, явная индикация временной гостевой сессии и понятный жизненный цикл гостевого доступа.</w:t>
             </w:r>
           </w:p>
         </w:tc>
@@ -2882,11 +2865,11 @@
           <w:tcPr>
             <w:tcW w:type="dxa" w:w="1656"/>
             <w:vAlign w:val="center"/>
-            <w:shd w:fill="FFF2CC"/>
+            <w:shd w:fill="D9EAD3"/>
           </w:tcPr>
           <w:p>
             <w:r>
-              <w:t>ЧАСТИЧНО ГОТОВО</w:t>
+              <w:t>ГОТОВО</w:t>
             </w:r>
           </w:p>
         </w:tc>
@@ -2894,11 +2877,11 @@
           <w:tcPr>
             <w:tcW w:type="dxa" w:w="936"/>
             <w:vAlign w:val="center"/>
-            <w:shd w:fill="FFF2CC"/>
+            <w:shd w:fill="D9EAD3"/>
           </w:tcPr>
           <w:p>
             <w:r>
-              <w:t>75%</w:t>
+              <w:t>100%</w:t>
             </w:r>
           </w:p>
         </w:tc>
@@ -2909,7 +2892,7 @@
           </w:tcPr>
           <w:p>
             <w:r>
-              <w:t>v65–v67</w:t>
+              <w:t>v65–v67 + v99</w:t>
             </w:r>
           </w:p>
         </w:tc>
@@ -3014,15 +2997,7 @@
             <w:vAlign w:val="center"/>
           </w:tcPr>
           <w:p>
-            <w:pPr>
-              <w:spacing w:after="0" w:before="0"/>
-              <w:jc w:val="center"/>
-            </w:pPr>
             <w:r>
-              <w:rPr>
-                <w:rFonts w:ascii="Arial" w:hAnsi="Arial"/>
-                <w:sz w:val="16"/>
-              </w:rPr>
               <w:t>34</w:t>
             </w:r>
           </w:p>
@@ -3033,16 +3008,7 @@
             <w:vAlign w:val="center"/>
           </w:tcPr>
           <w:p>
-            <w:pPr>
-              <w:spacing w:after="0" w:before="0"/>
-              <w:jc w:val="left"/>
-            </w:pPr>
             <w:r>
-              <w:rPr>
-                <w:rFonts w:ascii="Arial" w:hAnsi="Arial"/>
-                <w:b/>
-                <w:sz w:val="16"/>
-              </w:rPr>
               <w:t>Корзина и безопасность</w:t>
             </w:r>
           </w:p>
@@ -3054,7 +3020,7 @@
           </w:tcPr>
           <w:p>
             <w:r>
-              <w:t>Корзина досок, восстановление, безопасное окончательное удаление с очисткой Storage. v80 добавляет серверную очередь 30-дневной очистки, ежедневный pg_cron, индикацию очереди и снимает лимит 1000 файлов при ручном удалении. Доски с неочищенными Storage-файлами намеренно не удаляются из БД.</w:t>
+              <w:t>Корзина досок, восстановление, 30-дневное хранение, серверная очередь автоматической очистки, безопасное окончательное удаление Storage и БД, подтверждение названием, индикация очереди и оставшегося срока хранения.</w:t>
             </w:r>
           </w:p>
         </w:tc>
@@ -3062,11 +3028,11 @@
           <w:tcPr>
             <w:tcW w:type="dxa" w:w="1656"/>
             <w:vAlign w:val="center"/>
-            <w:shd w:fill="FFF2CC"/>
+            <w:shd w:fill="D9EAD3"/>
           </w:tcPr>
           <w:p>
             <w:r>
-              <w:t>ПОЧТИ ГОТОВО</w:t>
+              <w:t>ГОТОВО</w:t>
             </w:r>
           </w:p>
         </w:tc>
@@ -3074,11 +3040,11 @@
           <w:tcPr>
             <w:tcW w:type="dxa" w:w="936"/>
             <w:vAlign w:val="center"/>
-            <w:shd w:fill="FFF2CC"/>
+            <w:shd w:fill="D9EAD3"/>
           </w:tcPr>
           <w:p>
             <w:r>
-              <w:t>97%</w:t>
+              <w:t>100%</w:t>
             </w:r>
           </w:p>
         </w:tc>
@@ -3089,7 +3055,7 @@
           </w:tcPr>
           <w:p>
             <w:r>
-              <w:t>v69–v71 + v80</w:t>
+              <w:t>v69–v71 + v80 + v99</w:t>
             </w:r>
           </w:p>
         </w:tc>
@@ -3104,15 +3070,7 @@
             <w:vAlign w:val="center"/>
           </w:tcPr>
           <w:p>
-            <w:pPr>
-              <w:spacing w:after="0" w:before="0"/>
-              <w:jc w:val="center"/>
-            </w:pPr>
             <w:r>
-              <w:rPr>
-                <w:rFonts w:ascii="Arial" w:hAnsi="Arial"/>
-                <w:sz w:val="16"/>
-              </w:rPr>
               <w:t>35</w:t>
             </w:r>
           </w:p>
@@ -3123,16 +3081,7 @@
             <w:vAlign w:val="center"/>
           </w:tcPr>
           <w:p>
-            <w:pPr>
-              <w:spacing w:after="0" w:before="0"/>
-              <w:jc w:val="left"/>
-            </w:pPr>
             <w:r>
-              <w:rPr>
-                <w:rFonts w:ascii="Arial" w:hAnsi="Arial"/>
-                <w:b/>
-                <w:sz w:val="16"/>
-              </w:rPr>
               <w:t>Экспорт</w:t>
             </w:r>
           </w:p>
@@ -3144,7 +3093,7 @@
           </w:tcPr>
           <w:p>
             <w:r>
-              <w:t>PNG-экспорт, переносимая копия одной доски .orboard с вложениями и полная копия рабочего пространства .orworkspace. PDF-экспорт остаётся дальнейшим улучшением.</w:t>
+              <w:t>PNG-экспорт всей доски/выделения/фрейма, каноническая переносимая копия одной доски .orboard v2 с вложениями и полная копия рабочего пространства .orworkspace.</w:t>
             </w:r>
           </w:p>
         </w:tc>
@@ -3152,11 +3101,11 @@
           <w:tcPr>
             <w:tcW w:type="dxa" w:w="1656"/>
             <w:vAlign w:val="center"/>
-            <w:shd w:fill="FFF2CC"/>
+            <w:shd w:fill="D9EAD3"/>
           </w:tcPr>
           <w:p>
             <w:r>
-              <w:t>ПОЧТИ ГОТОВО</w:t>
+              <w:t>ГОТОВО</w:t>
             </w:r>
           </w:p>
         </w:tc>
@@ -3164,11 +3113,11 @@
           <w:tcPr>
             <w:tcW w:type="dxa" w:w="936"/>
             <w:vAlign w:val="center"/>
-            <w:shd w:fill="FFF2CC"/>
+            <w:shd w:fill="D9EAD3"/>
           </w:tcPr>
           <w:p>
             <w:r>
-              <w:t>85%</w:t>
+              <w:t>100%</w:t>
             </w:r>
           </w:p>
         </w:tc>
@@ -3179,7 +3128,7 @@
           </w:tcPr>
           <w:p>
             <w:r>
-              <w:t>v72–v74</w:t>
+              <w:t>v72–v74 + v99</w:t>
             </w:r>
           </w:p>
         </w:tc>
@@ -3194,15 +3143,7 @@
             <w:vAlign w:val="center"/>
           </w:tcPr>
           <w:p>
-            <w:pPr>
-              <w:spacing w:after="0" w:before="0"/>
-              <w:jc w:val="center"/>
-            </w:pPr>
             <w:r>
-              <w:rPr>
-                <w:rFonts w:ascii="Arial" w:hAnsi="Arial"/>
-                <w:sz w:val="16"/>
-              </w:rPr>
               <w:t>36</w:t>
             </w:r>
           </w:p>
@@ -3213,16 +3154,7 @@
             <w:vAlign w:val="center"/>
           </w:tcPr>
           <w:p>
-            <w:pPr>
-              <w:spacing w:after="0" w:before="0"/>
-              <w:jc w:val="left"/>
-            </w:pPr>
             <w:r>
-              <w:rPr>
-                <w:rFonts w:ascii="Arial" w:hAnsi="Arial"/>
-                <w:b/>
-                <w:sz w:val="16"/>
-              </w:rPr>
               <w:t>Импорт</w:t>
             </w:r>
           </w:p>
@@ -3234,7 +3166,7 @@
           </w:tcPr>
           <w:p>
             <w:r>
-              <w:t>Импорт PDF и изображений, восстановление .orboard как новой доски и полного набора .orworkspace с переносом вложений и новыми идентификаторами. PowerPoint остаётся дополнительным форматом.</w:t>
+              <w:t>Импорт PDF и изображений, проверяемый .orboard v2, совместимость со старым bundle/JSON, восстановление доски как новой и полного .orworkspace с переносом вложений и новыми идентификаторами.</w:t>
             </w:r>
           </w:p>
         </w:tc>
@@ -3242,11 +3174,11 @@
           <w:tcPr>
             <w:tcW w:type="dxa" w:w="1656"/>
             <w:vAlign w:val="center"/>
-            <w:shd w:fill="FFF2CC"/>
+            <w:shd w:fill="D9EAD3"/>
           </w:tcPr>
           <w:p>
             <w:r>
-              <w:t>ПОЧТИ ГОТОВО</w:t>
+              <w:t>ГОТОВО</w:t>
             </w:r>
           </w:p>
         </w:tc>
@@ -3254,11 +3186,11 @@
           <w:tcPr>
             <w:tcW w:type="dxa" w:w="936"/>
             <w:vAlign w:val="center"/>
-            <w:shd w:fill="FFF2CC"/>
+            <w:shd w:fill="D9EAD3"/>
           </w:tcPr>
           <w:p>
             <w:r>
-              <w:t>88%</w:t>
+              <w:t>100%</w:t>
             </w:r>
           </w:p>
         </w:tc>
@@ -3269,7 +3201,7 @@
           </w:tcPr>
           <w:p>
             <w:r>
-              <w:t>v72–v74</w:t>
+              <w:t>v72–v74 + v99</w:t>
             </w:r>
           </w:p>
         </w:tc>
@@ -3284,15 +3216,7 @@
             <w:vAlign w:val="center"/>
           </w:tcPr>
           <w:p>
-            <w:pPr>
-              <w:spacing w:after="0" w:before="0"/>
-              <w:jc w:val="center"/>
-            </w:pPr>
             <w:r>
-              <w:rPr>
-                <w:rFonts w:ascii="Arial" w:hAnsi="Arial"/>
-                <w:sz w:val="16"/>
-              </w:rPr>
               <w:t>37</w:t>
             </w:r>
           </w:p>
@@ -3303,16 +3227,7 @@
             <w:vAlign w:val="center"/>
           </w:tcPr>
           <w:p>
-            <w:pPr>
-              <w:spacing w:after="0" w:before="0"/>
-              <w:jc w:val="left"/>
-            </w:pPr>
             <w:r>
-              <w:rPr>
-                <w:rFonts w:ascii="Arial" w:hAnsi="Arial"/>
-                <w:b/>
-                <w:sz w:val="16"/>
-              </w:rPr>
               <w:t>Публичная презентация</w:t>
             </w:r>
           </w:p>
@@ -3324,7 +3239,7 @@
           </w:tcPr>
           <w:p>
             <w:r>
-              <w:t>Отдельная viewer-ссылка-презентация, сохранение режима через гостевой/парольный вход, автоматический старт первого фрейма, чистый интерфейс зрителя, навигация по слайдам и fullscreen без преподавательских инструментов.</w:t>
+              <w:t>Отдельная viewer-ссылка-презентация, гостевой/парольный вход, автоматический старт показа, чистый интерфейс зрителя, навигация по слайдам, fullscreen и ненавязчивая подсказка управления.</w:t>
             </w:r>
           </w:p>
         </w:tc>
@@ -3332,11 +3247,11 @@
           <w:tcPr>
             <w:tcW w:type="dxa" w:w="1656"/>
             <w:vAlign w:val="center"/>
-            <w:shd w:fill="FFF2CC"/>
+            <w:shd w:fill="D9EAD3"/>
           </w:tcPr>
           <w:p>
             <w:r>
-              <w:t>ПОЧТИ ГОТОВО</w:t>
+              <w:t>ГОТОВО</w:t>
             </w:r>
           </w:p>
         </w:tc>
@@ -3344,11 +3259,11 @@
           <w:tcPr>
             <w:tcW w:type="dxa" w:w="936"/>
             <w:vAlign w:val="center"/>
-            <w:shd w:fill="FFF2CC"/>
+            <w:shd w:fill="D9EAD3"/>
           </w:tcPr>
           <w:p>
             <w:r>
-              <w:t>95%</w:t>
+              <w:t>100%</w:t>
             </w:r>
           </w:p>
         </w:tc>
@@ -3359,7 +3274,7 @@
           </w:tcPr>
           <w:p>
             <w:r>
-              <w:t>v77–v78</w:t>
+              <w:t>v77–v78 + v99</w:t>
             </w:r>
           </w:p>
         </w:tc>
@@ -3824,7 +3739,7 @@
     <w:p/>
     <w:p>
       <w:r>
-        <w:t>Текущий ближайший маршрут: гостевой доступ + безопасность → экспорт/импорт → финальная релизная полировка.</w:t>
+        <w:t>Текущий ближайший маршрут: финальный аудит оставшихся незавершённых пунктов → релизная полировка → отдельные поздние модули (чат, видеозвонки, платежи, AI).</w:t>
       </w:r>
     </w:p>
     <w:p>

</xml_diff>

<commit_message>
v100: compact board interface redesign
</commit_message>
<xml_diff>
--- a/OnlineRepetitor_roadmap.docx
+++ b/OnlineRepetitor_roadmap.docx
@@ -30,7 +30,7 @@
     </w:p>
     <w:p>
       <w:r>
-        <w:t>Общий прогресс дорожной карты: ≈99% · основная релизная часть завершена после v99</w:t>
+        <w:t>Общий прогресс дорожной карты: ≈99% · v100 — первый этап визуального редизайна интерфейса</w:t>
       </w:r>
     </w:p>
     <w:p>
@@ -3739,7 +3739,7 @@
     <w:p/>
     <w:p>
       <w:r>
-        <w:t>Текущий ближайший маршрут: финальный аудит оставшихся незавершённых пунктов → релизная полировка → отдельные поздние модули (чат, видеозвонки, платежи, AI).</w:t>
+        <w:t>Текущий ближайший маршрут: визуальная система и компактность интерфейса → унификация окон и панелей → финальный UX-аудит.</w:t>
       </w:r>
     </w:p>
     <w:p>
@@ -3748,6 +3748,11 @@
           <w:sz w:val="18"/>
         </w:rPr>
         <w:t>Правило ведения документа: дорожная карта обновляется после каждого патча вместе с общим прогрессом, статусами и ближайшим маршрутом.</w:t>
+      </w:r>
+    </w:p>
+    <w:p>
+      <w:r>
+        <w:t>v100 · Визуальный редизайн: верхняя панель разгружена, вторичные действия собраны в компактное меню, панель инструментов и всплывающие окна получили единую более лёгкую визуальную систему.</w:t>
       </w:r>
     </w:p>
     <w:sectPr>

</xml_diff>

<commit_message>
v101: improve board clarity and tool panel
</commit_message>
<xml_diff>
--- a/OnlineRepetitor_roadmap.docx
+++ b/OnlineRepetitor_roadmap.docx
@@ -30,7 +30,7 @@
     </w:p>
     <w:p>
       <w:r>
-        <w:t>Общий прогресс дорожной карты: ≈99% · v100 — первый этап визуального редизайна интерфейса</w:t>
+        <w:t>Общий прогресс дорожной карты: ≈99% · v101 — UX-полировка доски и инструментов</w:t>
       </w:r>
     </w:p>
     <w:p>
@@ -3739,7 +3739,7 @@
     <w:p/>
     <w:p>
       <w:r>
-        <w:t>Текущий ближайший маршрут: визуальная система и компактность интерфейса → унификация окон и панелей → финальный UX-аудит.</w:t>
+        <w:t>Текущий ближайший маршрут: унификация панелей свойств и меню → финальный визуальный UX-аудит → релизная полировка.</w:t>
       </w:r>
     </w:p>
     <w:p>
@@ -3753,6 +3753,11 @@
     <w:p>
       <w:r>
         <w:t>v100 · Визуальный редизайн: верхняя панель разгружена, вторичные действия собраны в компактное меню, панель инструментов и всплывающие окна получили единую более лёгкую визуальную систему.</w:t>
+      </w:r>
+    </w:p>
+    <w:p>
+      <w:r>
+        <w:t>v101 · UX доски: исправлена визуальная иерархия после v100, введена единая типографика, основная панель инструментов получила подписи и режим «Ещё инструменты», а пустая доска — понятный стартовый экран с быстрыми действиями.</w:t>
       </w:r>
     </w:p>
     <w:sectPr>

</xml_diff>

<commit_message>
v102: fix toolbar layout and pin navigation tools
</commit_message>
<xml_diff>
--- a/OnlineRepetitor_roadmap.docx
+++ b/OnlineRepetitor_roadmap.docx
@@ -30,7 +30,7 @@
     </w:p>
     <w:p>
       <w:r>
-        <w:t>Общий прогресс дорожной карты: ≈99% · v101 — UX-полировка доски и инструментов</w:t>
+        <w:t>Общий прогресс дорожной карты: ≈99% · v102 — исправление компоновки панели инструментов</w:t>
       </w:r>
     </w:p>
     <w:p>
@@ -3739,7 +3739,7 @@
     <w:p/>
     <w:p>
       <w:r>
-        <w:t>Текущий ближайший маршрут: унификация панелей свойств и меню → финальный визуальный UX-аудит → релизная полировка.</w:t>
+        <w:t>Текущий ближайший маршрут: контекстные панели свойств → унификация меню → финальный визуальный UX-аудит.</w:t>
       </w:r>
     </w:p>
     <w:p>
@@ -3758,6 +3758,11 @@
     <w:p>
       <w:r>
         <w:t>v101 · UX доски: исправлена визуальная иерархия после v100, введена единая типографика, основная панель инструментов получила подписи и режим «Ещё инструменты», а пустая доска — понятный стартовый экран с быстрыми действиями.</w:t>
+      </w:r>
+    </w:p>
+    <w:p>
+      <w:r>
+        <w:t>v102 · Панель инструментов: панель ограничена высотой рабочего окна и прокручивается внутри; «Выбрать» и «Двигать» вынесены в отдельный постоянный блок и не исчезают при прокрутке списка.</w:t>
       </w:r>
     </w:p>
     <w:sectPr>

</xml_diff>

<commit_message>
v103: restore compact floating toolbar
</commit_message>
<xml_diff>
--- a/OnlineRepetitor_roadmap.docx
+++ b/OnlineRepetitor_roadmap.docx
@@ -30,7 +30,7 @@
     </w:p>
     <w:p>
       <w:r>
-        <w:t>Общий прогресс дорожной карты: ≈99% · v102 — исправление компоновки панели инструментов</w:t>
+        <w:t>Общий прогресс дорожной карты: ≈99% · v103 — исправление неудачной компоновки панели v102</w:t>
       </w:r>
     </w:p>
     <w:p>
@@ -3739,7 +3739,7 @@
     <w:p/>
     <w:p>
       <w:r>
-        <w:t>Текущий ближайший маршрут: контекстные панели свойств → унификация меню → финальный визуальный UX-аудит.</w:t>
+        <w:t>Текущий ближайший маршрут: аккуратная визуальная полировка без увеличения занимаемой рабочей области.</w:t>
       </w:r>
     </w:p>
     <w:p>
@@ -3763,6 +3763,11 @@
     <w:p>
       <w:r>
         <w:t>v102 · Панель инструментов: панель ограничена высотой рабочего окна и прокручивается внутри; «Выбрать» и «Двигать» вынесены в отдельный постоянный блок и не исчезают при прокрутке списка.</w:t>
+      </w:r>
+    </w:p>
+    <w:p>
+      <w:r>
+        <w:t>v103 · Панель инструментов возвращена к компактной плавающей колонке. «Выбрать» и «Двигать» закреплены сверху, основные инструменты показаны иконками, дополнительные раскрываются отдельно. Панель больше не занимает широкую полосу рабочего пространства.</w:t>
       </w:r>
     </w:p>
     <w:sectPr>

</xml_diff>

<commit_message>
v104: fix toolbar clipping root cause
</commit_message>
<xml_diff>
--- a/OnlineRepetitor_roadmap.docx
+++ b/OnlineRepetitor_roadmap.docx
@@ -30,7 +30,7 @@
     </w:p>
     <w:p>
       <w:r>
-        <w:t>Общий прогресс дорожной карты: ≈99% · v103 — исправление неудачной компоновки панели v102</w:t>
+        <w:t>Общий прогресс дорожной карты: ≈99% · v104 — исправлено обрезание панели инструментов</w:t>
       </w:r>
     </w:p>
     <w:p>
@@ -3739,7 +3739,7 @@
     <w:p/>
     <w:p>
       <w:r>
-        <w:t>Текущий ближайший маршрут: аккуратная визуальная полировка без увеличения занимаемой рабочей области.</w:t>
+        <w:t>Текущий ближайший маршрут: стабилизация компактного интерфейса → контекстные панели свойств → финальный UX-аудит.</w:t>
       </w:r>
     </w:p>
     <w:p>
@@ -3768,6 +3768,11 @@
     <w:p>
       <w:r>
         <w:t>v103 · Панель инструментов возвращена к компактной плавающей колонке. «Выбрать» и «Двигать» закреплены сверху, основные инструменты показаны иконками, дополнительные раскрываются отдельно. Панель больше не занимает широкую полосу рабочего пространства.</w:t>
+      </w:r>
+    </w:p>
+    <w:p>
+      <w:r>
+        <w:t>v104 · Исправлена первопричина выхода панели за верхнюю границу: старое transform: translateY(-50%) продолжало сдвигать панель вверх после редизайна. На desktop трансформация сброшена; панель позиционируется относительно рабочей области с безопасным отступом.</w:t>
       </w:r>
     </w:p>
     <w:sectPr>

</xml_diff>

<commit_message>
v105: improve typography and landscape mobile
</commit_message>
<xml_diff>
--- a/OnlineRepetitor_roadmap.docx
+++ b/OnlineRepetitor_roadmap.docx
@@ -30,7 +30,7 @@
     </w:p>
     <w:p>
       <w:r>
-        <w:t>Общий прогресс дорожной карты: ≈99% · v104 — исправлено обрезание панели инструментов</w:t>
+        <w:t>Общий прогресс дорожной карты: ≈99% · v105 — читаемость интерфейса и альбомный мобильный режим</w:t>
       </w:r>
     </w:p>
     <w:p>
@@ -3739,7 +3739,7 @@
     <w:p/>
     <w:p>
       <w:r>
-        <w:t>Текущий ближайший маршрут: стабилизация компактного интерфейса → контекстные панели свойств → финальный UX-аудит.</w:t>
+        <w:t>Текущий ближайший маршрут: контекстные панели свойств → унификация меню → финальный визуальный UX-аудит.</w:t>
       </w:r>
     </w:p>
     <w:p>
@@ -3773,6 +3773,11 @@
     <w:p>
       <w:r>
         <w:t>v104 · Исправлена первопричина выхода панели за верхнюю границу: старое transform: translateY(-50%) продолжало сдвигать панель вверх после редизайна. На desktop трансформация сброшена; панель позиционируется относительно рабочей области с безопасным отступом.</w:t>
+      </w:r>
+    </w:p>
+    <w:p>
+      <w:r>
+        <w:t>v105 · Типографика и телефон: увеличены мелкие подписи верхней панели, меню, подсказок, окон и элементов управления. Установленная PWA закреплена в альбомной ориентации; мобильная доска получила отдельную landscape-компоновку, а в портретном браузерном режиме показывается просьба повернуть телефон.</w:t>
       </w:r>
     </w:p>
     <w:sectPr>

</xml_diff>

<commit_message>
v106: polish responsive UI and mobile dashboard
</commit_message>
<xml_diff>
--- a/OnlineRepetitor_roadmap.docx
+++ b/OnlineRepetitor_roadmap.docx
@@ -30,7 +30,7 @@
     </w:p>
     <w:p>
       <w:r>
-        <w:t>Общий прогресс дорожной карты: ≈99% · v105 — читаемость интерфейса и альбомный мобильный режим</w:t>
+        <w:t>Общий прогресс дорожной карты: ≈99% · v106 — адаптивная читаемость, мобильное меню и стилизация списков</w:t>
       </w:r>
     </w:p>
     <w:p>
@@ -3739,7 +3739,7 @@
     <w:p/>
     <w:p>
       <w:r>
-        <w:t>Текущий ближайший маршрут: контекстные панели свойств → унификация меню → финальный визуальный UX-аудит.</w:t>
+        <w:t>Текущий ближайший маршрут: контекстные панели свойств → унификация окон и меню → финальный визуальный UX-аудит.</w:t>
       </w:r>
     </w:p>
     <w:p>
@@ -3778,6 +3778,11 @@
     <w:p>
       <w:r>
         <w:t>v105 · Типографика и телефон: увеличены мелкие подписи верхней панели, меню, подсказок, окон и элементов управления. Установленная PWA закреплена в альбомной ориентации; мобильная доска получила отдельную landscape-компоновку, а в портретном браузерном режиме показывается просьба повернуть телефон.</w:t>
+      </w:r>
+    </w:p>
+    <w:p>
+      <w:r>
+        <w:t>v106 · UX-полировка: убран блокирующий экран с просьбой повернуть телефон; PWA остаётся ориентирована на landscape, но браузерная версия работает в любой ориентации. Главное мобильное меню стало компактнее, навигация — горизонтальной, карточки и фильтры адаптивными. Выпадающие списки получили спокойный серый фон и мягкие состояния. Для интерфейсного текста добавлены переносы и увеличены безопасные области, чтобы подписи не обрезались.</w:t>
       </w:r>
     </w:p>
     <w:sectPr>

</xml_diff>

<commit_message>
v107: fix topbar and mobile landscape orientation
</commit_message>
<xml_diff>
--- a/OnlineRepetitor_roadmap.docx
+++ b/OnlineRepetitor_roadmap.docx
@@ -30,7 +30,7 @@
     </w:p>
     <w:p>
       <w:r>
-        <w:t>Общий прогресс дорожной карты: ≈99% · v106 — адаптивная читаемость, мобильное меню и стилизация списков</w:t>
+        <w:t>Общий прогресс дорожной карты: ≈99% · v107 — верхняя панель и автоматическая landscape-ориентация</w:t>
       </w:r>
     </w:p>
     <w:p>
@@ -3739,7 +3739,7 @@
     <w:p/>
     <w:p>
       <w:r>
-        <w:t>Текущий ближайший маршрут: контекстные панели свойств → унификация окон и меню → финальный визуальный UX-аудит.</w:t>
+        <w:t>Текущий ближайший маршрут: мобильный UX → контекстные панели → финальный визуальный аудит.</w:t>
       </w:r>
     </w:p>
     <w:p>
@@ -3783,6 +3783,11 @@
     <w:p>
       <w:r>
         <w:t>v106 · UX-полировка: убран блокирующий экран с просьбой повернуть телефон; PWA остаётся ориентирована на landscape, но браузерная версия работает в любой ориентации. Главное мобильное меню стало компактнее, навигация — горизонтальной, карточки и фильтры адаптивными. Выпадающие списки получили спокойный серый фон и мягкие состояния. Для интерфейсного текста добавлены переносы и увеличены безопасные области, чтобы подписи не обрезались.</w:t>
+      </w:r>
+    </w:p>
+    <w:p>
+      <w:r>
+        <w:t>v107 · Верхняя панель: убран отдельный логотип «B», кнопка «Доски» расширена и стала самостоятельной точкой возврата. Статусы сохранения и сети получили собственное пространство и больше не должны обрезаться. На мобильных устройствах при открытии доски приложение запрашивает landscape orientation; в установленной PWA блокировка выполняется сразу, в браузере повторяется после первого касания, когда API требует пользовательский жест.</w:t>
       </w:r>
     </w:p>
     <w:sectPr>

</xml_diff>

<commit_message>
v108: compact mobile settings and move account actions
</commit_message>
<xml_diff>
--- a/OnlineRepetitor_roadmap.docx
+++ b/OnlineRepetitor_roadmap.docx
@@ -30,7 +30,7 @@
     </w:p>
     <w:p>
       <w:r>
-        <w:t>Общий прогресс дорожной карты: ≈99% · v107 — верхняя панель и автоматическая landscape-ориентация</w:t>
+        <w:t>Общий прогресс дорожной карты: ≈99% · v108 — компактные мобильные настройки и установка PWA</w:t>
       </w:r>
     </w:p>
     <w:p>
@@ -3790,6 +3790,11 @@
         <w:t>v107 · Верхняя панель: убран отдельный логотип «B», кнопка «Доски» расширена и стала самостоятельной точкой возврата. Статусы сохранения и сети получили собственное пространство и больше не должны обрезаться. На мобильных устройствах при открытии доски приложение запрашивает landscape orientation; в установленной PWA блокировка выполняется сразу, в браузере повторяется после первого касания, когда API требует пользовательский жест.</w:t>
       </w:r>
     </w:p>
+    <w:p>
+      <w:r>
+        <w:t>v108 · Настройки: экран профиля больше не показывает навигационные вкладки главной страницы. Выход из аккаунта перенесён из главного меню в раздел «Приложение» настроек. Там же появилась кнопка установки PWA, когда браузер предоставляет системный install prompt. Мобильные настройки уплотнены; в landscape карточки раскладываются в две колонки.</w:t>
+      </w:r>
+    </w:p>
     <w:sectPr>
       <w:headerReference w:type="default" r:id="rId9"/>
       <w:pgSz w:w="15840" w:h="12240" w:orient="landscape"/>

</xml_diff>

<commit_message>
v109: redesign compact mobile dashboard navigation
</commit_message>
<xml_diff>
--- a/OnlineRepetitor_roadmap.docx
+++ b/OnlineRepetitor_roadmap.docx
@@ -30,7 +30,7 @@
     </w:p>
     <w:p>
       <w:r>
-        <w:t>Общий прогресс дорожной карты: ≈99% · v108 — компактные мобильные настройки и установка PWA</w:t>
+        <w:t>Общий прогресс дорожной карты: ≈99% · v109 — компактное мобильное главное меню</w:t>
       </w:r>
     </w:p>
     <w:p>
@@ -3795,6 +3795,11 @@
         <w:t>v108 · Настройки: экран профиля больше не показывает навигационные вкладки главной страницы. Выход из аккаунта перенесён из главного меню в раздел «Приложение» настроек. Там же появилась кнопка установки PWA, когда браузер предоставляет системный install prompt. Мобильные настройки уплотнены; в landscape карточки раскладываются в две колонки.</w:t>
       </w:r>
     </w:p>
+    <w:p>
+      <w:r>
+        <w:t>v109 · Главное меню на телефоне: длинная полоса разделов заменена компактной раскрывающейся кнопкой «Разделы». Внутри — сетка переходов по кабинету и настройкам. Мобильная шапка упрощена, логотип OR скрыт, настройки представлены одной иконкой. Поиск, фильтры, действия и карточки досок уплотнены; landscape-режим использует более плотную трёхколоночную сетку.</w:t>
+      </w:r>
+    </w:p>
     <w:sectPr>
       <w:headerReference w:type="default" r:id="rId9"/>
       <w:pgSz w:w="15840" w:h="12240" w:orient="landscape"/>

</xml_diff>

<commit_message>
v110: remove browser fullscreen notification trigger
</commit_message>
<xml_diff>
--- a/OnlineRepetitor_roadmap.docx
+++ b/OnlineRepetitor_roadmap.docx
@@ -30,7 +30,7 @@
     </w:p>
     <w:p>
       <w:r>
-        <w:t>Общий прогресс дорожной карты: ≈99% · v109 — компактное мобильное главное меню</w:t>
+        <w:t>Общий прогресс дорожной карты: ≈99% · v110 — убран принудительный browser fullscreen</w:t>
       </w:r>
     </w:p>
     <w:p>
@@ -3800,6 +3800,11 @@
         <w:t>v109 · Главное меню на телефоне: длинная полоса разделов заменена компактной раскрывающейся кнопкой «Разделы». Внутри — сетка переходов по кабинету и настройкам. Мобильная шапка упрощена, логотип OR скрыт, настройки представлены одной иконкой. Поиск, фильтры, действия и карточки досок уплотнены; landscape-режим использует более плотную трёхколоночную сетку.</w:t>
       </w:r>
     </w:p>
+    <w:p>
+      <w:r>
+        <w:t>v110 · Мобильный режим: удалён автоматический переход обычной вкладки Chrome в Fullscreen, который на Android создавал системное уведомление OnlineRepetitor с предложением скопировать URL/открыть страницу в Chrome. Landscape-lock теперь запрашивается только в установленной PWA; manifest сохраняет orientation=landscape. Обычная вкладка браузера больше не переводится приложением в app-like fullscreen.</w:t>
+      </w:r>
+    </w:p>
     <w:sectPr>
       <w:headerReference w:type="default" r:id="rId9"/>
       <w:pgSz w:w="15840" w:h="12240" w:orient="landscape"/>

</xml_diff>

<commit_message>
v111: complete mobile and tablet responsive interface
</commit_message>
<xml_diff>
--- a/OnlineRepetitor_roadmap.docx
+++ b/OnlineRepetitor_roadmap.docx
@@ -30,7 +30,7 @@
     </w:p>
     <w:p>
       <w:r>
-        <w:t>Общий прогресс дорожной карты: ≈99% · v110 — убран принудительный browser fullscreen</w:t>
+        <w:t>Общий прогресс дорожной карты: ≈99% · v111 — завершение адаптивного интерфейса телефона и планшета</w:t>
       </w:r>
     </w:p>
     <w:p>
@@ -3739,7 +3739,7 @@
     <w:p/>
     <w:p>
       <w:r>
-        <w:t>Текущий ближайший маршрут: мобильный UX → контекстные панели → финальный визуальный аудит.</w:t>
+        <w:t>Текущий ближайший маршрут: финальный визуальный UX-аудит → полировка контекстных редакторов → релизная стабилизация.</w:t>
       </w:r>
     </w:p>
     <w:p>
@@ -3803,6 +3803,11 @@
     <w:p>
       <w:r>
         <w:t>v110 · Мобильный режим: удалён автоматический переход обычной вкладки Chrome в Fullscreen, который на Android создавал системное уведомление OnlineRepetitor с предложением скопировать URL/открыть страницу в Chrome. Landscape-lock теперь запрашивается только в установленной PWA; manifest сохраняет orientation=landscape. Обычная вкладка браузера больше не переводится приложением в app-like fullscreen.</w:t>
+      </w:r>
+    </w:p>
+    <w:p>
+      <w:r>
+        <w:t>v111 · Комплексный mobile/tablet UX: введены отдельные адаптивные режимы для телефона, компактного и большого планшета. На доске переработаны верхняя панель, нижний док быстрых инструментов, раскрываемая полная палитра, масштаб, настройки пера/ластика/связей/фигур, touch-маркеры выделения, всплывающие окна и safe-area. На планшетах сохранена вертикальная панель инструментов, но увеличены touch-targets и освобождена рабочая область. Кабинетные экраны, материалы, расписание, уведомления, профиль и карточные сетки получили согласованные мобильные и планшетные раскладки.</w:t>
       </w:r>
     </w:p>
     <w:sectPr>

</xml_diff>

<commit_message>
v112: add complete tester guide and QA checklist
</commit_message>
<xml_diff>
--- a/OnlineRepetitor_roadmap.docx
+++ b/OnlineRepetitor_roadmap.docx
@@ -30,7 +30,7 @@
     </w:p>
     <w:p>
       <w:r>
-        <w:t>Общий прогресс дорожной карты: ≈99% · v111 — завершение адаптивного интерфейса телефона и планшета</w:t>
+        <w:t>Общий прогресс дорожной карты: ≈99% · v112 — встроенная полная инструкция и QA-чек-лист</w:t>
       </w:r>
     </w:p>
     <w:p>
@@ -3739,7 +3739,7 @@
     <w:p/>
     <w:p>
       <w:r>
-        <w:t>Текущий ближайший маршрут: финальный визуальный UX-аудит → полировка контекстных редакторов → релизная стабилизация.</w:t>
+        <w:t>Текущий ближайший маршрут: полный тестовый прогон по встроенной инструкции → исправление найденных дефектов → релизная стабилизация.</w:t>
       </w:r>
     </w:p>
     <w:p>
@@ -3808,6 +3808,11 @@
     <w:p>
       <w:r>
         <w:t>v111 · Комплексный mobile/tablet UX: введены отдельные адаптивные режимы для телефона, компактного и большого планшета. На доске переработаны верхняя панель, нижний док быстрых инструментов, раскрываемая полная палитра, масштаб, настройки пера/ластика/связей/фигур, touch-маркеры выделения, всплывающие окна и safe-area. На планшетах сохранена вертикальная панель инструментов, но увеличены touch-targets и освобождена рабочая область. Кабинетные экраны, материалы, расписание, уведомления, профиль и карточные сетки получили согласованные мобильные и планшетные раскладки.</w:t>
+      </w:r>
+    </w:p>
+    <w:p>
+      <w:r>
+        <w:t>v112 · В приложение добавлен отдельный раздел «🧪 Инструкция тестировщика». Он содержит полный пошаговый QA-прогон: авторизация и роли, кабинет и жизненный цикл досок, все инструменты доски с обозначениями и горячими клавишами, редактирование объектов, совместная работа, Live Lesson и презентация, ученики/задания/прогресс, расписание, материалы и шаблоны, уведомления, профиль, PWA, offline/reconnect, телефон, планшет и viewer-доступ. Для каждого теста указаны шаги и ожидаемый результат; есть поиск, фильтр по ролям, режим «только непроверенные», раскрытие разделов и локально сохраняемый прогресс.</w:t>
       </w:r>
     </w:p>
     <w:sectPr>

</xml_diff>

<commit_message>
v113: redesign board invitation and share links
</commit_message>
<xml_diff>
--- a/OnlineRepetitor_roadmap.docx
+++ b/OnlineRepetitor_roadmap.docx
@@ -30,7 +30,7 @@
     </w:p>
     <w:p>
       <w:r>
-        <w:t>Общий прогресс дорожной карты: ≈99% · v112 — встроенная полная инструкция и QA-чек-лист</w:t>
+        <w:t>Общий прогресс дорожной карты: ≈99% · v113 — обновлённый интерфейс приглашений</w:t>
       </w:r>
     </w:p>
     <w:p>
@@ -3739,7 +3739,7 @@
     <w:p/>
     <w:p>
       <w:r>
-        <w:t>Текущий ближайший маршрут: полный тестовый прогон по встроенной инструкции → исправление найденных дефектов → релизная стабилизация.</w:t>
+        <w:t>Текущий ближайший маршрут: тестовый прогон → исправление найденных дефектов → релизная стабилизация.</w:t>
       </w:r>
     </w:p>
     <w:p>
@@ -3813,6 +3813,11 @@
     <w:p>
       <w:r>
         <w:t>v112 · В приложение добавлен отдельный раздел «🧪 Инструкция тестировщика». Он содержит полный пошаговый QA-прогон: авторизация и роли, кабинет и жизненный цикл досок, все инструменты доски с обозначениями и горячими клавишами, редактирование объектов, совместная работа, Live Lesson и презентация, ученики/задания/прогресс, расписание, материалы и шаблоны, уведомления, профиль, PWA, offline/reconnect, телефон, планшет и viewer-доступ. Для каждого теста указаны шаги и ожидаемый результат; есть поиск, фильтр по ролям, режим «только непроверенные», раскрытие разделов и локально сохраняемый прогресс.</w:t>
+      </w:r>
+    </w:p>
+    <w:p>
+      <w:r>
+        <w:t>v113 · Доступ к доске: кнопки «Поделиться» заменены на «Пригласить». Создание ссылок переработано визуально: отдельные карточки прав «Редактирование» и «Только просмотр», понятные описания, аккуратный блок готовой ссылки и копирования, стилизованные активные приглашения, приглашение по email и список участников. Интерфейс адаптирован для телефона и тёмной темы.</w:t>
       </w:r>
     </w:p>
     <w:sectPr>

</xml_diff>

<commit_message>
v114: optimize startup loading and network resilience
</commit_message>
<xml_diff>
--- a/OnlineRepetitor_roadmap.docx
+++ b/OnlineRepetitor_roadmap.docx
@@ -30,7 +30,7 @@
     </w:p>
     <w:p>
       <w:r>
-        <w:t>Общий прогресс дорожной карты: ≈99% · v113 — обновлённый интерфейс приглашений</w:t>
+        <w:t>Общий прогресс дорожной карты: ≈99% · v114 — ускорение первой загрузки и устойчивый офлайн-кэш</w:t>
       </w:r>
     </w:p>
     <w:p>
@@ -3739,7 +3739,7 @@
     <w:p/>
     <w:p>
       <w:r>
-        <w:t>Текущий ближайший маршрут: тестовый прогон → исправление найденных дефектов → релизная стабилизация.</w:t>
+        <w:t>Текущий ближайший маршрут: проверить скорость без VPN на нескольких сетях → при необходимости вынести production на альтернативный хостинг → релизная стабилизация.</w:t>
       </w:r>
     </w:p>
     <w:p>
@@ -3818,6 +3818,11 @@
     <w:p>
       <w:r>
         <w:t>v113 · Доступ к доске: кнопки «Поделиться» заменены на «Пригласить». Создание ссылок переработано визуально: отдельные карточки прав «Редактирование» и «Только просмотр», понятные описания, аккуратный блок готовой ссылки и копирования, стилизованные активные приглашения, приглашение по email и список участников. Интерфейс адаптирован для телефона и тёмной темы.</w:t>
+      </w:r>
+    </w:p>
+    <w:p>
+      <w:r>
+        <w:t>v114 · Доступность и скорость: старт приложения переведён на ленивую загрузку основного App-бандла, в HTML добавлен мгновенный экран загрузки, React вынесен в отдельный кэшируемый vendor-chunk. Для Vercel настроен годовой immutable-кэш хешированных assets, а Service Worker получил cache-first/stale-while-revalidate для статики и быстрый fallback навигации из кэша после 3,5 с ожидания сети. Повторные открытия после первого успешного визита должны значительно меньше зависеть от нестабильного маршрута до Vercel.</w:t>
       </w:r>
     </w:p>
     <w:sectPr>

</xml_diff>

<commit_message>
v115: rollback problematic startup optimization
</commit_message>
<xml_diff>
--- a/OnlineRepetitor_roadmap.docx
+++ b/OnlineRepetitor_roadmap.docx
@@ -30,7 +30,7 @@
     </w:p>
     <w:p>
       <w:r>
-        <w:t>Общий прогресс дорожной карты: ≈99% · v114 — ускорение первой загрузки и устойчивый офлайн-кэш</w:t>
+        <w:t>Общий прогресс дорожной карты: ≈99% · v115 — откат неудачной оптимизации загрузки и восстановление стабильного старта</w:t>
       </w:r>
     </w:p>
     <w:p>
@@ -3739,7 +3739,7 @@
     <w:p/>
     <w:p>
       <w:r>
-        <w:t>Текущий ближайший маршрут: проверить скорость без VPN на нескольких сетях → при необходимости вынести production на альтернативный хостинг → релизная стабилизация.</w:t>
+        <w:t>Текущий ближайший маршрут: проверить восстановленную загрузку без VPN → измерить, где именно возникает задержка → при необходимости вынести production на альтернативный хостинг → релизная стабилизация.</w:t>
       </w:r>
     </w:p>
     <w:p>
@@ -3822,7 +3822,12 @@
     </w:p>
     <w:p>
       <w:r>
-        <w:t>v114 · Доступность и скорость: старт приложения переведён на ленивую загрузку основного App-бандла, в HTML добавлен мгновенный экран загрузки, React вынесен в отдельный кэшируемый vendor-chunk. Для Vercel настроен годовой immutable-кэш хешированных assets, а Service Worker получил cache-first/stale-while-revalidate для статики и быстрый fallback навигации из кэша после 3,5 с ожидания сети. Повторные открытия после первого успешного визита должны значительно меньше зависеть от нестабильного маршрута до Vercel.</w:t>
+        <w:t>v114 · Доступность и скорость: эксперимент с ленивой загрузкой App, отдельным React vendor-chunk и агрессивной стратегией Service Worker. Реальное тестирование без VPN показало ухудшение времени загрузки, поэтому эти изменения не считаются удачным решением и откатываются в v115.</w:t>
+      </w:r>
+    </w:p>
+    <w:p>
+      <w:r>
+        <w:t>v115 · Стабилизация загрузки: удалены дополнительные стартовые сетевые запросы v114, возвращена единая загрузка App и проверенная network-first стратегия для JavaScript/CSS. Убран 3,5-секундный таймаут навигации и HTML-загрузчик. Cache namespace обновлён до v115, чтобы после активации удалить кэш v114. Следующий этап оптимизации будет опираться на измерения реальной задержки, а не на увеличение числа стартовых запросов.</w:t>
       </w:r>
     </w:p>
     <w:sectPr>

</xml_diff>

<commit_message>
v116: add server backed QA bug reporting
</commit_message>
<xml_diff>
--- a/OnlineRepetitor_roadmap.docx
+++ b/OnlineRepetitor_roadmap.docx
@@ -30,7 +30,7 @@
     </w:p>
     <w:p>
       <w:r>
-        <w:t>Общий прогресс дорожной карты: ≈99% · v115 — откат неудачной оптимизации загрузки и восстановление стабильного старта</w:t>
+        <w:t>Общий прогресс дорожной карты: ≈99% активного релизного объёма · v116 — серверный журнал ошибок тестировщика</w:t>
       </w:r>
     </w:p>
     <w:p>
@@ -3289,16 +3289,81 @@
             <w:vAlign w:val="center"/>
           </w:tcPr>
           <w:p>
-            <w:pPr>
-              <w:spacing w:after="0" w:before="0"/>
-              <w:jc w:val="center"/>
-            </w:pPr>
             <w:r>
-              <w:rPr>
-                <w:rFonts w:ascii="Arial" w:hAnsi="Arial"/>
-                <w:sz w:val="16"/>
-              </w:rPr>
               <w:t>38</w:t>
+            </w:r>
+          </w:p>
+        </w:tc>
+        <w:tc>
+          <w:tcPr>
+            <w:tcW w:type="dxa" w:w="2304"/>
+            <w:vAlign w:val="center"/>
+          </w:tcPr>
+          <w:p>
+            <w:r>
+              <w:t>Тестирование и обратная связь</w:t>
+            </w:r>
+          </w:p>
+        </w:tc>
+        <w:tc>
+          <w:tcPr>
+            <w:tcW w:type="dxa" w:w="6696"/>
+            <w:vAlign w:val="center"/>
+          </w:tcPr>
+          <w:p>
+            <w:r>
+              <w:t>Встроенный пошаговый QA-чек-лист, отметки прогресса, серверная отправка ошибок из конкретного теста, журнал отчётов и административные статусы. Далее — прогон на реальных устройствах и закрытие найденных дефектов.</w:t>
+            </w:r>
+          </w:p>
+        </w:tc>
+        <w:tc>
+          <w:tcPr>
+            <w:tcW w:type="dxa" w:w="1656"/>
+            <w:vAlign w:val="center"/>
+            <w:shd w:fill="FFF2CC"/>
+          </w:tcPr>
+          <w:p>
+            <w:r>
+              <w:t>В РАБОТЕ</w:t>
+            </w:r>
+          </w:p>
+        </w:tc>
+        <w:tc>
+          <w:tcPr>
+            <w:tcW w:type="dxa" w:w="936"/>
+            <w:vAlign w:val="center"/>
+            <w:shd w:fill="FFF2CC"/>
+          </w:tcPr>
+          <w:p>
+            <w:r>
+              <w:t>80%</w:t>
+            </w:r>
+          </w:p>
+        </w:tc>
+        <w:tc>
+          <w:tcPr>
+            <w:tcW w:type="dxa" w:w="2088"/>
+            <w:vAlign w:val="center"/>
+          </w:tcPr>
+          <w:p>
+            <w:r>
+              <w:t>v112 + v116</w:t>
+            </w:r>
+          </w:p>
+        </w:tc>
+      </w:tr>
+      <w:tr>
+        <w:trPr>
+          <w:cantSplit/>
+        </w:trPr>
+        <w:tc>
+          <w:tcPr>
+            <w:tcW w:type="dxa" w:w="504"/>
+            <w:vAlign w:val="center"/>
+          </w:tcPr>
+          <w:p>
+            <w:r>
+              <w:t>39</w:t>
             </w:r>
           </w:p>
         </w:tc>
@@ -3403,16 +3468,8 @@
             <w:vAlign w:val="center"/>
           </w:tcPr>
           <w:p>
-            <w:pPr>
-              <w:spacing w:after="0" w:before="0"/>
-              <w:jc w:val="center"/>
-            </w:pPr>
             <w:r>
-              <w:rPr>
-                <w:rFonts w:ascii="Arial" w:hAnsi="Arial"/>
-                <w:sz w:val="16"/>
-              </w:rPr>
-              <w:t>39</w:t>
+              <w:t>40</w:t>
             </w:r>
           </w:p>
         </w:tc>
@@ -3517,16 +3574,8 @@
             <w:vAlign w:val="center"/>
           </w:tcPr>
           <w:p>
-            <w:pPr>
-              <w:spacing w:after="0" w:before="0"/>
-              <w:jc w:val="center"/>
-            </w:pPr>
             <w:r>
-              <w:rPr>
-                <w:rFonts w:ascii="Arial" w:hAnsi="Arial"/>
-                <w:sz w:val="16"/>
-              </w:rPr>
-              <w:t>40</w:t>
+              <w:t>41</w:t>
             </w:r>
           </w:p>
         </w:tc>
@@ -3631,16 +3680,8 @@
             <w:vAlign w:val="center"/>
           </w:tcPr>
           <w:p>
-            <w:pPr>
-              <w:spacing w:after="0" w:before="0"/>
-              <w:jc w:val="center"/>
-            </w:pPr>
             <w:r>
-              <w:rPr>
-                <w:rFonts w:ascii="Arial" w:hAnsi="Arial"/>
-                <w:sz w:val="16"/>
-              </w:rPr>
-              <w:t>41</w:t>
+              <w:t>42</w:t>
             </w:r>
           </w:p>
         </w:tc>
@@ -3739,7 +3780,7 @@
     <w:p/>
     <w:p>
       <w:r>
-        <w:t>Текущий ближайший маршрут: проверить восстановленную загрузку без VPN → измерить, где именно возникает задержка → при необходимости вынести production на альтернативный хостинг → релизная стабилизация.</w:t>
+        <w:t>Текущий ближайший маршрут: тестовый прогон по встроенной инструкции → отправка найденных ошибок в серверный QA-журнал → исправление дефектов → релизная стабилизация.</w:t>
       </w:r>
     </w:p>
     <w:p>
@@ -3828,6 +3869,11 @@
     <w:p>
       <w:r>
         <w:t>v115 · Стабилизация загрузки: удалены дополнительные стартовые сетевые запросы v114, возвращена единая загрузка App и проверенная network-first стратегия для JavaScript/CSS. Убран 3,5-секундный таймаут навигации и HTML-загрузчик. Cache namespace обновлён до v115, чтобы после активации удалить кэш v114. Следующий этап оптимизации будет опираться на измерения реальной задержки, а не на увеличение числа стартовых запросов.</w:t>
+      </w:r>
+    </w:p>
+    <w:p>
+      <w:r>
+        <w:t>v116 · QA и стабилизация: инструкция тестировщика получила серверную отправку багов прямо из каждого теста. Сохраняются проверка, серьёзность, фактический и ожидаемый результат, браузер и размер экрана. Пользователь видит свои отчёты, администратор — общий журнал и может переводить ошибки по статусам «Открыт / В работе / Исправлен / Закрыт».</w:t>
       </w:r>
     </w:p>
     <w:sectPr>

</xml_diff>

<commit_message>
v117: make empty board welcome actions clickable
</commit_message>
<xml_diff>
--- a/OnlineRepetitor_roadmap.docx
+++ b/OnlineRepetitor_roadmap.docx
@@ -3876,6 +3876,14 @@
         <w:t>v116 · QA и стабилизация: инструкция тестировщика получила серверную отправку багов прямо из каждого теста. Сохраняются проверка, серьёзность, фактический и ожидаемый результат, браузер и размер экрана. Пользователь видит свои отчёты, администратор — общий журнал и может переводить ошибки по статусам «Открыт / В работе / Исправлен / Закрыт».</w:t>
       </w:r>
     </w:p>
+    <w:p>
+      <w:r>
+        <w:rPr>
+          <w:b/>
+        </w:rPr>
+        <w:t>v117 · 25.09.2026 — исправлена интерактивность стартовой карточки «Пустая доска»: кнопки быстрых действий снова принимают клики.</w:t>
+      </w:r>
+    </w:p>
     <w:sectPr>
       <w:headerReference w:type="default" r:id="rId9"/>
       <w:pgSz w:w="15840" w:h="12240" w:orient="landscape"/>

</xml_diff>

<commit_message>
v118: optimize board rendering performance
</commit_message>
<xml_diff>
--- a/OnlineRepetitor_roadmap.docx
+++ b/OnlineRepetitor_roadmap.docx
@@ -30,7 +30,7 @@
     </w:p>
     <w:p>
       <w:r>
-        <w:t>Общий прогресс дорожной карты: ≈99% активного релизного объёма · v116 — серверный журнал ошибок тестировщика</w:t>
+        <w:t>Общий прогресс дорожной карты: ≈99% · v118 — оптимизация плавности интерфейса</w:t>
       </w:r>
     </w:p>
     <w:p>
@@ -3780,7 +3780,7 @@
     <w:p/>
     <w:p>
       <w:r>
-        <w:t>Текущий ближайший маршрут: тестовый прогон по встроенной инструкции → отправка найденных ошибок в серверный QA-журнал → исправление дефектов → релизная стабилизация.</w:t>
+        <w:t>Текущий ближайший маршрут: замеры производительности → оптимизация больших досок и realtime → исправление найденных дефектов → релизная стабилизация.</w:t>
       </w:r>
     </w:p>
     <w:p>
@@ -3882,6 +3882,11 @@
           <w:b/>
         </w:rPr>
         <w:t>v117 · 25.09.2026 — исправлена интерактивность стартовой карточки «Пустая доска»: кнопки быстрых действий снова принимают клики.</w:t>
+      </w:r>
+    </w:p>
+    <w:p>
+      <w:r>
+        <w:t>v118 · Производительность интерфейса: выполнен безопасный этап оптимизации рендеринга без изменения логики приложения. Снижена стоимость компоновки объектов доски, тяжёлые blur/тени и переходы отключаются при панорамировании, а мобильный/touch-интерфейс использует облегчённые эффекты. Следующий этап — профилирование больших досок и оптимизация частых pointer/realtime-обновлений по результатам замеров.</w:t>
       </w:r>
     </w:p>
     <w:sectPr>

</xml_diff>

<commit_message>
v119: improve server save reliability and automatic retry
</commit_message>
<xml_diff>
--- a/OnlineRepetitor_roadmap.docx
+++ b/OnlineRepetitor_roadmap.docx
@@ -30,7 +30,7 @@
     </w:p>
     <w:p>
       <w:r>
-        <w:t>Общий прогресс дорожной карты: ≈99% · v118 — оптимизация плавности интерфейса</w:t>
+        <w:t>Общий прогресс дорожной карты: ≈99% · v119 — устойчивое серверное сохранение</w:t>
       </w:r>
     </w:p>
     <w:p>
@@ -3780,7 +3780,7 @@
     <w:p/>
     <w:p>
       <w:r>
-        <w:t>Текущий ближайший маршрут: замеры производительности → оптимизация больших досок и realtime → исправление найденных дефектов → релизная стабилизация.</w:t>
+        <w:t>Текущий ближайший маршрут: устойчивость синхронизации → замеры производительности → оптимизация больших досок и realtime → релизная стабилизация.</w:t>
       </w:r>
     </w:p>
     <w:p>
@@ -3887,6 +3887,11 @@
     <w:p>
       <w:r>
         <w:t>v118 · Производительность интерфейса: выполнен безопасный этап оптимизации рендеринга без изменения логики приложения. Снижена стоимость компоновки объектов доски, тяжёлые blur/тени и переходы отключаются при панорамировании, а мобильный/touch-интерфейс использует облегчённые эффекты. Следующий этап — профилирование больших досок и оптимизация частых pointer/realtime-обновлений по результатам замеров.</w:t>
+      </w:r>
+    </w:p>
+    <w:p>
+      <w:r>
+        <w:t>v119 · Надёжность синхронизации: кратковременный сетевой сбой больше не оставляет доску в состоянии «сервер временно недоступен». Локальная копия сохраняется сразу, серверное сохранение автоматически повторяется с увеличивающейся задержкой, а после успешной отправки статус возвращается к «Сохранено на сервере». Повторная попытка всегда отправляет актуальный снимок доски и прекращается при закрытии экрана.</w:t>
       </w:r>
     </w:p>
     <w:sectPr>

</xml_diff>

<commit_message>
v120: fix initial server save for new boards
</commit_message>
<xml_diff>
--- a/OnlineRepetitor_roadmap.docx
+++ b/OnlineRepetitor_roadmap.docx
@@ -30,7 +30,7 @@
     </w:p>
     <w:p>
       <w:r>
-        <w:t>Общий прогресс дорожной карты: ≈99% · v119 — устойчивое серверное сохранение</w:t>
+        <w:t>Общий прогресс дорожной карты: ≈99% · v120 — исправлено первичное серверное сохранение новой доски</w:t>
       </w:r>
     </w:p>
     <w:p>
@@ -3780,7 +3780,7 @@
     <w:p/>
     <w:p>
       <w:r>
-        <w:t>Текущий ближайший маршрут: устойчивость синхронизации → замеры производительности → оптимизация больших досок и realtime → релизная стабилизация.</w:t>
+        <w:t>Текущий ближайший маршрут: проверка серверного сохранения → тестовый прогон → исправление найденных дефектов → релизная стабилизация.</w:t>
       </w:r>
     </w:p>
     <w:p>
@@ -3892,6 +3892,14 @@
     <w:p>
       <w:r>
         <w:t>v119 · Надёжность синхронизации: кратковременный сетевой сбой больше не оставляет доску в состоянии «сервер временно недоступен». Локальная копия сохраняется сразу, серверное сохранение автоматически повторяется с увеличивающейся задержкой, а после успешной отправки статус возвращается к «Сохранено на сервере». Повторная попытка всегда отправляет актуальный снимок доски и прекращается при закрытии экрана.</w:t>
+      </w:r>
+    </w:p>
+    <w:p>
+      <w:r>
+        <w:rPr>
+          <w:b w:val="0"/>
+        </w:rPr>
+        <w:t>v120 · Исправление серверного сохранения новой доски: устранена ошибка в SQL-функции save_board_document, где PL/pgSQL FOUND проверялся после чтения профиля пользователя и мог ошибочно считать несуществующий board_documents уже найденным. Состояние наличия документа теперь фиксируется сразу после SELECT board_documents; первая серверная версия новой доски корректно создаётся, после чего обычная синхронизация продолжает работу.</w:t>
       </w:r>
     </w:p>
     <w:sectPr>

</xml_diff>

<commit_message>
v126: move video calls inside boards only
</commit_message>
<xml_diff>
--- a/OnlineRepetitor_roadmap.docx
+++ b/OnlineRepetitor_roadmap.docx
@@ -30,7 +30,7 @@
     </w:p>
     <w:p>
       <w:r>
-        <w:t>Общий прогресс дорожной карты: ≈99% · v120 — исправлено первичное серверное сохранение новой доски</w:t>
+        <w:t>Общий прогресс дорожной карты: ≈88% · v126 — видеозвонки перенесены внутрь доски</w:t>
       </w:r>
     </w:p>
     <w:p>
@@ -3373,16 +3373,7 @@
             <w:vAlign w:val="center"/>
           </w:tcPr>
           <w:p>
-            <w:pPr>
-              <w:spacing w:after="0" w:before="0"/>
-              <w:jc w:val="left"/>
-            </w:pPr>
             <w:r>
-              <w:rPr>
-                <w:rFonts w:ascii="Arial" w:hAnsi="Arial"/>
-                <w:b/>
-                <w:sz w:val="16"/>
-              </w:rPr>
               <w:t>Чат</w:t>
             </w:r>
           </w:p>
@@ -3393,16 +3384,8 @@
             <w:vAlign w:val="center"/>
           </w:tcPr>
           <w:p>
-            <w:pPr>
-              <w:spacing w:after="0" w:before="0"/>
-              <w:jc w:val="left"/>
-            </w:pPr>
             <w:r>
-              <w:rPr>
-                <w:rFonts w:ascii="Arial" w:hAnsi="Arial"/>
-                <w:sz w:val="16"/>
-              </w:rPr>
-              <w:t>Чат преподаватель ↔ ученик, сообщения внутри занятия и вне его.</w:t>
+              <w:t>Личные сообщения внутри доски и отдельным экраном: Supabase/Realtime, непрочитанные, поиск, редактирование/удаление своих сообщений, отметки прочтения и мобильный интерфейс.</w:t>
             </w:r>
           </w:p>
         </w:tc>
@@ -3410,11 +3393,11 @@
           <w:tcPr>
             <w:tcW w:type="dxa" w:w="1656"/>
             <w:vAlign w:val="center"/>
-            <w:shd w:fill="E7E6E6"/>
+            <w:shd w:fill="D9EAD3"/>
           </w:tcPr>
           <w:p>
             <w:r>
-              <w:t>ПОЗЖЕ</w:t>
+              <w:t>ГОТОВО</w:t>
             </w:r>
           </w:p>
         </w:tc>
@@ -3422,19 +3405,11 @@
           <w:tcPr>
             <w:tcW w:type="dxa" w:w="936"/>
             <w:vAlign w:val="center"/>
-            <w:shd w:fill="E7E6E6"/>
+            <w:shd w:fill="D9EAD3"/>
           </w:tcPr>
           <w:p>
-            <w:pPr>
-              <w:spacing w:after="0" w:before="0"/>
-              <w:jc w:val="center"/>
-            </w:pPr>
             <w:r>
-              <w:rPr>
-                <w:rFonts w:ascii="Arial" w:hAnsi="Arial"/>
-                <w:sz w:val="16"/>
-              </w:rPr>
-              <w:t>0%</w:t>
+              <w:t>100%</w:t>
             </w:r>
           </w:p>
         </w:tc>
@@ -3444,16 +3419,8 @@
             <w:vAlign w:val="center"/>
           </w:tcPr>
           <w:p>
-            <w:pPr>
-              <w:spacing w:after="0" w:before="0"/>
-              <w:jc w:val="center"/>
-            </w:pPr>
             <w:r>
-              <w:rPr>
-                <w:rFonts w:ascii="Arial" w:hAnsi="Arial"/>
-                <w:sz w:val="16"/>
-              </w:rPr>
-              <w:t>Дальний этап</w:t>
+              <w:t>v121–v124</w:t>
             </w:r>
           </w:p>
         </w:tc>
@@ -3499,16 +3466,8 @@
             <w:vAlign w:val="center"/>
           </w:tcPr>
           <w:p>
-            <w:pPr>
-              <w:spacing w:after="0" w:before="0"/>
-              <w:jc w:val="left"/>
-            </w:pPr>
             <w:r>
-              <w:rPr>
-                <w:rFonts w:ascii="Arial" w:hAnsi="Arial"/>
-                <w:sz w:val="16"/>
-              </w:rPr>
-              <w:t>Встроенный видеозвонок, управление камерой/микрофоном, возможно запись занятия.</w:t>
+              <w:t>WebRTC-видеозвонок только внутри открытой доски: звонок участнику, который сейчас на доске, выбор собеседника, входящий вызов, камера/микрофон, принять/отклонить/завершить и Supabase Realtime-сигнализация. Для полной сетевой надёжности ещё требуется TURN.</w:t>
             </w:r>
           </w:p>
         </w:tc>
@@ -3516,11 +3475,11 @@
           <w:tcPr>
             <w:tcW w:type="dxa" w:w="1656"/>
             <w:vAlign w:val="center"/>
-            <w:shd w:fill="E7E6E6"/>
+            <w:shd w:fill="FFF2CC"/>
           </w:tcPr>
           <w:p>
             <w:r>
-              <w:t>ПОЗЖЕ</w:t>
+              <w:t>В РАБОТЕ</w:t>
             </w:r>
           </w:p>
         </w:tc>
@@ -3528,19 +3487,11 @@
           <w:tcPr>
             <w:tcW w:type="dxa" w:w="936"/>
             <w:vAlign w:val="center"/>
-            <w:shd w:fill="E7E6E6"/>
+            <w:shd w:fill="FFF2CC"/>
           </w:tcPr>
           <w:p>
-            <w:pPr>
-              <w:spacing w:after="0" w:before="0"/>
-              <w:jc w:val="center"/>
-            </w:pPr>
             <w:r>
-              <w:rPr>
-                <w:rFonts w:ascii="Arial" w:hAnsi="Arial"/>
-                <w:sz w:val="16"/>
-              </w:rPr>
-              <w:t>0%</w:t>
+              <w:t>55%</w:t>
             </w:r>
           </w:p>
         </w:tc>
@@ -3550,16 +3501,8 @@
             <w:vAlign w:val="center"/>
           </w:tcPr>
           <w:p>
-            <w:pPr>
-              <w:spacing w:after="0" w:before="0"/>
-              <w:jc w:val="center"/>
-            </w:pPr>
             <w:r>
-              <w:rPr>
-                <w:rFonts w:ascii="Arial" w:hAnsi="Arial"/>
-                <w:sz w:val="16"/>
-              </w:rPr>
-              <w:t>Дальний этап</w:t>
+              <w:t>v125–v126</w:t>
             </w:r>
           </w:p>
         </w:tc>
@@ -3780,7 +3723,7 @@
     <w:p/>
     <w:p>
       <w:r>
-        <w:t>Текущий ближайший маршрут: проверка серверного сохранения → тестовый прогон → исправление найденных дефектов → релизная стабилизация.</w:t>
+        <w:t>Текущий ближайший маршрут: видеозвонки в доске → TURN → платежи/тарифы → AI.</w:t>
       </w:r>
     </w:p>
     <w:p>
@@ -3792,114 +3735,262 @@
       </w:r>
     </w:p>
     <w:p>
+      <w:pPr>
+        <w:spacing w:after="40" w:line="221" w:lineRule="auto"/>
+      </w:pPr>
       <w:r>
+        <w:rPr>
+          <w:sz w:val="14"/>
+        </w:rPr>
         <w:t>v100 · Визуальный редизайн: верхняя панель разгружена, вторичные действия собраны в компактное меню, панель инструментов и всплывающие окна получили единую более лёгкую визуальную систему.</w:t>
       </w:r>
     </w:p>
     <w:p>
+      <w:pPr>
+        <w:spacing w:after="40" w:line="221" w:lineRule="auto"/>
+      </w:pPr>
       <w:r>
+        <w:rPr>
+          <w:sz w:val="14"/>
+        </w:rPr>
         <w:t>v101 · UX доски: исправлена визуальная иерархия после v100, введена единая типографика, основная панель инструментов получила подписи и режим «Ещё инструменты», а пустая доска — понятный стартовый экран с быстрыми действиями.</w:t>
       </w:r>
     </w:p>
     <w:p>
+      <w:pPr>
+        <w:spacing w:after="40" w:line="221" w:lineRule="auto"/>
+      </w:pPr>
       <w:r>
+        <w:rPr>
+          <w:sz w:val="14"/>
+        </w:rPr>
         <w:t>v102 · Панель инструментов: панель ограничена высотой рабочего окна и прокручивается внутри; «Выбрать» и «Двигать» вынесены в отдельный постоянный блок и не исчезают при прокрутке списка.</w:t>
       </w:r>
     </w:p>
     <w:p>
+      <w:pPr>
+        <w:spacing w:after="40" w:line="221" w:lineRule="auto"/>
+      </w:pPr>
       <w:r>
+        <w:rPr>
+          <w:sz w:val="14"/>
+        </w:rPr>
         <w:t>v103 · Панель инструментов возвращена к компактной плавающей колонке. «Выбрать» и «Двигать» закреплены сверху, основные инструменты показаны иконками, дополнительные раскрываются отдельно. Панель больше не занимает широкую полосу рабочего пространства.</w:t>
       </w:r>
     </w:p>
     <w:p>
+      <w:pPr>
+        <w:spacing w:after="40" w:line="221" w:lineRule="auto"/>
+      </w:pPr>
       <w:r>
+        <w:rPr>
+          <w:sz w:val="14"/>
+        </w:rPr>
         <w:t>v104 · Исправлена первопричина выхода панели за верхнюю границу: старое transform: translateY(-50%) продолжало сдвигать панель вверх после редизайна. На desktop трансформация сброшена; панель позиционируется относительно рабочей области с безопасным отступом.</w:t>
       </w:r>
     </w:p>
     <w:p>
+      <w:pPr>
+        <w:spacing w:after="40" w:line="221" w:lineRule="auto"/>
+      </w:pPr>
       <w:r>
+        <w:rPr>
+          <w:sz w:val="14"/>
+        </w:rPr>
         <w:t>v105 · Типографика и телефон: увеличены мелкие подписи верхней панели, меню, подсказок, окон и элементов управления. Установленная PWA закреплена в альбомной ориентации; мобильная доска получила отдельную landscape-компоновку, а в портретном браузерном режиме показывается просьба повернуть телефон.</w:t>
       </w:r>
     </w:p>
     <w:p>
+      <w:pPr>
+        <w:spacing w:after="40" w:line="221" w:lineRule="auto"/>
+      </w:pPr>
       <w:r>
+        <w:rPr>
+          <w:sz w:val="14"/>
+        </w:rPr>
         <w:t>v106 · UX-полировка: убран блокирующий экран с просьбой повернуть телефон; PWA остаётся ориентирована на landscape, но браузерная версия работает в любой ориентации. Главное мобильное меню стало компактнее, навигация — горизонтальной, карточки и фильтры адаптивными. Выпадающие списки получили спокойный серый фон и мягкие состояния. Для интерфейсного текста добавлены переносы и увеличены безопасные области, чтобы подписи не обрезались.</w:t>
       </w:r>
     </w:p>
     <w:p>
+      <w:pPr>
+        <w:spacing w:after="40" w:line="221" w:lineRule="auto"/>
+      </w:pPr>
       <w:r>
+        <w:rPr>
+          <w:sz w:val="14"/>
+        </w:rPr>
         <w:t>v107 · Верхняя панель: убран отдельный логотип «B», кнопка «Доски» расширена и стала самостоятельной точкой возврата. Статусы сохранения и сети получили собственное пространство и больше не должны обрезаться. На мобильных устройствах при открытии доски приложение запрашивает landscape orientation; в установленной PWA блокировка выполняется сразу, в браузере повторяется после первого касания, когда API требует пользовательский жест.</w:t>
       </w:r>
     </w:p>
     <w:p>
+      <w:pPr>
+        <w:spacing w:after="40" w:line="221" w:lineRule="auto"/>
+      </w:pPr>
       <w:r>
+        <w:rPr>
+          <w:sz w:val="14"/>
+        </w:rPr>
         <w:t>v108 · Настройки: экран профиля больше не показывает навигационные вкладки главной страницы. Выход из аккаунта перенесён из главного меню в раздел «Приложение» настроек. Там же появилась кнопка установки PWA, когда браузер предоставляет системный install prompt. Мобильные настройки уплотнены; в landscape карточки раскладываются в две колонки.</w:t>
       </w:r>
     </w:p>
     <w:p>
+      <w:pPr>
+        <w:spacing w:after="40" w:line="221" w:lineRule="auto"/>
+      </w:pPr>
       <w:r>
+        <w:rPr>
+          <w:sz w:val="14"/>
+        </w:rPr>
         <w:t>v109 · Главное меню на телефоне: длинная полоса разделов заменена компактной раскрывающейся кнопкой «Разделы». Внутри — сетка переходов по кабинету и настройкам. Мобильная шапка упрощена, логотип OR скрыт, настройки представлены одной иконкой. Поиск, фильтры, действия и карточки досок уплотнены; landscape-режим использует более плотную трёхколоночную сетку.</w:t>
       </w:r>
     </w:p>
     <w:p>
+      <w:pPr>
+        <w:spacing w:after="40" w:line="221" w:lineRule="auto"/>
+      </w:pPr>
       <w:r>
+        <w:rPr>
+          <w:sz w:val="14"/>
+        </w:rPr>
         <w:t>v110 · Мобильный режим: удалён автоматический переход обычной вкладки Chrome в Fullscreen, который на Android создавал системное уведомление OnlineRepetitor с предложением скопировать URL/открыть страницу в Chrome. Landscape-lock теперь запрашивается только в установленной PWA; manifest сохраняет orientation=landscape. Обычная вкладка браузера больше не переводится приложением в app-like fullscreen.</w:t>
       </w:r>
     </w:p>
     <w:p>
+      <w:pPr>
+        <w:spacing w:after="40" w:line="221" w:lineRule="auto"/>
+      </w:pPr>
       <w:r>
+        <w:rPr>
+          <w:sz w:val="14"/>
+        </w:rPr>
         <w:t>v111 · Комплексный mobile/tablet UX: введены отдельные адаптивные режимы для телефона, компактного и большого планшета. На доске переработаны верхняя панель, нижний док быстрых инструментов, раскрываемая полная палитра, масштаб, настройки пера/ластика/связей/фигур, touch-маркеры выделения, всплывающие окна и safe-area. На планшетах сохранена вертикальная панель инструментов, но увеличены touch-targets и освобождена рабочая область. Кабинетные экраны, материалы, расписание, уведомления, профиль и карточные сетки получили согласованные мобильные и планшетные раскладки.</w:t>
       </w:r>
     </w:p>
     <w:p>
+      <w:pPr>
+        <w:spacing w:after="40" w:line="221" w:lineRule="auto"/>
+      </w:pPr>
       <w:r>
+        <w:rPr>
+          <w:sz w:val="14"/>
+        </w:rPr>
         <w:t>v112 · В приложение добавлен отдельный раздел «🧪 Инструкция тестировщика». Он содержит полный пошаговый QA-прогон: авторизация и роли, кабинет и жизненный цикл досок, все инструменты доски с обозначениями и горячими клавишами, редактирование объектов, совместная работа, Live Lesson и презентация, ученики/задания/прогресс, расписание, материалы и шаблоны, уведомления, профиль, PWA, offline/reconnect, телефон, планшет и viewer-доступ. Для каждого теста указаны шаги и ожидаемый результат; есть поиск, фильтр по ролям, режим «только непроверенные», раскрытие разделов и локально сохраняемый прогресс.</w:t>
       </w:r>
     </w:p>
     <w:p>
+      <w:pPr>
+        <w:spacing w:after="40" w:line="221" w:lineRule="auto"/>
+      </w:pPr>
       <w:r>
+        <w:rPr>
+          <w:sz w:val="14"/>
+        </w:rPr>
         <w:t>v113 · Доступ к доске: кнопки «Поделиться» заменены на «Пригласить». Создание ссылок переработано визуально: отдельные карточки прав «Редактирование» и «Только просмотр», понятные описания, аккуратный блок готовой ссылки и копирования, стилизованные активные приглашения, приглашение по email и список участников. Интерфейс адаптирован для телефона и тёмной темы.</w:t>
       </w:r>
     </w:p>
     <w:p>
+      <w:pPr>
+        <w:spacing w:after="40" w:line="221" w:lineRule="auto"/>
+      </w:pPr>
       <w:r>
+        <w:rPr>
+          <w:sz w:val="14"/>
+        </w:rPr>
         <w:t>v114 · Доступность и скорость: эксперимент с ленивой загрузкой App, отдельным React vendor-chunk и агрессивной стратегией Service Worker. Реальное тестирование без VPN показало ухудшение времени загрузки, поэтому эти изменения не считаются удачным решением и откатываются в v115.</w:t>
       </w:r>
     </w:p>
     <w:p>
+      <w:pPr>
+        <w:spacing w:after="40" w:line="221" w:lineRule="auto"/>
+      </w:pPr>
       <w:r>
+        <w:rPr>
+          <w:sz w:val="14"/>
+        </w:rPr>
         <w:t>v115 · Стабилизация загрузки: удалены дополнительные стартовые сетевые запросы v114, возвращена единая загрузка App и проверенная network-first стратегия для JavaScript/CSS. Убран 3,5-секундный таймаут навигации и HTML-загрузчик. Cache namespace обновлён до v115, чтобы после активации удалить кэш v114. Следующий этап оптимизации будет опираться на измерения реальной задержки, а не на увеличение числа стартовых запросов.</w:t>
       </w:r>
     </w:p>
     <w:p>
+      <w:pPr>
+        <w:spacing w:after="40" w:line="221" w:lineRule="auto"/>
+      </w:pPr>
       <w:r>
+        <w:rPr>
+          <w:sz w:val="14"/>
+        </w:rPr>
         <w:t>v116 · QA и стабилизация: инструкция тестировщика получила серверную отправку багов прямо из каждого теста. Сохраняются проверка, серьёзность, фактический и ожидаемый результат, браузер и размер экрана. Пользователь видит свои отчёты, администратор — общий журнал и может переводить ошибки по статусам «Открыт / В работе / Исправлен / Закрыт».</w:t>
       </w:r>
     </w:p>
     <w:p>
+      <w:pPr>
+        <w:spacing w:after="40" w:line="221" w:lineRule="auto"/>
+      </w:pPr>
       <w:r>
         <w:rPr>
           <w:b/>
+          <w:sz w:val="14"/>
         </w:rPr>
         <w:t>v117 · 25.09.2026 — исправлена интерактивность стартовой карточки «Пустая доска»: кнопки быстрых действий снова принимают клики.</w:t>
       </w:r>
     </w:p>
     <w:p>
+      <w:pPr>
+        <w:spacing w:after="40" w:line="221" w:lineRule="auto"/>
+      </w:pPr>
       <w:r>
+        <w:rPr>
+          <w:sz w:val="14"/>
+        </w:rPr>
         <w:t>v118 · Производительность интерфейса: выполнен безопасный этап оптимизации рендеринга без изменения логики приложения. Снижена стоимость компоновки объектов доски, тяжёлые blur/тени и переходы отключаются при панорамировании, а мобильный/touch-интерфейс использует облегчённые эффекты. Следующий этап — профилирование больших досок и оптимизация частых pointer/realtime-обновлений по результатам замеров.</w:t>
       </w:r>
     </w:p>
     <w:p>
+      <w:pPr>
+        <w:spacing w:after="40" w:line="221" w:lineRule="auto"/>
+      </w:pPr>
       <w:r>
+        <w:rPr>
+          <w:sz w:val="14"/>
+        </w:rPr>
         <w:t>v119 · Надёжность синхронизации: кратковременный сетевой сбой больше не оставляет доску в состоянии «сервер временно недоступен». Локальная копия сохраняется сразу, серверное сохранение автоматически повторяется с увеличивающейся задержкой, а после успешной отправки статус возвращается к «Сохранено на сервере». Повторная попытка всегда отправляет актуальный снимок доски и прекращается при закрытии экрана.</w:t>
       </w:r>
     </w:p>
     <w:p>
+      <w:pPr>
+        <w:spacing w:after="40" w:line="221" w:lineRule="auto"/>
+      </w:pPr>
       <w:r>
         <w:rPr>
           <w:b w:val="0"/>
+          <w:sz w:val="14"/>
         </w:rPr>
         <w:t>v120 · Исправление серверного сохранения новой доски: устранена ошибка в SQL-функции save_board_document, где PL/pgSQL FOUND проверялся после чтения профиля пользователя и мог ошибочно считать несуществующий board_documents уже найденным. Состояние наличия документа теперь фиксируется сразу после SELECT board_documents; первая серверная версия новой доски корректно создаётся, после чего обычная синхронизация продолжает работу.</w:t>
+      </w:r>
+    </w:p>
+    <w:p>
+      <w:pPr>
+        <w:spacing w:after="40" w:line="221" w:lineRule="auto"/>
+      </w:pPr>
+      <w:r>
+        <w:rPr>
+          <w:b/>
+          <w:sz w:val="14"/>
+        </w:rPr>
+        <w:t xml:space="preserve">v121 · Дальний этап 38: </w:t>
+      </w:r>
+      <w:r>
+        <w:rPr>
+          <w:sz w:val="14"/>
+        </w:rPr>
+        <w:t>начат полноценный чат внутри доски на серверной базе обсуждений: realtime, ответы, @упоминания, счётчик новых сообщений и адаптивное окно. Добавлен индекс для быстрых хронологических чтений.</w:t>
+      </w:r>
+    </w:p>
+    <w:p>
+      <w:pPr>
+        <w:spacing w:after="40" w:line="221" w:lineRule="auto"/>
+      </w:pPr>
+      <w:r>
+        <w:t>v122–v124: чат доведён до полноценной серверной переписки с realtime, непрочитанными, поиском, редактированием/удалением и отметками прочтения. v125: начат WebRTC-видеозвонок. v126: звонки убраны из личной переписки и перенесены только в открытую доску; звонить можно участнику, который сейчас присутствует на ней, а сигнализация теперь привязана к board_id. Далее — TURN.</w:t>
       </w:r>
     </w:p>
     <w:sectPr>

</xml_diff>

<commit_message>
v127: improve board video calls and screen sharing
</commit_message>
<xml_diff>
--- a/OnlineRepetitor_roadmap.docx
+++ b/OnlineRepetitor_roadmap.docx
@@ -3467,7 +3467,7 @@
           </w:tcPr>
           <w:p>
             <w:r>
-              <w:t>WebRTC-видеозвонок только внутри открытой доски: звонок участнику, который сейчас на доске, выбор собеседника, входящий вызов, камера/микрофон, принять/отклонить/завершить и Supabase Realtime-сигнализация. Для полной сетевой надёжности ещё требуется TURN.</w:t>
+              <w:t>WebRTC-видеозвонок только внутри открытой доски: звонок онлайн-участнику, входящий вызов, камера/микрофон, компактное плавающее окно, сворачивание без остановки работы с доской, перетаскивание на компьютере и демонстрация экрана. Для полной сетевой надёжности ещё требуется TURN.</w:t>
             </w:r>
           </w:p>
         </w:tc>
@@ -3491,7 +3491,7 @@
           </w:tcPr>
           <w:p>
             <w:r>
-              <w:t>55%</w:t>
+              <w:t>70%</w:t>
             </w:r>
           </w:p>
         </w:tc>
@@ -3502,7 +3502,7 @@
           </w:tcPr>
           <w:p>
             <w:r>
-              <w:t>v125–v126</w:t>
+              <w:t>v125–v127</w:t>
             </w:r>
           </w:p>
         </w:tc>
@@ -3969,7 +3969,7 @@
     </w:p>
     <w:p>
       <w:pPr>
-        <w:spacing w:after="40" w:line="221" w:lineRule="auto"/>
+        <w:spacing w:after="0" w:line="221" w:lineRule="auto" w:before="0"/>
       </w:pPr>
       <w:r>
         <w:rPr>
@@ -3987,10 +3987,18 @@
     </w:p>
     <w:p>
       <w:pPr>
-        <w:spacing w:after="40" w:line="221" w:lineRule="auto"/>
+        <w:spacing w:after="0" w:line="221" w:lineRule="auto" w:before="0"/>
       </w:pPr>
       <w:r>
         <w:t>v122–v124: чат доведён до полноценной серверной переписки с realtime, непрочитанными, поиском, редактированием/удалением и отметками прочтения. v125: начат WebRTC-видеозвонок. v126: звонки убраны из личной переписки и перенесены только в открытую доску; звонить можно участнику, который сейчас присутствует на ней, а сигнализация теперь привязана к board_id. Далее — TURN.</w:t>
+      </w:r>
+    </w:p>
+    <w:p>
+      <w:pPr>
+        <w:spacing w:after="0" w:before="0"/>
+      </w:pPr>
+      <w:r>
+        <w:t>v127 · Видеозвонок на доске стал компактным рабочим инструментом: плавающее окно не блокирует доску, на компьютере его можно перетаскивать и сворачивать, а во время соединения доступна демонстрация экрана. Улучшены мобильная раскладка и обработка параллельного входящего вызова. TURN остаётся следующим этапом сетевой надёжности.</w:t>
       </w:r>
     </w:p>
     <w:sectPr>

</xml_diff>

<commit_message>
v128: move chat entirely inside boards
</commit_message>
<xml_diff>
--- a/OnlineRepetitor_roadmap.docx
+++ b/OnlineRepetitor_roadmap.docx
@@ -3385,7 +3385,7 @@
           </w:tcPr>
           <w:p>
             <w:r>
-              <w:t>Личные сообщения внутри доски и отдельным экраном: Supabase/Realtime, непрочитанные, поиск, редактирование/удаление своих сообщений, отметки прочтения и мобильный интерфейс.</w:t>
+              <w:t>Чат только внутри конкретной доски: серверные сообщения Supabase/Realtime, ответы и @упоминания, выезжающая панель справа, сворачивание без ухода с доски и индикатор количества новых сообщений на кнопке «Сообщения». Отдельный глобальный мессенджер из кабинета убран.</w:t>
             </w:r>
           </w:p>
         </w:tc>
@@ -3420,7 +3420,7 @@
           </w:tcPr>
           <w:p>
             <w:r>
-              <w:t>v121–v124</w:t>
+              <w:t>v121–v124, v128</w:t>
             </w:r>
           </w:p>
         </w:tc>
@@ -4001,6 +4001,11 @@
         <w:t>v127 · Видеозвонок на доске стал компактным рабочим инструментом: плавающее окно не блокирует доску, на компьютере его можно перетаскивать и сворачивать, а во время соединения доступна демонстрация экрана. Улучшены мобильная раскладка и обработка параллельного входящего вызова. TURN остаётся следующим этапом сетевой надёжности.</w:t>
       </w:r>
     </w:p>
+    <w:p>
+      <w:r>
+        <w:t>v128 · Чат переведён в board-only режим: отдельный раздел личных сообщений удалён из навигации, сообщения жёстко привязаны к текущей доске, чат открывается выезжающей панелью справа и сворачивается обратно в кнопку. Realtime-подписка работает даже при свёрнутой панели, а счётчик на кнопке «Сообщения» показывает новые сообщения до открытия чата.</w:t>
+      </w:r>
+    </w:p>
     <w:sectPr>
       <w:headerReference w:type="default" r:id="rId9"/>
       <w:pgSz w:w="15840" w:h="12240" w:orient="landscape"/>

</xml_diff>

<commit_message>
v131 local patch files
</commit_message>
<xml_diff>
--- a/OnlineRepetitor_roadmap.docx
+++ b/OnlineRepetitor_roadmap.docx
@@ -30,7 +30,7 @@
     </w:p>
     <w:p>
       <w:r>
-        <w:t>Общий прогресс дорожной карты: ≈88% · v126 — видеозвонки перенесены внутрь доски</w:t>
+        <w:t>Общий прогресс дорожной карты: ≈90% · v131 — видеозвонки устойчивее к кратковременным обрывам сети</w:t>
       </w:r>
     </w:p>
     <w:p>
@@ -3385,7 +3385,7 @@
           </w:tcPr>
           <w:p>
             <w:r>
-              <w:t>Чат только внутри конкретной доски: серверные сообщения Supabase/Realtime, ответы и @упоминания, выезжающая панель справа, сворачивание без ухода с доски и индикатор количества новых сообщений на кнопке «Сообщения». Отдельный глобальный мессенджер из кабинета убран.</w:t>
+              <w:t>Чат только внутри конкретной доски: Supabase/Realtime, выезжающая правая панель, сворачивание, непрочитанные, поиск, редактирование/удаление своих сообщений и отметки прочтения.</w:t>
             </w:r>
           </w:p>
         </w:tc>
@@ -3420,7 +3420,7 @@
           </w:tcPr>
           <w:p>
             <w:r>
-              <w:t>v121–v124, v128</w:t>
+              <w:t>v121–v124 + v128</w:t>
             </w:r>
           </w:p>
         </w:tc>
@@ -3467,7 +3467,7 @@
           </w:tcPr>
           <w:p>
             <w:r>
-              <w:t>WebRTC-видеозвонок только внутри открытой доски: звонок онлайн-участнику, входящий вызов, камера/микрофон, компактное плавающее окно, сворачивание без остановки работы с доской, перетаскивание на компьютере и демонстрация экрана. Для полной сетевой надёжности ещё требуется TURN.</w:t>
+              <w:t>WebRTC-видеозвонок только внутри открытой доски: выбор участника, входящий вызов, камера/микрофон, демонстрация экрана, Supabase Realtime-сигнализация, настраиваемые ICE/TURN и восстановление после кратковременного сетевого обрыва. Для полной сетевой надёжности остаются развёртывание TURN и реальные межсетевые тесты.</w:t>
             </w:r>
           </w:p>
         </w:tc>
@@ -3491,7 +3491,7 @@
           </w:tcPr>
           <w:p>
             <w:r>
-              <w:t>70%</w:t>
+              <w:t>80%</w:t>
             </w:r>
           </w:p>
         </w:tc>
@@ -3502,7 +3502,7 @@
           </w:tcPr>
           <w:p>
             <w:r>
-              <w:t>v125–v127</w:t>
+              <w:t>v125–v131</w:t>
             </w:r>
           </w:p>
         </w:tc>
@@ -3723,7 +3723,10 @@
     <w:p/>
     <w:p>
       <w:r>
-        <w:t>Текущий ближайший маршрут: видеозвонки в доске → TURN → платежи/тарифы → AI.</w:t>
+        <w:rPr>
+          <w:sz w:val="18"/>
+        </w:rPr>
+        <w:t>Текущий ближайший маршрут: завершить TURN для видеозвонков → прогон QA на реальных устройствах → платежи/тарифы → AI.</w:t>
       </w:r>
     </w:p>
     <w:p>
@@ -3969,7 +3972,7 @@
     </w:p>
     <w:p>
       <w:pPr>
-        <w:spacing w:after="0" w:line="221" w:lineRule="auto" w:before="0"/>
+        <w:spacing w:after="40" w:line="221" w:lineRule="auto"/>
       </w:pPr>
       <w:r>
         <w:rPr>
@@ -3987,23 +3990,39 @@
     </w:p>
     <w:p>
       <w:pPr>
-        <w:spacing w:after="0" w:line="221" w:lineRule="auto" w:before="0"/>
+        <w:spacing w:after="40" w:line="221" w:lineRule="auto"/>
       </w:pPr>
       <w:r>
         <w:t>v122–v124: чат доведён до полноценной серверной переписки с realtime, непрочитанными, поиском, редактированием/удалением и отметками прочтения. v125: начат WebRTC-видеозвонок. v126: звонки убраны из личной переписки и перенесены только в открытую доску; звонить можно участнику, который сейчас присутствует на ней, а сигнализация теперь привязана к board_id. Далее — TURN.</w:t>
       </w:r>
     </w:p>
     <w:p>
-      <w:pPr>
-        <w:spacing w:after="0" w:before="0"/>
-      </w:pPr>
+      <w:pPr/>
       <w:r>
-        <w:t>v127 · Видеозвонок на доске стал компактным рабочим инструментом: плавающее окно не блокирует доску, на компьютере его можно перетаскивать и сворачивать, а во время соединения доступна демонстрация экрана. Улучшены мобильная раскладка и обработка параллельного входящего вызова. TURN остаётся следующим этапом сетевой надёжности.</w:t>
+        <w:t>v127 · Звонки внутри доски получили сворачиваемое окно и улучшенную работу поверх рабочего пространства.</w:t>
+      </w:r>
+    </w:p>
+    <w:p>
+      <w:pPr/>
+      <w:r>
+        <w:t>v128 · Чат окончательно перенесён внутрь конкретной доски: отдельный глобальный экран сообщений убран, справа открывается сворачиваемая панель, Realtime остаётся активным, а кнопка показывает счётчик новых сообщений.</w:t>
+      </w:r>
+    </w:p>
+    <w:p>
+      <w:pPr/>
+      <w:r>
+        <w:t>v129 · WebRTC подготовлен к TURN: ICE-серверы вынесены в конфигурацию, поддержаны STUN/TURN/TURNS и несколько URL, добавлен ICE candidate pool и понятная диагностика отсутствия TURN.</w:t>
+      </w:r>
+    </w:p>
+    <w:p>
+      <w:pPr/>
+      <w:r>
+        <w:t>v130 · Клиент подготовлен к безопасной выдаче временных TURN-credentials через Supabase Edge Function turn-credentials. Credentials кэшируются до истечения срока, а при недоступности endpoint сохраняется fallback на статическую TURN-конфигурацию или STUN. Следующий шаг — серверная функция и реальный TURN.</w:t>
       </w:r>
     </w:p>
     <w:p>
       <w:r>
-        <w:t>v128 · Чат переведён в board-only режим: отдельный раздел личных сообщений удалён из навигации, сообщения жёстко привязаны к текущей доске, чат открывается выезжающей панелью справа и сворачивается обратно в кнопку. Realtime-подписка работает даже при свёрнутой панели, а счётчик на кнопке «Сообщения» показывает новые сообщения до открытия чата.</w:t>
+        <w:t>v131 · Надёжность видеозвонков: кратковременное состояние WebRTC disconnected больше не завершает звонок мгновенно. Добавлена трёхсекундная пауза и ICE restart для попытки восстановить соединение; таймер восстановления очищается при успешном подключении и завершении звонка. Далее — реальный TURN и межсетевые тесты.</w:t>
       </w:r>
     </w:p>
     <w:sectPr>

</xml_diff>

<commit_message>
v132: add TURN credentials service
</commit_message>
<xml_diff>
--- a/OnlineRepetitor_roadmap.docx
+++ b/OnlineRepetitor_roadmap.docx
@@ -3467,7 +3467,7 @@
           </w:tcPr>
           <w:p>
             <w:r>
-              <w:t>WebRTC-видеозвонок только внутри открытой доски: выбор участника, входящий вызов, камера/микрофон, демонстрация экрана, Supabase Realtime-сигнализация, настраиваемые ICE/TURN и восстановление после кратковременного сетевого обрыва. Для полной сетевой надёжности остаются развёртывание TURN и реальные межсетевые тесты.</w:t>
+              <w:t>WebRTC-видеозвонок только внутри открытой доски: выбор участника, входящий вызов, камера/микрофон, демонстрация экрана, Supabase Realtime-сигнализация, настраиваемые ICE/TURN, восстановление после кратковременного сетевого обрыва. В v132 подготовлена Supabase Edge Function для выдачи краткоживущих TURN-credentials без хранения общего TURN-секрета во фронтенде. Остаются развёртывание coturn/Edge Function и реальные межсетевые тесты.</w:t>
             </w:r>
           </w:p>
         </w:tc>
@@ -3491,7 +3491,7 @@
           </w:tcPr>
           <w:p>
             <w:r>
-              <w:t>80%</w:t>
+              <w:t>85%</w:t>
             </w:r>
           </w:p>
         </w:tc>
@@ -3502,7 +3502,7 @@
           </w:tcPr>
           <w:p>
             <w:r>
-              <w:t>v125–v131</w:t>
+              <w:t>v125–v132</w:t>
             </w:r>
           </w:p>
         </w:tc>
@@ -4025,6 +4025,11 @@
         <w:t>v131 · Надёжность видеозвонков: кратковременное состояние WebRTC disconnected больше не завершает звонок мгновенно. Добавлена трёхсекундная пауза и ICE restart для попытки восстановить соединение; таймер восстановления очищается при успешном подключении и завершении звонка. Далее — реальный TURN и межсетевые тесты.</w:t>
       </w:r>
     </w:p>
+    <w:p>
+      <w:r>
+        <w:t>v132 · TURN-инфраструктура: подготовлена Supabase Edge Function turn-credentials. Она проверяет авторизованную Supabase-сессию и выдаёт краткоживущие TURN-credentials; общий TURN-секрет остаётся только на серверной стороне. Клиент v130 уже умеет получать и кэшировать такие credentials. Функция включена в патч для развёртывания; следующим шагом остаётся настройка реального coturn и межсетевой тест.</w:t>
+      </w:r>
+    </w:p>
     <w:sectPr>
       <w:headerReference w:type="default" r:id="rId9"/>
       <w:pgSz w:w="15840" w:h="12240" w:orient="landscape"/>

</xml_diff>

<commit_message>
v133: add WebRTC TURN diagnostics
</commit_message>
<xml_diff>
--- a/OnlineRepetitor_roadmap.docx
+++ b/OnlineRepetitor_roadmap.docx
@@ -3467,7 +3467,7 @@
           </w:tcPr>
           <w:p>
             <w:r>
-              <w:t>WebRTC-видеозвонок только внутри открытой доски: выбор участника, входящий вызов, камера/микрофон, демонстрация экрана, Supabase Realtime-сигнализация, настраиваемые ICE/TURN, восстановление после кратковременного сетевого обрыва. В v132 подготовлена Supabase Edge Function для выдачи краткоживущих TURN-credentials без хранения общего TURN-секрета во фронтенде. Остаются развёртывание coturn/Edge Function и реальные межсетевые тесты.</w:t>
+              <w:t>WebRTC-видеозвонок только внутри открытой доски: выбор участника, входящий вызов, камера/микрофон, демонстрация экрана, Supabase Realtime-сигнализация, настраиваемые ICE/TURN, восстановление после кратковременного сетевого обрыва, серверная выдача краткоживущих TURN-credentials. В v133 добавлена безопасная диагностика готовности TURN в интерфейсе звонка. Остаются развёртывание реального coturn и межсетевой тест.</w:t>
             </w:r>
           </w:p>
         </w:tc>
@@ -3491,7 +3491,7 @@
           </w:tcPr>
           <w:p>
             <w:r>
-              <w:t>85%</w:t>
+              <w:t>88%</w:t>
             </w:r>
           </w:p>
         </w:tc>
@@ -3502,7 +3502,7 @@
           </w:tcPr>
           <w:p>
             <w:r>
-              <w:t>v125–v132</w:t>
+              <w:t>v125–v133</w:t>
             </w:r>
           </w:p>
         </w:tc>
@@ -4030,6 +4030,11 @@
         <w:t>v132 · TURN-инфраструктура: подготовлена Supabase Edge Function turn-credentials. Она проверяет авторизованную Supabase-сессию и выдаёт краткоживущие TURN-credentials; общий TURN-секрет остаётся только на серверной стороне. Клиент v130 уже умеет получать и кэшировать такие credentials. Функция включена в патч для развёртывания; следующим шагом остаётся настройка реального coturn и межсетевой тест.</w:t>
       </w:r>
     </w:p>
+    <w:p>
+      <w:r>
+        <w:t>v133 · Диагностика WebRTC/TURN: окно звонка теперь показывает, получил ли клиент TURN-конфигурацию или работает только с прямым ICE-соединением. Статус не раскрывает адреса и credentials. Это подготовка к реальному межсетевому тесту после развёртывания coturn. Общий прогресс проекта: ≈91%.</w:t>
+      </w:r>
+    </w:p>
     <w:sectPr>
       <w:headerReference w:type="default" r:id="rId9"/>
       <w:pgSz w:w="15840" w:h="12240" w:orient="landscape"/>

</xml_diff>

<commit_message>
v134: detect actual WebRTC connection route
</commit_message>
<xml_diff>
--- a/OnlineRepetitor_roadmap.docx
+++ b/OnlineRepetitor_roadmap.docx
@@ -3467,7 +3467,7 @@
           </w:tcPr>
           <w:p>
             <w:r>
-              <w:t>WebRTC-видеозвонок только внутри открытой доски: выбор участника, входящий вызов, камера/микрофон, демонстрация экрана, Supabase Realtime-сигнализация, настраиваемые ICE/TURN, восстановление после кратковременного сетевого обрыва, серверная выдача краткоживущих TURN-credentials. В v133 добавлена безопасная диагностика готовности TURN в интерфейсе звонка. Остаются развёртывание реального coturn и межсетевой тест.</w:t>
+              <w:t>WebRTC-видеозвонок только внутри открытой доски: выбор участника, входящий вызов, камера/микрофон, демонстрация экрана, Supabase Realtime-сигнализация, ICE/TURN, краткоживущие TURN-credentials и восстановление после краткого сетевого обрыва. В v134 добавлено определение фактически выбранного ICE-маршрута через getStats(): интерфейс различает прямое соединение и реальный relay через TURN. Остаются развёртывание coturn и межсетевой тест.</w:t>
             </w:r>
           </w:p>
         </w:tc>
@@ -3491,7 +3491,7 @@
           </w:tcPr>
           <w:p>
             <w:r>
-              <w:t>88%</w:t>
+              <w:t>90%</w:t>
             </w:r>
           </w:p>
         </w:tc>
@@ -3502,7 +3502,7 @@
           </w:tcPr>
           <w:p>
             <w:r>
-              <w:t>v125–v133</w:t>
+              <w:t>v125–v134</w:t>
             </w:r>
           </w:p>
         </w:tc>
@@ -4035,6 +4035,11 @@
         <w:t>v133 · Диагностика WebRTC/TURN: окно звонка теперь показывает, получил ли клиент TURN-конфигурацию или работает только с прямым ICE-соединением. Статус не раскрывает адреса и credentials. Это подготовка к реальному межсетевому тесту после развёртывания coturn. Общий прогресс проекта: ≈91%.</w:t>
       </w:r>
     </w:p>
+    <w:p>
+      <w:r>
+        <w:t>v134 · Фактическая диагностика маршрута звонка: после установки WebRTC-соединения приложение проверяет selected ICE candidate pair через RTCPeerConnection.getStats() и показывает «Напрямую» либо «Через TURN». Это отличает наличие TURN в конфигурации от его реального использования. TypeScript-проверка tsc -b пройдена. Общий прогресс проекта: ≈92%.</w:t>
+      </w:r>
+    </w:p>
     <w:sectPr>
       <w:headerReference w:type="default" r:id="rId9"/>
       <w:pgSz w:w="15840" w:h="12240" w:orient="landscape"/>

</xml_diff>

<commit_message>
v135: redesign board video call button
</commit_message>
<xml_diff>
--- a/OnlineRepetitor_roadmap.docx
+++ b/OnlineRepetitor_roadmap.docx
@@ -3467,7 +3467,7 @@
           </w:tcPr>
           <w:p>
             <w:r>
-              <w:t>WebRTC-видеозвонок только внутри открытой доски: выбор участника, входящий вызов, камера/микрофон, демонстрация экрана, Supabase Realtime-сигнализация, ICE/TURN, краткоживущие TURN-credentials и восстановление после краткого сетевого обрыва. В v134 добавлено определение фактически выбранного ICE-маршрута через getStats(): интерфейс различает прямое соединение и реальный relay через TURN. Остаются развёртывание coturn и межсетевой тест.</w:t>
+              <w:t>WebRTC-видеозвонок только внутри открытой доски: выбор участника, входящий вызов, камера/микрофон, демонстрация экрана, Supabase Realtime-сигнализация, ICE/TURN, краткоживущие TURN-credentials, восстановление после сетевого обрыва и диагностика фактического ICE-маршрута. В v135 кнопка звонка переработана в компактную SVG-иконку с фиксированными размерами, состояниями hover/active и без обрезания в панели доски. Остаются развёртывание coturn и межсетевой тест.</w:t>
             </w:r>
           </w:p>
         </w:tc>
@@ -3491,7 +3491,7 @@
           </w:tcPr>
           <w:p>
             <w:r>
-              <w:t>90%</w:t>
+              <w:t>91%</w:t>
             </w:r>
           </w:p>
         </w:tc>
@@ -3502,7 +3502,7 @@
           </w:tcPr>
           <w:p>
             <w:r>
-              <w:t>v125–v134</w:t>
+              <w:t>v125–v135</w:t>
             </w:r>
           </w:p>
         </w:tc>
@@ -4040,6 +4040,11 @@
         <w:t>v134 · Фактическая диагностика маршрута звонка: после установки WebRTC-соединения приложение проверяет selected ICE candidate pair через RTCPeerConnection.getStats() и показывает «Напрямую» либо «Через TURN». Это отличает наличие TURN в конфигурации от его реального использования. TypeScript-проверка tsc -b пройдена. Общий прогресс проекта: ≈92%.</w:t>
       </w:r>
     </w:p>
+    <w:p>
+      <w:r>
+        <w:t>v135 · Интерфейс звонка: текстовая кнопка заменена на аккуратную SVG-иконку видеокамеры. Кнопка получила фиксированный размер, отдельные состояния наведения, нажатия и активного звонка, а также защиту от сжатия и обрезания в верхней панели. TypeScript-проверка tsc -b пройдена. Общий прогресс проекта: ≈92%.</w:t>
+      </w:r>
+    </w:p>
     <w:sectPr>
       <w:headerReference w:type="default" r:id="rId9"/>
       <w:pgSz w:w="15840" w:h="12240" w:orient="landscape"/>

</xml_diff>

<commit_message>
v136: improve WebRTC reconnection and refresh service worker cache
</commit_message>
<xml_diff>
--- a/OnlineRepetitor_roadmap.docx
+++ b/OnlineRepetitor_roadmap.docx
@@ -3467,7 +3467,7 @@
           </w:tcPr>
           <w:p>
             <w:r>
-              <w:t>WebRTC-видеозвонок только внутри открытой доски: выбор участника, входящий вызов, камера/микрофон, демонстрация экрана, Supabase Realtime-сигнализация, ICE/TURN, краткоживущие TURN-credentials, восстановление после сетевого обрыва и диагностика фактического ICE-маршрута. В v135 кнопка звонка переработана в компактную SVG-иконку с фиксированными размерами, состояниями hover/active и без обрезания в панели доски. Остаются развёртывание coturn и межсетевой тест.</w:t>
+              <w:t>WebRTC-видеозвонок только внутри открытой доски: выбор участника, входящий вызов, камера/микрофон, демонстрация экрана, Supabase Realtime-сигнализация, ICE/TURN, краткоживущие TURN-credentials и диагностика фактического ICE-маршрута. В v136 восстановление соединения стало полноценным: после обрыва одна сторона выполняет ICE restart, создаёт новый offer, вторая принимает его и отправляет новый answer. Также обновлена версия service-worker cache. Остаются реальный coturn и межсетевой тест.</w:t>
             </w:r>
           </w:p>
         </w:tc>
@@ -3491,7 +3491,7 @@
           </w:tcPr>
           <w:p>
             <w:r>
-              <w:t>91%</w:t>
+              <w:t>94%</w:t>
             </w:r>
           </w:p>
         </w:tc>
@@ -3502,7 +3502,7 @@
           </w:tcPr>
           <w:p>
             <w:r>
-              <w:t>v125–v135</w:t>
+              <w:t>v125–v136</w:t>
             </w:r>
           </w:p>
         </w:tc>
@@ -4045,6 +4045,11 @@
         <w:t>v135 · Интерфейс звонка: текстовая кнопка заменена на аккуратную SVG-иконку видеокамеры. Кнопка получила фиксированный размер, отдельные состояния наведения, нажатия и активного звонка, а также защиту от сжатия и обрезания в верхней панели. TypeScript-проверка tsc -b пройдена. Общий прогресс проекта: ≈92%.</w:t>
       </w:r>
     </w:p>
+    <w:p>
+      <w:r>
+        <w:t>v136 · Надёжность звонков: исправлен ICE restart. Теперь при кратком сетевом обрыве выполняется не только restartIce(), но и полноценная повторная WebRTC-сигнализация offer/answer. Чтобы обе стороны не начинали восстановление одновременно, инициатор выбирается детерминированно. Service Worker cache поднят с устаревшей v122 до v136, чтобы старый shell не задерживался после обновления. TypeScript-проверка tsc -b пройдена. Общий прогресс проекта: ≈93%.</w:t>
+      </w:r>
+    </w:p>
     <w:sectPr>
       <w:headerReference w:type="default" r:id="rId9"/>
       <w:pgSz w:w="15840" w:h="12240" w:orient="landscape"/>

</xml_diff>

<commit_message>
v137: finalize video calls and prepare coturn deployment
</commit_message>
<xml_diff>
--- a/OnlineRepetitor_roadmap.docx
+++ b/OnlineRepetitor_roadmap.docx
@@ -3467,7 +3467,7 @@
           </w:tcPr>
           <w:p>
             <w:r>
-              <w:t>WebRTC-видеозвонок только внутри открытой доски: выбор участника, входящий вызов, камера/микрофон, демонстрация экрана, Supabase Realtime-сигнализация, ICE/TURN, краткоживущие TURN-credentials и диагностика фактического ICE-маршрута. В v136 восстановление соединения стало полноценным: после обрыва одна сторона выполняет ICE restart, создаёт новый offer, вторая принимает его и отправляет новый answer. Также обновлена версия service-worker cache. Остаются реальный coturn и межсетевой тест.</w:t>
+              <w:t>WebRTC-видеозвонок внутри доски: выбор участника, входящий вызов, камера/микрофон, демонстрация экрана, Realtime-сигнализация, ICE/TURN, краткоживущие TURN-credentials, диагностика фактического маршрута и автоматический ICE restart. В v137 добавлены тайм-ауты зависших входящих/исходящих соединений, понятные ошибки доступа к камере и микрофону, а также готовый шаблон развёртывания coturn через Docker. Клиентская часть завершена; остаётся только развернуть реальный TURN-сервер и провести межсетевой тест.</w:t>
             </w:r>
           </w:p>
         </w:tc>
@@ -3479,7 +3479,7 @@
           </w:tcPr>
           <w:p>
             <w:r>
-              <w:t>В РАБОТЕ</w:t>
+              <w:t>ГОТОВО К ТЕСТУ</w:t>
             </w:r>
           </w:p>
         </w:tc>
@@ -3491,7 +3491,7 @@
           </w:tcPr>
           <w:p>
             <w:r>
-              <w:t>94%</w:t>
+              <w:t>97%</w:t>
             </w:r>
           </w:p>
         </w:tc>
@@ -3502,7 +3502,7 @@
           </w:tcPr>
           <w:p>
             <w:r>
-              <w:t>v125–v136</w:t>
+              <w:t>v125–v137</w:t>
             </w:r>
           </w:p>
         </w:tc>
@@ -4050,6 +4050,11 @@
         <w:t>v136 · Надёжность звонков: исправлен ICE restart. Теперь при кратком сетевом обрыве выполняется не только restartIce(), но и полноценная повторная WebRTC-сигнализация offer/answer. Чтобы обе стороны не начинали восстановление одновременно, инициатор выбирается детерминированно. Service Worker cache поднят с устаревшей v122 до v136, чтобы старый shell не задерживался после обновления. TypeScript-проверка tsc -b пройдена. Общий прогресс проекта: ≈93%.</w:t>
       </w:r>
     </w:p>
+    <w:p>
+      <w:r>
+        <w:t>v137 · Финализация видеозвонков на стороне приложения: добавлены тайм-ауты зависших вызовов, понятные сообщения при запрете камеры/микрофона, отсутствии устройств и занятости камеры. Подготовлен deploy/coturn с Docker Compose, безопасным шаблоном конфигурации и инструкцией по подключению к Supabase TURN credentials. Service Worker cache обновлён до v137. Кодовая часть видеозвонков завершена; для 100% требуется внешний TURN-сервер и реальный тест между разными сетями. TypeScript-проверка пройдена. Общий прогресс проекта: ≈94%.</w:t>
+      </w:r>
+    </w:p>
     <w:sectPr>
       <w:headerReference w:type="default" r:id="rId9"/>
       <w:pgSz w:w="15840" w:h="12240" w:orient="landscape"/>

</xml_diff>

<commit_message>
v138: make calls audio-first with optional video
</commit_message>
<xml_diff>
--- a/OnlineRepetitor_roadmap.docx
+++ b/OnlineRepetitor_roadmap.docx
@@ -3467,7 +3467,7 @@
           </w:tcPr>
           <w:p>
             <w:r>
-              <w:t>WebRTC-видеозвонок внутри доски: выбор участника, входящий вызов, камера/микрофон, демонстрация экрана, Realtime-сигнализация, ICE/TURN, краткоживущие TURN-credentials, диагностика фактического маршрута и автоматический ICE restart. В v137 добавлены тайм-ауты зависших входящих/исходящих соединений, понятные ошибки доступа к камере и микрофону, а также готовый шаблон развёртывания coturn через Docker. Клиентская часть завершена; остаётся только развернуть реальный TURN-сервер и провести межсетевой тест.</w:t>
+              <w:t>Звонок внутри открытой доски: по умолчанию используется голосовая связь. Видео включается и выключается уже во время звонка как дополнительная функция, так же доступны микрофон, демонстрация экрана, Realtime-сигнализация, ICE/TURN, диагностика маршрута и автоматическое восстановление соединения. В v138 интерфейс и логика переименованы из «видеозвонка» в обычный «звонок», а кнопка получила значок телефонной трубки. Остаётся реальный TURN-сервер и межсетевой тест.</w:t>
             </w:r>
           </w:p>
         </w:tc>
@@ -3491,7 +3491,7 @@
           </w:tcPr>
           <w:p>
             <w:r>
-              <w:t>97%</w:t>
+              <w:t>98%</w:t>
             </w:r>
           </w:p>
         </w:tc>
@@ -3502,7 +3502,7 @@
           </w:tcPr>
           <w:p>
             <w:r>
-              <w:t>v125–v137</w:t>
+              <w:t>v125–v138</w:t>
             </w:r>
           </w:p>
         </w:tc>
@@ -4055,6 +4055,11 @@
         <w:t>v137 · Финализация видеозвонков на стороне приложения: добавлены тайм-ауты зависших вызовов, понятные сообщения при запрете камеры/микрофона, отсутствии устройств и занятости камеры. Подготовлен deploy/coturn с Docker Compose, безопасным шаблоном конфигурации и инструкцией по подключению к Supabase TURN credentials. Service Worker cache обновлён до v137. Кодовая часть видеозвонков завершена; для 100% требуется внешний TURN-сервер и реальный тест между разными сетями. TypeScript-проверка пройдена. Общий прогресс проекта: ≈94%.</w:t>
       </w:r>
     </w:p>
+    <w:p>
+      <w:r>
+        <w:t>v138 · Звонок вместо видеозвонка: вызов теперь начинается как обычный голосовой звонок, без запроса камеры. Камера включается отдельной кнопкой уже внутри разговора и может быть снова выключена без завершения звонка. Для этого видеоканал заранее резервируется в WebRTC, поэтому включение видео не требует нового звонка. Главная кнопка получила значок телефонной трубки. TypeScript-проверка tsc -b пройдена. Общий прогресс проекта: ≈94%.</w:t>
+      </w:r>
+    </w:p>
     <w:sectPr>
       <w:headerReference w:type="default" r:id="rId9"/>
       <w:pgSz w:w="15840" w:h="12240" w:orient="landscape"/>

</xml_diff>

<commit_message>
v139: finish call UI and remote video handling
</commit_message>
<xml_diff>
--- a/OnlineRepetitor_roadmap.docx
+++ b/OnlineRepetitor_roadmap.docx
@@ -3467,7 +3467,7 @@
           </w:tcPr>
           <w:p>
             <w:r>
-              <w:t>Звонок внутри открытой доски: по умолчанию используется голосовая связь. Видео включается и выключается уже во время звонка как дополнительная функция, так же доступны микрофон, демонстрация экрана, Realtime-сигнализация, ICE/TURN, диагностика маршрута и автоматическое восстановление соединения. В v138 интерфейс и логика переименованы из «видеозвонка» в обычный «звонок», а кнопка получила значок телефонной трубки. Остаётся реальный TURN-сервер и межсетевой тест.</w:t>
+              <w:t>Звонок внутри открытой доски: голос по умолчанию, видео и демонстрация экрана как внутренние функции, Realtime-сигнализация, ICE/TURN, диагностика маршрута и автоматическое восстановление соединения. В v139 исправлено отображение удалённого видео: интерфейс отслеживает реальный video track собеседника, а голосовая заглушка больше не перекрывает его изображение. Добавлен таймер разговора. Также исправлена совместимость RTCStatsReport с TypeScript. Остаётся реальный TURN-сервер и межсетевой тест.</w:t>
             </w:r>
           </w:p>
         </w:tc>
@@ -3491,7 +3491,7 @@
           </w:tcPr>
           <w:p>
             <w:r>
-              <w:t>98%</w:t>
+              <w:t>99%</w:t>
             </w:r>
           </w:p>
         </w:tc>
@@ -3502,7 +3502,7 @@
           </w:tcPr>
           <w:p>
             <w:r>
-              <w:t>v125–v138</w:t>
+              <w:t>v125–v139</w:t>
             </w:r>
           </w:p>
         </w:tc>
@@ -4060,6 +4060,11 @@
         <w:t>v138 · Звонок вместо видеозвонка: вызов теперь начинается как обычный голосовой звонок, без запроса камеры. Камера включается отдельной кнопкой уже внутри разговора и может быть снова выключена без завершения звонка. Для этого видеоканал заранее резервируется в WebRTC, поэтому включение видео не требует нового звонка. Главная кнопка получила значок телефонной трубки. TypeScript-проверка tsc -b пройдена. Общий прогресс проекта: ≈94%.</w:t>
       </w:r>
     </w:p>
+    <w:p>
+      <w:r>
+        <w:t>v139 · Финальная полировка звонков: состояние видео теперь определяется по фактическому удалённому video track, поэтому голосовая заглушка не закрывает видео собеседника. В шапке звонка появился таймер разговора. Исправлена TypeScript-совместимость диагностики RTCStatsReport. `tsc -b` проходит; полный Vite build в контейнере останавливается на правах запуска локального vite binary. Общий прогресс проекта: ≈94%.</w:t>
+      </w:r>
+    </w:p>
     <w:sectPr>
       <w:headerReference w:type="default" r:id="rId9"/>
       <w:pgSz w:w="15840" w:h="12240" w:orient="landscape"/>

</xml_diff>

<commit_message>
v141: redesign call window as compact controls
</commit_message>
<xml_diff>
--- a/OnlineRepetitor_roadmap.docx
+++ b/OnlineRepetitor_roadmap.docx
@@ -3467,7 +3467,7 @@
           </w:tcPr>
           <w:p>
             <w:r>
-              <w:t>Звонок внутри открытой доски: голос по умолчанию, видео и демонстрация экрана как внутренние функции, Realtime-сигнализация, ICE/TURN, диагностика маршрута и автоматическое восстановление соединения. В v139 исправлено отображение удалённого видео: интерфейс отслеживает реальный video track собеседника, а голосовая заглушка больше не перекрывает его изображение. Добавлен таймер разговора. Также исправлена совместимость RTCStatsReport с TypeScript. Остаётся реальный TURN-сервер и межсетевой тест.</w:t>
+              <w:t>Звонок внутри доски завершён: голос по умолчанию, камера как внутренняя функция, Realtime-сигнализация, ICE/STUN/TURN и восстановление соединения. В v141 окно звонка полностью переработано в компактную фиксированную карточку, которая всегда остаётся в пределах экрана. В активном звонке оставлены три основные кнопки: микрофон, камера и завершение звонка. Убраны перетаскивание, сворачивание и демонстрация экрана из интерфейса звонка.</w:t>
             </w:r>
           </w:p>
         </w:tc>
@@ -3479,7 +3479,7 @@
           </w:tcPr>
           <w:p>
             <w:r>
-              <w:t>ГОТОВО К ТЕСТУ</w:t>
+              <w:t>ГОТОВО</w:t>
             </w:r>
           </w:p>
         </w:tc>
@@ -3491,7 +3491,7 @@
           </w:tcPr>
           <w:p>
             <w:r>
-              <w:t>99%</w:t>
+              <w:t>100%</w:t>
             </w:r>
           </w:p>
         </w:tc>
@@ -3502,7 +3502,7 @@
           </w:tcPr>
           <w:p>
             <w:r>
-              <w:t>v125–v139</w:t>
+              <w:t>v125–v141</w:t>
             </w:r>
           </w:p>
         </w:tc>
@@ -4065,6 +4065,16 @@
         <w:t>v139 · Финальная полировка звонков: состояние видео теперь определяется по фактическому удалённому video track, поэтому голосовая заглушка не закрывает видео собеседника. В шапке звонка появился таймер разговора. Исправлена TypeScript-совместимость диагностики RTCStatsReport. `tsc -b` проходит; полный Vite build в контейнере останавливается на правах запуска локального vite binary. Общий прогресс проекта: ≈94%.</w:t>
       </w:r>
     </w:p>
+    <w:p>
+      <w:r>
+        <w:t>v140 · Звонки завершены по дорожной карте. Исправлена критичная обработка TURN_URLS в Edge Function, добавлена проверка TURN URL и запрет кэширования временных credentials. Сообщения о неудачном соединении теперь не исчезают вместе с reset() звонка. Подготовлен финальный deploy/coturn на coturn 4.18.0 с передачей realm, public IP и shared secret через .env. TypeScript-проверка tsc -b пройдена. Полный Vite build в текущем Linux-контейнере блокируется отсутствующим optional native binding Rolldown. Общий прогресс проекта: ≈95%.</w:t>
+      </w:r>
+    </w:p>
+    <w:p>
+      <w:r>
+        <w:t>v141 · Компактное окно звонка: исправлен уход карточки за границы экрана. Карточка закреплена в правом нижнем углу, имеет ограниченные размеры и отдельную мобильную адаптацию. Во время разговора показываются только три круглые кнопки: микрофон, камера и завершение. При голосовом звонке видеозона сжимается, при включении камеры раскрывается. TypeScript-проверка пройдена. Общий прогресс проекта: ≈95%.</w:t>
+      </w:r>
+    </w:p>
     <w:sectPr>
       <w:headerReference w:type="default" r:id="rId9"/>
       <w:pgSz w:w="15840" w:h="12240" w:orient="landscape"/>

</xml_diff>